<commit_message>
add order to navigation bar
</commit_message>
<xml_diff>
--- a/docs/foodhub_Interview_Notes.docx
+++ b/docs/foodhub_Interview_Notes.docx
@@ -2615,6 +2615,1542 @@
         <w:t>, a Full Stack Food Ordering System using the MERN stack. The purpose of the project is to learn React, Node.js, Express.js, and MongoDB by implementing a real-world application. Currently, I have completed the React project setup using Vite and understood the project structure, package management, and React fundamentals. The project will gradually include authentication, food management, cart, orders, and an admin dashboard.</w:t>
       </w:r>
     </w:p>
+    <w:p>
+      <w:r>
+        <w:pict w14:anchorId="2F2F81BC">
+          <v:rect id="_x0000_i1289" style="width:0;height:1.5pt" o:hralign="center" o:hrstd="t" o:hr="t" fillcolor="#a0a0a0" stroked="f"/>
+        </w:pict>
+      </w:r>
+    </w:p>
+    <w:p/>
+    <w:p/>
+    <w:p>
+      <w:pPr>
+        <w:rPr>
+          <w:b/>
+          <w:bCs/>
+        </w:rPr>
+      </w:pPr>
+      <w:r>
+        <w:rPr>
+          <w:b/>
+          <w:bCs/>
+        </w:rPr>
+        <w:lastRenderedPageBreak/>
+        <w:t>26. What is the React Component Tree?</w:t>
+      </w:r>
+    </w:p>
+    <w:p>
+      <w:pPr>
+        <w:rPr>
+          <w:b/>
+          <w:bCs/>
+        </w:rPr>
+      </w:pPr>
+      <w:r>
+        <w:rPr>
+          <w:b/>
+          <w:bCs/>
+        </w:rPr>
+        <w:t>Answer</w:t>
+      </w:r>
+    </w:p>
+    <w:p>
+      <w:r>
+        <w:t>A React Component Tree represents the hierarchical relationship between components. The root component (App) renders child components, which can further render their own child components.</w:t>
+      </w:r>
+    </w:p>
+    <w:p>
+      <w:r>
+        <w:t>Example:</w:t>
+      </w:r>
+    </w:p>
+    <w:p>
+      <w:r>
+        <w:t>App</w:t>
+      </w:r>
+      <w:r>
+        <w:br/>
+        <w:t>│</w:t>
+      </w:r>
+      <w:r>
+        <w:br/>
+      </w:r>
+      <w:r>
+        <w:rPr>
+          <w:rFonts w:ascii="MS Gothic" w:eastAsia="MS Gothic" w:hAnsi="MS Gothic" w:cs="MS Gothic" w:hint="eastAsia"/>
+        </w:rPr>
+        <w:t>├</w:t>
+      </w:r>
+      <w:r>
+        <w:rPr>
+          <w:rFonts w:ascii="Calibri" w:hAnsi="Calibri" w:cs="Calibri"/>
+        </w:rPr>
+        <w:t>──</w:t>
+      </w:r>
+      <w:r>
+        <w:t xml:space="preserve"> Navbar</w:t>
+      </w:r>
+      <w:r>
+        <w:br/>
+      </w:r>
+      <w:r>
+        <w:rPr>
+          <w:rFonts w:ascii="Calibri" w:hAnsi="Calibri" w:cs="Calibri"/>
+        </w:rPr>
+        <w:t>└──</w:t>
+      </w:r>
+      <w:r>
+        <w:t xml:space="preserve"> Home</w:t>
+      </w:r>
+    </w:p>
+    <w:p>
+      <w:r>
+        <w:t>Later:</w:t>
+      </w:r>
+    </w:p>
+    <w:p>
+      <w:r>
+        <w:t>App</w:t>
+      </w:r>
+      <w:r>
+        <w:br/>
+        <w:t>│</w:t>
+      </w:r>
+      <w:r>
+        <w:br/>
+      </w:r>
+      <w:r>
+        <w:rPr>
+          <w:rFonts w:ascii="MS Gothic" w:eastAsia="MS Gothic" w:hAnsi="MS Gothic" w:cs="MS Gothic" w:hint="eastAsia"/>
+        </w:rPr>
+        <w:t>├</w:t>
+      </w:r>
+      <w:r>
+        <w:rPr>
+          <w:rFonts w:ascii="Calibri" w:hAnsi="Calibri" w:cs="Calibri"/>
+        </w:rPr>
+        <w:t>──</w:t>
+      </w:r>
+      <w:r>
+        <w:t xml:space="preserve"> Navbar</w:t>
+      </w:r>
+      <w:r>
+        <w:br/>
+      </w:r>
+      <w:r>
+        <w:rPr>
+          <w:rFonts w:ascii="MS Gothic" w:eastAsia="MS Gothic" w:hAnsi="MS Gothic" w:cs="MS Gothic" w:hint="eastAsia"/>
+        </w:rPr>
+        <w:t>├</w:t>
+      </w:r>
+      <w:r>
+        <w:rPr>
+          <w:rFonts w:ascii="Calibri" w:hAnsi="Calibri" w:cs="Calibri"/>
+        </w:rPr>
+        <w:t>──</w:t>
+      </w:r>
+      <w:r>
+        <w:t xml:space="preserve"> Home</w:t>
+      </w:r>
+      <w:r>
+        <w:br/>
+      </w:r>
+      <w:r>
+        <w:rPr>
+          <w:rFonts w:ascii="Calibri" w:hAnsi="Calibri" w:cs="Calibri"/>
+        </w:rPr>
+        <w:t>│</w:t>
+      </w:r>
+      <w:r>
+        <w:t xml:space="preserve">     </w:t>
+      </w:r>
+      <w:r>
+        <w:rPr>
+          <w:rFonts w:ascii="MS Gothic" w:eastAsia="MS Gothic" w:hAnsi="MS Gothic" w:cs="MS Gothic" w:hint="eastAsia"/>
+        </w:rPr>
+        <w:t>├</w:t>
+      </w:r>
+      <w:r>
+        <w:rPr>
+          <w:rFonts w:ascii="Calibri" w:hAnsi="Calibri" w:cs="Calibri"/>
+        </w:rPr>
+        <w:t>──</w:t>
+      </w:r>
+      <w:r>
+        <w:t xml:space="preserve"> Hero</w:t>
+      </w:r>
+      <w:r>
+        <w:br/>
+      </w:r>
+      <w:r>
+        <w:rPr>
+          <w:rFonts w:ascii="Calibri" w:hAnsi="Calibri" w:cs="Calibri"/>
+        </w:rPr>
+        <w:t>│</w:t>
+      </w:r>
+      <w:r>
+        <w:t xml:space="preserve">     </w:t>
+      </w:r>
+      <w:r>
+        <w:rPr>
+          <w:rFonts w:ascii="MS Gothic" w:eastAsia="MS Gothic" w:hAnsi="MS Gothic" w:cs="MS Gothic" w:hint="eastAsia"/>
+        </w:rPr>
+        <w:t>├</w:t>
+      </w:r>
+      <w:r>
+        <w:rPr>
+          <w:rFonts w:ascii="Calibri" w:hAnsi="Calibri" w:cs="Calibri"/>
+        </w:rPr>
+        <w:t>──</w:t>
+      </w:r>
+      <w:r>
+        <w:t xml:space="preserve"> Categories</w:t>
+      </w:r>
+      <w:r>
+        <w:br/>
+      </w:r>
+      <w:r>
+        <w:rPr>
+          <w:rFonts w:ascii="Calibri" w:hAnsi="Calibri" w:cs="Calibri"/>
+        </w:rPr>
+        <w:t>│</w:t>
+      </w:r>
+      <w:r>
+        <w:t xml:space="preserve">     </w:t>
+      </w:r>
+      <w:r>
+        <w:rPr>
+          <w:rFonts w:ascii="Calibri" w:hAnsi="Calibri" w:cs="Calibri"/>
+        </w:rPr>
+        <w:t>└──</w:t>
+      </w:r>
+      <w:r>
+        <w:t xml:space="preserve"> </w:t>
+      </w:r>
+      <w:proofErr w:type="spellStart"/>
+      <w:r>
+        <w:t>FoodCard</w:t>
+      </w:r>
+      <w:proofErr w:type="spellEnd"/>
+      <w:r>
+        <w:br/>
+      </w:r>
+      <w:r>
+        <w:rPr>
+          <w:rFonts w:ascii="Calibri" w:hAnsi="Calibri" w:cs="Calibri"/>
+        </w:rPr>
+        <w:t>└──</w:t>
+      </w:r>
+      <w:r>
+        <w:t xml:space="preserve"> Footer</w:t>
+      </w:r>
+    </w:p>
+    <w:p>
+      <w:r>
+        <w:pict w14:anchorId="651673A0">
+          <v:rect id="_x0000_i1273" style="width:0;height:1.5pt" o:hralign="center" o:hrstd="t" o:hr="t" fillcolor="#a0a0a0" stroked="f"/>
+        </w:pict>
+      </w:r>
+    </w:p>
+    <w:p>
+      <w:pPr>
+        <w:rPr>
+          <w:b/>
+          <w:bCs/>
+        </w:rPr>
+      </w:pPr>
+      <w:r>
+        <w:rPr>
+          <w:b/>
+          <w:bCs/>
+        </w:rPr>
+        <w:t xml:space="preserve">27. Why is </w:t>
+      </w:r>
+      <w:proofErr w:type="spellStart"/>
+      <w:r>
+        <w:rPr>
+          <w:b/>
+          <w:bCs/>
+        </w:rPr>
+        <w:t>App.jsx</w:t>
+      </w:r>
+      <w:proofErr w:type="spellEnd"/>
+      <w:r>
+        <w:rPr>
+          <w:b/>
+          <w:bCs/>
+        </w:rPr>
+        <w:t xml:space="preserve"> called the Root Component?</w:t>
+      </w:r>
+    </w:p>
+    <w:p>
+      <w:pPr>
+        <w:rPr>
+          <w:b/>
+          <w:bCs/>
+        </w:rPr>
+      </w:pPr>
+      <w:r>
+        <w:rPr>
+          <w:b/>
+          <w:bCs/>
+        </w:rPr>
+        <w:t>Answer</w:t>
+      </w:r>
+    </w:p>
+    <w:p>
+      <w:proofErr w:type="spellStart"/>
+      <w:r>
+        <w:t>App.jsx</w:t>
+      </w:r>
+      <w:proofErr w:type="spellEnd"/>
+      <w:r>
+        <w:t xml:space="preserve"> is called the Root Component because it is the first component rendered by </w:t>
+      </w:r>
+      <w:proofErr w:type="spellStart"/>
+      <w:r>
+        <w:t>main.jsx</w:t>
+      </w:r>
+      <w:proofErr w:type="spellEnd"/>
+      <w:r>
+        <w:t>. Every other component in the application is directly or indirectly rendered inside App.</w:t>
+      </w:r>
+    </w:p>
+    <w:p>
+      <w:r>
+        <w:pict w14:anchorId="295EAE86">
+          <v:rect id="_x0000_i1274" style="width:0;height:1.5pt" o:hralign="center" o:hrstd="t" o:hr="t" fillcolor="#a0a0a0" stroked="f"/>
+        </w:pict>
+      </w:r>
+    </w:p>
+    <w:p>
+      <w:pPr>
+        <w:rPr>
+          <w:b/>
+          <w:bCs/>
+        </w:rPr>
+      </w:pPr>
+      <w:r>
+        <w:rPr>
+          <w:b/>
+          <w:bCs/>
+        </w:rPr>
+        <w:t>28. How does React render a page?</w:t>
+      </w:r>
+    </w:p>
+    <w:p>
+      <w:pPr>
+        <w:rPr>
+          <w:b/>
+          <w:bCs/>
+        </w:rPr>
+      </w:pPr>
+      <w:r>
+        <w:rPr>
+          <w:b/>
+          <w:bCs/>
+        </w:rPr>
+        <w:t>Answer</w:t>
+      </w:r>
+    </w:p>
+    <w:p>
+      <w:r>
+        <w:t>Rendering Flow:</w:t>
+      </w:r>
+    </w:p>
+    <w:p>
+      <w:r>
+        <w:t>Browser</w:t>
+      </w:r>
+      <w:r>
+        <w:br/>
+        <w:t xml:space="preserve">      ↓</w:t>
+      </w:r>
+      <w:r>
+        <w:br/>
+      </w:r>
+      <w:r>
+        <w:lastRenderedPageBreak/>
+        <w:t>index.html</w:t>
+      </w:r>
+      <w:r>
+        <w:br/>
+        <w:t xml:space="preserve">      ↓</w:t>
+      </w:r>
+      <w:r>
+        <w:br/>
+      </w:r>
+      <w:proofErr w:type="spellStart"/>
+      <w:r>
+        <w:t>main.jsx</w:t>
+      </w:r>
+      <w:proofErr w:type="spellEnd"/>
+      <w:r>
+        <w:br/>
+        <w:t xml:space="preserve">      ↓</w:t>
+      </w:r>
+      <w:r>
+        <w:br/>
+        <w:t>&lt;App /&gt;</w:t>
+      </w:r>
+      <w:r>
+        <w:br/>
+        <w:t xml:space="preserve">      ↓</w:t>
+      </w:r>
+      <w:r>
+        <w:br/>
+        <w:t>Navbar</w:t>
+      </w:r>
+      <w:r>
+        <w:br/>
+        <w:t xml:space="preserve">      ↓</w:t>
+      </w:r>
+      <w:r>
+        <w:br/>
+        <w:t>Home</w:t>
+      </w:r>
+      <w:r>
+        <w:br/>
+        <w:t xml:space="preserve">      ↓</w:t>
+      </w:r>
+      <w:r>
+        <w:br/>
+        <w:t>Browser</w:t>
+      </w:r>
+    </w:p>
+    <w:p>
+      <w:r>
+        <w:pict w14:anchorId="305A05A6">
+          <v:rect id="_x0000_i1275" style="width:0;height:1.5pt" o:hralign="center" o:hrstd="t" o:hr="t" fillcolor="#a0a0a0" stroked="f"/>
+        </w:pict>
+      </w:r>
+    </w:p>
+    <w:p>
+      <w:pPr>
+        <w:rPr>
+          <w:b/>
+          <w:bCs/>
+        </w:rPr>
+      </w:pPr>
+      <w:r>
+        <w:rPr>
+          <w:b/>
+          <w:bCs/>
+        </w:rPr>
+        <w:t>29. Why do we create separate components?</w:t>
+      </w:r>
+    </w:p>
+    <w:p>
+      <w:pPr>
+        <w:rPr>
+          <w:b/>
+          <w:bCs/>
+        </w:rPr>
+      </w:pPr>
+      <w:r>
+        <w:rPr>
+          <w:b/>
+          <w:bCs/>
+        </w:rPr>
+        <w:t>Answer</w:t>
+      </w:r>
+    </w:p>
+    <w:p>
+      <w:r>
+        <w:t>Instead of writing all UI inside one file, React divides the UI into reusable components.</w:t>
+      </w:r>
+    </w:p>
+    <w:p>
+      <w:r>
+        <w:t>Benefits:</w:t>
+      </w:r>
+    </w:p>
+    <w:p>
+      <w:pPr>
+        <w:numPr>
+          <w:ilvl w:val="0"/>
+          <w:numId w:val="8"/>
+        </w:numPr>
+      </w:pPr>
+      <w:r>
+        <w:t xml:space="preserve">Reusability </w:t>
+      </w:r>
+    </w:p>
+    <w:p>
+      <w:pPr>
+        <w:numPr>
+          <w:ilvl w:val="0"/>
+          <w:numId w:val="8"/>
+        </w:numPr>
+      </w:pPr>
+      <w:r>
+        <w:t xml:space="preserve">Better readability </w:t>
+      </w:r>
+    </w:p>
+    <w:p>
+      <w:pPr>
+        <w:numPr>
+          <w:ilvl w:val="0"/>
+          <w:numId w:val="8"/>
+        </w:numPr>
+      </w:pPr>
+      <w:r>
+        <w:t xml:space="preserve">Easy maintenance </w:t>
+      </w:r>
+    </w:p>
+    <w:p>
+      <w:pPr>
+        <w:numPr>
+          <w:ilvl w:val="0"/>
+          <w:numId w:val="8"/>
+        </w:numPr>
+      </w:pPr>
+      <w:r>
+        <w:t xml:space="preserve">Easier debugging </w:t>
+      </w:r>
+    </w:p>
+    <w:p>
+      <w:pPr>
+        <w:numPr>
+          <w:ilvl w:val="0"/>
+          <w:numId w:val="8"/>
+        </w:numPr>
+      </w:pPr>
+      <w:r>
+        <w:t xml:space="preserve">Separation of concerns </w:t>
+      </w:r>
+    </w:p>
+    <w:p>
+      <w:r>
+        <w:t>Example:</w:t>
+      </w:r>
+    </w:p>
+    <w:p>
+      <w:r>
+        <w:t>Instead of</w:t>
+      </w:r>
+    </w:p>
+    <w:p>
+      <w:proofErr w:type="spellStart"/>
+      <w:r>
+        <w:t>App.jsx</w:t>
+      </w:r>
+      <w:proofErr w:type="spellEnd"/>
+      <w:r>
+        <w:t xml:space="preserve"> (1000 lines)</w:t>
+      </w:r>
+    </w:p>
+    <w:p>
+      <w:r>
+        <w:t>we create</w:t>
+      </w:r>
+    </w:p>
+    <w:p>
+      <w:r>
+        <w:t>Navbar</w:t>
+      </w:r>
+      <w:r>
+        <w:br/>
+        <w:t>Home</w:t>
+      </w:r>
+      <w:r>
+        <w:br/>
+      </w:r>
+      <w:proofErr w:type="spellStart"/>
+      <w:r>
+        <w:t>FoodCard</w:t>
+      </w:r>
+      <w:proofErr w:type="spellEnd"/>
+      <w:r>
+        <w:br/>
+        <w:t>Footer</w:t>
+      </w:r>
+    </w:p>
+    <w:p>
+      <w:r>
+        <w:pict w14:anchorId="08978946">
+          <v:rect id="_x0000_i1276" style="width:0;height:1.5pt" o:hralign="center" o:hrstd="t" o:hr="t" fillcolor="#a0a0a0" stroked="f"/>
+        </w:pict>
+      </w:r>
+    </w:p>
+    <w:p>
+      <w:pPr>
+        <w:rPr>
+          <w:b/>
+          <w:bCs/>
+        </w:rPr>
+      </w:pPr>
+      <w:r>
+        <w:rPr>
+          <w:b/>
+          <w:bCs/>
+        </w:rPr>
+        <w:lastRenderedPageBreak/>
+        <w:t>30. Why is Navbar inside the Components folder?</w:t>
+      </w:r>
+    </w:p>
+    <w:p>
+      <w:pPr>
+        <w:rPr>
+          <w:b/>
+          <w:bCs/>
+        </w:rPr>
+      </w:pPr>
+      <w:r>
+        <w:rPr>
+          <w:b/>
+          <w:bCs/>
+        </w:rPr>
+        <w:t>Answer</w:t>
+      </w:r>
+    </w:p>
+    <w:p>
+      <w:r>
+        <w:t>Navbar is a reusable UI element that appears on multiple pages. Therefore, it belongs inside the components folder instead of pages.</w:t>
+      </w:r>
+    </w:p>
+    <w:p>
+      <w:r>
+        <w:pict w14:anchorId="3879FF59">
+          <v:rect id="_x0000_i1277" style="width:0;height:1.5pt" o:hralign="center" o:hrstd="t" o:hr="t" fillcolor="#a0a0a0" stroked="f"/>
+        </w:pict>
+      </w:r>
+    </w:p>
+    <w:p>
+      <w:pPr>
+        <w:rPr>
+          <w:b/>
+          <w:bCs/>
+        </w:rPr>
+      </w:pPr>
+      <w:r>
+        <w:rPr>
+          <w:b/>
+          <w:bCs/>
+        </w:rPr>
+        <w:t>31. Why is Home inside the Pages folder?</w:t>
+      </w:r>
+    </w:p>
+    <w:p>
+      <w:pPr>
+        <w:rPr>
+          <w:b/>
+          <w:bCs/>
+        </w:rPr>
+      </w:pPr>
+      <w:r>
+        <w:rPr>
+          <w:b/>
+          <w:bCs/>
+        </w:rPr>
+        <w:t>Answer</w:t>
+      </w:r>
+    </w:p>
+    <w:p>
+      <w:r>
+        <w:t>A page represents a complete screen of the application. Home is a complete page, whereas Navbar is only one part of a page.</w:t>
+      </w:r>
+    </w:p>
+    <w:p>
+      <w:r>
+        <w:pict w14:anchorId="3B45C6A9">
+          <v:rect id="_x0000_i1278" style="width:0;height:1.5pt" o:hralign="center" o:hrstd="t" o:hr="t" fillcolor="#a0a0a0" stroked="f"/>
+        </w:pict>
+      </w:r>
+    </w:p>
+    <w:p>
+      <w:pPr>
+        <w:rPr>
+          <w:b/>
+          <w:bCs/>
+        </w:rPr>
+      </w:pPr>
+      <w:r>
+        <w:rPr>
+          <w:b/>
+          <w:bCs/>
+        </w:rPr>
+        <w:t>32. What is React Fragment (&lt;&gt;...&lt;/&gt;)?</w:t>
+      </w:r>
+    </w:p>
+    <w:p>
+      <w:pPr>
+        <w:rPr>
+          <w:b/>
+          <w:bCs/>
+        </w:rPr>
+      </w:pPr>
+      <w:r>
+        <w:rPr>
+          <w:b/>
+          <w:bCs/>
+        </w:rPr>
+        <w:t>Answer</w:t>
+      </w:r>
+    </w:p>
+    <w:p>
+      <w:r>
+        <w:t>React Fragment allows multiple JSX elements to be grouped together without adding an extra HTML element to the DOM.</w:t>
+      </w:r>
+    </w:p>
+    <w:p>
+      <w:r>
+        <w:t>Example:</w:t>
+      </w:r>
+    </w:p>
+    <w:p>
+      <w:r>
+        <w:t>&lt;&gt;</w:t>
+      </w:r>
+      <w:r>
+        <w:br/>
+        <w:t xml:space="preserve">   &lt;Navbar /&gt;</w:t>
+      </w:r>
+      <w:r>
+        <w:br/>
+        <w:t xml:space="preserve">   &lt;Home /&gt;</w:t>
+      </w:r>
+      <w:r>
+        <w:br/>
+        <w:t>&lt;/&gt;</w:t>
+      </w:r>
+    </w:p>
+    <w:p>
+      <w:r>
+        <w:t>Instead of</w:t>
+      </w:r>
+    </w:p>
+    <w:p>
+      <w:r>
+        <w:t>&lt;div&gt;</w:t>
+      </w:r>
+      <w:r>
+        <w:br/>
+        <w:t xml:space="preserve">   &lt;Navbar /&gt;</w:t>
+      </w:r>
+      <w:r>
+        <w:br/>
+        <w:t xml:space="preserve">   &lt;Home /&gt;</w:t>
+      </w:r>
+      <w:r>
+        <w:br/>
+        <w:t>&lt;/div&gt;</w:t>
+      </w:r>
+    </w:p>
+    <w:p>
+      <w:r>
+        <w:pict w14:anchorId="7EE30640">
+          <v:rect id="_x0000_i1279" style="width:0;height:1.5pt" o:hralign="center" o:hrstd="t" o:hr="t" fillcolor="#a0a0a0" stroked="f"/>
+        </w:pict>
+      </w:r>
+    </w:p>
+    <w:p>
+      <w:pPr>
+        <w:rPr>
+          <w:b/>
+          <w:bCs/>
+        </w:rPr>
+      </w:pPr>
+      <w:r>
+        <w:rPr>
+          <w:b/>
+          <w:bCs/>
+        </w:rPr>
+        <w:t>33. Why do React Components return only one root element?</w:t>
+      </w:r>
+    </w:p>
+    <w:p>
+      <w:pPr>
+        <w:rPr>
+          <w:b/>
+          <w:bCs/>
+        </w:rPr>
+      </w:pPr>
+      <w:r>
+        <w:rPr>
+          <w:b/>
+          <w:bCs/>
+        </w:rPr>
+        <w:t>Answer</w:t>
+      </w:r>
+    </w:p>
+    <w:p>
+      <w:r>
+        <w:lastRenderedPageBreak/>
+        <w:t>A React component must return one root element because JSX expressions evaluate to a single object. If multiple elements are required, they should be wrapped inside a parent element or a React Fragment.</w:t>
+      </w:r>
+    </w:p>
+    <w:p>
+      <w:r>
+        <w:pict w14:anchorId="6673C2AE">
+          <v:rect id="_x0000_i1280" style="width:0;height:1.5pt" o:hralign="center" o:hrstd="t" o:hr="t" fillcolor="#a0a0a0" stroked="f"/>
+        </w:pict>
+      </w:r>
+    </w:p>
+    <w:p>
+      <w:pPr>
+        <w:rPr>
+          <w:b/>
+          <w:bCs/>
+        </w:rPr>
+      </w:pPr>
+      <w:r>
+        <w:rPr>
+          <w:b/>
+          <w:bCs/>
+        </w:rPr>
+        <w:t>34. Difference between &lt;div&gt; and React Fragment</w:t>
+      </w:r>
+    </w:p>
+    <w:tbl>
+      <w:tblPr>
+        <w:tblStyle w:val="TableGrid"/>
+        <w:tblW w:w="0" w:type="auto"/>
+        <w:tblLook w:val="04A0" w:firstRow="1" w:lastRow="0" w:firstColumn="1" w:lastColumn="0" w:noHBand="0" w:noVBand="1"/>
+      </w:tblPr>
+      <w:tblGrid>
+        <w:gridCol w:w="2487"/>
+        <w:gridCol w:w="3171"/>
+      </w:tblGrid>
+      <w:tr>
+        <w:tc>
+          <w:tcPr>
+            <w:tcW w:w="0" w:type="auto"/>
+            <w:hideMark/>
+          </w:tcPr>
+          <w:p>
+            <w:pPr>
+              <w:spacing w:after="160" w:line="278" w:lineRule="auto"/>
+              <w:rPr>
+                <w:b/>
+                <w:bCs/>
+              </w:rPr>
+            </w:pPr>
+            <w:r>
+              <w:rPr>
+                <w:b/>
+                <w:bCs/>
+              </w:rPr>
+              <w:t>&lt;div&gt;</w:t>
+            </w:r>
+          </w:p>
+        </w:tc>
+        <w:tc>
+          <w:tcPr>
+            <w:tcW w:w="0" w:type="auto"/>
+            <w:hideMark/>
+          </w:tcPr>
+          <w:p>
+            <w:pPr>
+              <w:spacing w:after="160" w:line="278" w:lineRule="auto"/>
+              <w:rPr>
+                <w:b/>
+                <w:bCs/>
+              </w:rPr>
+            </w:pPr>
+            <w:r>
+              <w:rPr>
+                <w:b/>
+                <w:bCs/>
+              </w:rPr>
+              <w:t>Fragment (&lt;&gt;...&lt;/&gt;)</w:t>
+            </w:r>
+          </w:p>
+        </w:tc>
+      </w:tr>
+      <w:tr>
+        <w:tc>
+          <w:tcPr>
+            <w:tcW w:w="0" w:type="auto"/>
+            <w:hideMark/>
+          </w:tcPr>
+          <w:p>
+            <w:pPr>
+              <w:spacing w:after="160" w:line="278" w:lineRule="auto"/>
+            </w:pPr>
+            <w:r>
+              <w:t>Adds an HTML element</w:t>
+            </w:r>
+          </w:p>
+        </w:tc>
+        <w:tc>
+          <w:tcPr>
+            <w:tcW w:w="0" w:type="auto"/>
+            <w:hideMark/>
+          </w:tcPr>
+          <w:p>
+            <w:pPr>
+              <w:spacing w:after="160" w:line="278" w:lineRule="auto"/>
+            </w:pPr>
+            <w:r>
+              <w:t>Doesn't add an HTML element</w:t>
+            </w:r>
+          </w:p>
+        </w:tc>
+      </w:tr>
+      <w:tr>
+        <w:tc>
+          <w:tcPr>
+            <w:tcW w:w="0" w:type="auto"/>
+            <w:hideMark/>
+          </w:tcPr>
+          <w:p>
+            <w:pPr>
+              <w:spacing w:after="160" w:line="278" w:lineRule="auto"/>
+            </w:pPr>
+            <w:r>
+              <w:t>Visible in DOM</w:t>
+            </w:r>
+          </w:p>
+        </w:tc>
+        <w:tc>
+          <w:tcPr>
+            <w:tcW w:w="0" w:type="auto"/>
+            <w:hideMark/>
+          </w:tcPr>
+          <w:p>
+            <w:pPr>
+              <w:spacing w:after="160" w:line="278" w:lineRule="auto"/>
+            </w:pPr>
+            <w:r>
+              <w:t>Invisible in DOM</w:t>
+            </w:r>
+          </w:p>
+        </w:tc>
+      </w:tr>
+      <w:tr>
+        <w:tc>
+          <w:tcPr>
+            <w:tcW w:w="0" w:type="auto"/>
+            <w:hideMark/>
+          </w:tcPr>
+          <w:p>
+            <w:pPr>
+              <w:spacing w:after="160" w:line="278" w:lineRule="auto"/>
+            </w:pPr>
+            <w:r>
+              <w:t>Can affect CSS layout</w:t>
+            </w:r>
+          </w:p>
+        </w:tc>
+        <w:tc>
+          <w:tcPr>
+            <w:tcW w:w="0" w:type="auto"/>
+            <w:hideMark/>
+          </w:tcPr>
+          <w:p>
+            <w:pPr>
+              <w:spacing w:after="160" w:line="278" w:lineRule="auto"/>
+            </w:pPr>
+            <w:r>
+              <w:t>Doesn't affect layout</w:t>
+            </w:r>
+          </w:p>
+        </w:tc>
+      </w:tr>
+    </w:tbl>
+    <w:p/>
+    <w:p>
+      <w:pPr>
+        <w:rPr>
+          <w:b/>
+          <w:bCs/>
+        </w:rPr>
+      </w:pPr>
+      <w:r>
+        <w:rPr>
+          <w:b/>
+          <w:bCs/>
+        </w:rPr>
+        <w:t>35</w:t>
+      </w:r>
+      <w:r>
+        <w:rPr>
+          <w:b/>
+          <w:bCs/>
+        </w:rPr>
+        <w:t>. What is the purpose of the key prop in React?</w:t>
+      </w:r>
+    </w:p>
+    <w:p>
+      <w:r>
+        <w:rPr>
+          <w:b/>
+          <w:bCs/>
+        </w:rPr>
+        <w:t>Answer:</w:t>
+      </w:r>
+    </w:p>
+    <w:p>
+      <w:r>
+        <w:t>The key prop uniquely identifies each element in a list. It helps React efficiently detect which items have changed, been added, or removed during re-rendering. The key should be unique among sibling elements, and using a database ID is preferred over using the array index.</w:t>
+      </w:r>
+    </w:p>
+    <w:p>
+      <w:pPr>
+        <w:rPr>
+          <w:b/>
+          <w:bCs/>
+        </w:rPr>
+      </w:pPr>
+      <w:r>
+        <w:rPr>
+          <w:b/>
+          <w:bCs/>
+        </w:rPr>
+        <w:t>36. What are Props?</w:t>
+      </w:r>
+    </w:p>
+    <w:p>
+      <w:pPr>
+        <w:rPr>
+          <w:b/>
+          <w:bCs/>
+        </w:rPr>
+      </w:pPr>
+      <w:r>
+        <w:rPr>
+          <w:b/>
+          <w:bCs/>
+        </w:rPr>
+        <w:t>Answer</w:t>
+      </w:r>
+    </w:p>
+    <w:p>
+      <w:r>
+        <w:t>Props (Properties) are used to pass data from a parent component to a child component, making components reusable.</w:t>
+      </w:r>
+    </w:p>
+    <w:p>
+      <w:r>
+        <w:rPr>
+          <w:b/>
+          <w:bCs/>
+        </w:rPr>
+        <w:t>Example</w:t>
+      </w:r>
+    </w:p>
+    <w:p>
+      <w:r>
+        <w:t>&lt;</w:t>
+      </w:r>
+      <w:proofErr w:type="spellStart"/>
+      <w:r>
+        <w:t>CategoryCard</w:t>
+      </w:r>
+      <w:proofErr w:type="spellEnd"/>
+      <w:r>
+        <w:t xml:space="preserve"> name="Pizza" price</w:t>
+      </w:r>
+      <w:proofErr w:type="gramStart"/>
+      <w:r>
+        <w:t>={</w:t>
+      </w:r>
+      <w:proofErr w:type="gramEnd"/>
+      <w:r>
+        <w:t>299} /&gt;</w:t>
+      </w:r>
+    </w:p>
+    <w:p>
+      <w:r>
+        <w:pict w14:anchorId="14BC56D6">
+          <v:rect id="_x0000_i1332" style="width:0;height:1.5pt" o:hralign="center" o:hrstd="t" o:hr="t" fillcolor="#a0a0a0" stroked="f"/>
+        </w:pict>
+      </w:r>
+    </w:p>
+    <w:p>
+      <w:pPr>
+        <w:rPr>
+          <w:b/>
+          <w:bCs/>
+        </w:rPr>
+      </w:pPr>
+      <w:r>
+        <w:rPr>
+          <w:b/>
+          <w:bCs/>
+        </w:rPr>
+        <w:t xml:space="preserve">37. What is </w:t>
+      </w:r>
+      <w:proofErr w:type="spellStart"/>
+      <w:r>
+        <w:rPr>
+          <w:b/>
+          <w:bCs/>
+        </w:rPr>
+        <w:t>Destructuring</w:t>
+      </w:r>
+      <w:proofErr w:type="spellEnd"/>
+      <w:r>
+        <w:rPr>
+          <w:b/>
+          <w:bCs/>
+        </w:rPr>
+        <w:t xml:space="preserve"> in React?</w:t>
+      </w:r>
+    </w:p>
+    <w:p>
+      <w:pPr>
+        <w:rPr>
+          <w:b/>
+          <w:bCs/>
+        </w:rPr>
+      </w:pPr>
+      <w:r>
+        <w:rPr>
+          <w:b/>
+          <w:bCs/>
+        </w:rPr>
+        <w:t>Answer</w:t>
+      </w:r>
+    </w:p>
+    <w:p>
+      <w:proofErr w:type="spellStart"/>
+      <w:r>
+        <w:t>Destructuring</w:t>
+      </w:r>
+      <w:proofErr w:type="spellEnd"/>
+      <w:r>
+        <w:t xml:space="preserve"> is a JavaScript feature used to extract values from an object. In React, it is commonly used to access props directly.</w:t>
+      </w:r>
+    </w:p>
+    <w:p>
+      <w:r>
+        <w:t>Instead of:</w:t>
+      </w:r>
+    </w:p>
+    <w:p>
+      <w:r>
+        <w:t>props.name</w:t>
+      </w:r>
+    </w:p>
+    <w:p>
+      <w:r>
+        <w:lastRenderedPageBreak/>
+        <w:t>we write:</w:t>
+      </w:r>
+    </w:p>
+    <w:p>
+      <w:r>
+        <w:t>{name}</w:t>
+      </w:r>
+    </w:p>
+    <w:p>
+      <w:r>
+        <w:pict w14:anchorId="185C0CD0">
+          <v:rect id="_x0000_i1333" style="width:0;height:1.5pt" o:hralign="center" o:hrstd="t" o:hr="t" fillcolor="#a0a0a0" stroked="f"/>
+        </w:pict>
+      </w:r>
+    </w:p>
+    <w:p>
+      <w:pPr>
+        <w:rPr>
+          <w:b/>
+          <w:bCs/>
+        </w:rPr>
+      </w:pPr>
+      <w:r>
+        <w:rPr>
+          <w:b/>
+          <w:bCs/>
+        </w:rPr>
+        <w:t xml:space="preserve">38. What </w:t>
+      </w:r>
+      <w:proofErr w:type="gramStart"/>
+      <w:r>
+        <w:rPr>
+          <w:b/>
+          <w:bCs/>
+        </w:rPr>
+        <w:t>is .map</w:t>
+      </w:r>
+      <w:proofErr w:type="gramEnd"/>
+      <w:r>
+        <w:rPr>
+          <w:b/>
+          <w:bCs/>
+        </w:rPr>
+        <w:t>() in React?</w:t>
+      </w:r>
+    </w:p>
+    <w:p>
+      <w:pPr>
+        <w:rPr>
+          <w:b/>
+          <w:bCs/>
+        </w:rPr>
+      </w:pPr>
+      <w:r>
+        <w:rPr>
+          <w:b/>
+          <w:bCs/>
+        </w:rPr>
+        <w:t>Answer</w:t>
+      </w:r>
+    </w:p>
+    <w:p>
+      <w:proofErr w:type="gramStart"/>
+      <w:r>
+        <w:t>.map</w:t>
+      </w:r>
+      <w:proofErr w:type="gramEnd"/>
+      <w:r>
+        <w:t>() is used to render multiple components from an array dynamically, avoiding repetitive code.</w:t>
+      </w:r>
+    </w:p>
+    <w:p>
+      <w:r>
+        <w:rPr>
+          <w:b/>
+          <w:bCs/>
+        </w:rPr>
+        <w:t>Example</w:t>
+      </w:r>
+    </w:p>
+    <w:p>
+      <w:proofErr w:type="spellStart"/>
+      <w:r>
+        <w:t>foods.map</w:t>
+      </w:r>
+      <w:proofErr w:type="spellEnd"/>
+      <w:r>
+        <w:t>((food) =&gt; (</w:t>
+      </w:r>
+      <w:r>
+        <w:br/>
+        <w:t xml:space="preserve">    &lt;</w:t>
+      </w:r>
+      <w:proofErr w:type="spellStart"/>
+      <w:r>
+        <w:t>FoodCard</w:t>
+      </w:r>
+      <w:proofErr w:type="spellEnd"/>
+      <w:r>
+        <w:t xml:space="preserve"> key={food.id} ... /&gt;</w:t>
+      </w:r>
+      <w:r>
+        <w:br/>
+        <w:t>))</w:t>
+      </w:r>
+    </w:p>
+    <w:p>
+      <w:r>
+        <w:pict w14:anchorId="1E643C77">
+          <v:rect id="_x0000_i1334" style="width:0;height:1.5pt" o:hralign="center" o:hrstd="t" o:hr="t" fillcolor="#a0a0a0" stroked="f"/>
+        </w:pict>
+      </w:r>
+    </w:p>
+    <w:p>
+      <w:pPr>
+        <w:rPr>
+          <w:b/>
+          <w:bCs/>
+        </w:rPr>
+      </w:pPr>
+      <w:r>
+        <w:rPr>
+          <w:b/>
+          <w:bCs/>
+        </w:rPr>
+        <w:t>39. Why do we use the key prop?</w:t>
+      </w:r>
+    </w:p>
+    <w:p>
+      <w:pPr>
+        <w:rPr>
+          <w:b/>
+          <w:bCs/>
+        </w:rPr>
+      </w:pPr>
+      <w:r>
+        <w:rPr>
+          <w:b/>
+          <w:bCs/>
+        </w:rPr>
+        <w:t>Answer</w:t>
+      </w:r>
+    </w:p>
+    <w:p>
+      <w:r>
+        <w:t>The key prop uniquely identifies each item in a list. React uses it to efficiently update only the changed elements during re-rendering.</w:t>
+      </w:r>
+    </w:p>
+    <w:p>
+      <w:r>
+        <w:pict w14:anchorId="06705DDA">
+          <v:rect id="_x0000_i1335" style="width:0;height:1.5pt" o:hralign="center" o:hrstd="t" o:hr="t" fillcolor="#a0a0a0" stroked="f"/>
+        </w:pict>
+      </w:r>
+    </w:p>
+    <w:p>
+      <w:pPr>
+        <w:rPr>
+          <w:b/>
+          <w:bCs/>
+        </w:rPr>
+      </w:pPr>
+      <w:r>
+        <w:rPr>
+          <w:b/>
+          <w:bCs/>
+        </w:rPr>
+        <w:t>40. Explain the current data flow in your project.</w:t>
+      </w:r>
+    </w:p>
+    <w:p>
+      <w:pPr>
+        <w:rPr>
+          <w:b/>
+          <w:bCs/>
+        </w:rPr>
+      </w:pPr>
+      <w:r>
+        <w:rPr>
+          <w:b/>
+          <w:bCs/>
+        </w:rPr>
+        <w:t>Answer</w:t>
+      </w:r>
+    </w:p>
+    <w:p>
+      <w:r>
+        <w:t>Home</w:t>
+      </w:r>
+      <w:r>
+        <w:br/>
+        <w:t xml:space="preserve">   ↓</w:t>
+      </w:r>
+      <w:r>
+        <w:br/>
+      </w:r>
+      <w:proofErr w:type="gramStart"/>
+      <w:r>
+        <w:t>foods[</w:t>
+      </w:r>
+      <w:proofErr w:type="gramEnd"/>
+      <w:r>
+        <w:t xml:space="preserve">] / </w:t>
+      </w:r>
+      <w:proofErr w:type="gramStart"/>
+      <w:r>
+        <w:t>categories[</w:t>
+      </w:r>
+      <w:proofErr w:type="gramEnd"/>
+      <w:r>
+        <w:t>]</w:t>
+      </w:r>
+      <w:r>
+        <w:br/>
+        <w:t xml:space="preserve">   ↓</w:t>
+      </w:r>
+      <w:r>
+        <w:br/>
+        <w:t>Props</w:t>
+      </w:r>
+      <w:r>
+        <w:br/>
+        <w:t xml:space="preserve">   ↓</w:t>
+      </w:r>
+      <w:r>
+        <w:br/>
+      </w:r>
+      <w:proofErr w:type="spellStart"/>
+      <w:r>
+        <w:t>FoodCard</w:t>
+      </w:r>
+      <w:proofErr w:type="spellEnd"/>
+      <w:r>
+        <w:t xml:space="preserve"> / </w:t>
+      </w:r>
+      <w:proofErr w:type="spellStart"/>
+      <w:r>
+        <w:t>CategoryCard</w:t>
+      </w:r>
+      <w:proofErr w:type="spellEnd"/>
+      <w:r>
+        <w:br/>
+        <w:t xml:space="preserve">   ↓</w:t>
+      </w:r>
+      <w:r>
+        <w:br/>
+        <w:t>Browser UI</w:t>
+      </w:r>
+    </w:p>
+    <w:p>
+      <w:r>
+        <w:t>The parent component passes data to child components using props.</w:t>
+      </w:r>
+    </w:p>
+    <w:p>
+      <w:r>
+        <w:pict w14:anchorId="1FCD25A6">
+          <v:rect id="_x0000_i1336" style="width:0;height:1.5pt" o:hralign="center" o:hrstd="t" o:hr="t" fillcolor="#a0a0a0" stroked="f"/>
+        </w:pict>
+      </w:r>
+    </w:p>
+    <w:p>
+      <w:pPr>
+        <w:rPr>
+          <w:b/>
+          <w:bCs/>
+        </w:rPr>
+      </w:pPr>
+      <w:r>
+        <w:rPr>
+          <w:b/>
+          <w:bCs/>
+        </w:rPr>
+        <w:lastRenderedPageBreak/>
+        <w:t>41. Why are you using dummy data?</w:t>
+      </w:r>
+    </w:p>
+    <w:p>
+      <w:pPr>
+        <w:rPr>
+          <w:b/>
+          <w:bCs/>
+        </w:rPr>
+      </w:pPr>
+      <w:r>
+        <w:rPr>
+          <w:b/>
+          <w:bCs/>
+        </w:rPr>
+        <w:t>Answer</w:t>
+      </w:r>
+    </w:p>
+    <w:p>
+      <w:r>
+        <w:t>The backend is not developed yet. Dummy data helps build and test the frontend independently. Later, it will be replaced with data fetched from the Express API using Axios.</w:t>
+      </w:r>
+    </w:p>
+    <w:p>
+      <w:r>
+        <w:pict w14:anchorId="1C2A26A7">
+          <v:rect id="_x0000_i1337" style="width:0;height:1.5pt" o:hralign="center" o:hrstd="t" o:hr="t" fillcolor="#a0a0a0" stroked="f"/>
+        </w:pict>
+      </w:r>
+    </w:p>
+    <w:p>
+      <w:pPr>
+        <w:rPr>
+          <w:b/>
+          <w:bCs/>
+        </w:rPr>
+      </w:pPr>
+      <w:r>
+        <w:rPr>
+          <w:b/>
+          <w:bCs/>
+        </w:rPr>
+        <w:t>42. How will the data flow after the backend is completed?</w:t>
+      </w:r>
+    </w:p>
+    <w:p>
+      <w:pPr>
+        <w:rPr>
+          <w:b/>
+          <w:bCs/>
+        </w:rPr>
+      </w:pPr>
+      <w:r>
+        <w:rPr>
+          <w:b/>
+          <w:bCs/>
+        </w:rPr>
+        <w:t>Answer</w:t>
+      </w:r>
+    </w:p>
+    <w:p>
+      <w:r>
+        <w:t>MongoDB</w:t>
+      </w:r>
+      <w:r>
+        <w:br/>
+        <w:t xml:space="preserve">   ↓</w:t>
+      </w:r>
+      <w:r>
+        <w:br/>
+        <w:t>Express API</w:t>
+      </w:r>
+      <w:r>
+        <w:br/>
+        <w:t xml:space="preserve">   ↓</w:t>
+      </w:r>
+      <w:r>
+        <w:br/>
+        <w:t>Axios</w:t>
+      </w:r>
+      <w:r>
+        <w:br/>
+        <w:t xml:space="preserve">   ↓</w:t>
+      </w:r>
+      <w:r>
+        <w:br/>
+        <w:t>React</w:t>
+      </w:r>
+      <w:r>
+        <w:br/>
+        <w:t xml:space="preserve">   ↓</w:t>
+      </w:r>
+      <w:r>
+        <w:br/>
+      </w:r>
+      <w:proofErr w:type="spellStart"/>
+      <w:r>
+        <w:t>FoodCard</w:t>
+      </w:r>
+      <w:proofErr w:type="spellEnd"/>
+    </w:p>
+    <w:p>
+      <w:r>
+        <w:t>The frontend will no longer use hardcoded arrays.</w:t>
+      </w:r>
+    </w:p>
+    <w:p>
+      <w:r>
+        <w:pict w14:anchorId="181983E0">
+          <v:rect id="_x0000_i1338" style="width:0;height:1.5pt" o:hralign="center" o:hrstd="t" o:hr="t" fillcolor="#a0a0a0" stroked="f"/>
+        </w:pict>
+      </w:r>
+    </w:p>
+    <w:p>
+      <w:pPr>
+        <w:rPr>
+          <w:b/>
+          <w:bCs/>
+        </w:rPr>
+      </w:pPr>
+      <w:r>
+        <w:rPr>
+          <w:b/>
+          <w:bCs/>
+        </w:rPr>
+        <w:t>43. Does MERN provide a built-in admin panel like Django?</w:t>
+      </w:r>
+    </w:p>
+    <w:p>
+      <w:pPr>
+        <w:rPr>
+          <w:b/>
+          <w:bCs/>
+        </w:rPr>
+      </w:pPr>
+      <w:r>
+        <w:rPr>
+          <w:b/>
+          <w:bCs/>
+        </w:rPr>
+        <w:t>Answer</w:t>
+      </w:r>
+    </w:p>
+    <w:p>
+      <w:r>
+        <w:t>No. Unlike Django, MERN does not provide a built-in admin panel. We need to build the admin dashboard ourselves using React and connect it to Express APIs.</w:t>
+      </w:r>
+    </w:p>
+    <w:p/>
     <w:p/>
     <w:sectPr>
       <w:pgSz w:w="12240" w:h="15840"/>
@@ -2778,6 +4314,155 @@
     </w:lvl>
   </w:abstractNum>
   <w:abstractNum w:abstractNumId="1" w15:restartNumberingAfterBreak="0">
+    <w:nsid w:val="2EE24D80"/>
+    <w:multiLevelType w:val="multilevel"/>
+    <w:tmpl w:val="D9E604E4"/>
+    <w:lvl w:ilvl="0">
+      <w:start w:val="1"/>
+      <w:numFmt w:val="bullet"/>
+      <w:lvlText w:val=""/>
+      <w:lvlJc w:val="left"/>
+      <w:pPr>
+        <w:tabs>
+          <w:tab w:val="num" w:pos="720"/>
+        </w:tabs>
+        <w:ind w:left="720" w:hanging="360"/>
+      </w:pPr>
+      <w:rPr>
+        <w:rFonts w:ascii="Symbol" w:hAnsi="Symbol" w:hint="default"/>
+        <w:sz w:val="20"/>
+      </w:rPr>
+    </w:lvl>
+    <w:lvl w:ilvl="1" w:tentative="1">
+      <w:start w:val="1"/>
+      <w:numFmt w:val="bullet"/>
+      <w:lvlText w:val="o"/>
+      <w:lvlJc w:val="left"/>
+      <w:pPr>
+        <w:tabs>
+          <w:tab w:val="num" w:pos="1440"/>
+        </w:tabs>
+        <w:ind w:left="1440" w:hanging="360"/>
+      </w:pPr>
+      <w:rPr>
+        <w:rFonts w:ascii="Courier New" w:hAnsi="Courier New" w:hint="default"/>
+        <w:sz w:val="20"/>
+      </w:rPr>
+    </w:lvl>
+    <w:lvl w:ilvl="2" w:tentative="1">
+      <w:start w:val="1"/>
+      <w:numFmt w:val="bullet"/>
+      <w:lvlText w:val=""/>
+      <w:lvlJc w:val="left"/>
+      <w:pPr>
+        <w:tabs>
+          <w:tab w:val="num" w:pos="2160"/>
+        </w:tabs>
+        <w:ind w:left="2160" w:hanging="360"/>
+      </w:pPr>
+      <w:rPr>
+        <w:rFonts w:ascii="Wingdings" w:hAnsi="Wingdings" w:hint="default"/>
+        <w:sz w:val="20"/>
+      </w:rPr>
+    </w:lvl>
+    <w:lvl w:ilvl="3" w:tentative="1">
+      <w:start w:val="1"/>
+      <w:numFmt w:val="bullet"/>
+      <w:lvlText w:val=""/>
+      <w:lvlJc w:val="left"/>
+      <w:pPr>
+        <w:tabs>
+          <w:tab w:val="num" w:pos="2880"/>
+        </w:tabs>
+        <w:ind w:left="2880" w:hanging="360"/>
+      </w:pPr>
+      <w:rPr>
+        <w:rFonts w:ascii="Wingdings" w:hAnsi="Wingdings" w:hint="default"/>
+        <w:sz w:val="20"/>
+      </w:rPr>
+    </w:lvl>
+    <w:lvl w:ilvl="4" w:tentative="1">
+      <w:start w:val="1"/>
+      <w:numFmt w:val="bullet"/>
+      <w:lvlText w:val=""/>
+      <w:lvlJc w:val="left"/>
+      <w:pPr>
+        <w:tabs>
+          <w:tab w:val="num" w:pos="3600"/>
+        </w:tabs>
+        <w:ind w:left="3600" w:hanging="360"/>
+      </w:pPr>
+      <w:rPr>
+        <w:rFonts w:ascii="Wingdings" w:hAnsi="Wingdings" w:hint="default"/>
+        <w:sz w:val="20"/>
+      </w:rPr>
+    </w:lvl>
+    <w:lvl w:ilvl="5" w:tentative="1">
+      <w:start w:val="1"/>
+      <w:numFmt w:val="bullet"/>
+      <w:lvlText w:val=""/>
+      <w:lvlJc w:val="left"/>
+      <w:pPr>
+        <w:tabs>
+          <w:tab w:val="num" w:pos="4320"/>
+        </w:tabs>
+        <w:ind w:left="4320" w:hanging="360"/>
+      </w:pPr>
+      <w:rPr>
+        <w:rFonts w:ascii="Wingdings" w:hAnsi="Wingdings" w:hint="default"/>
+        <w:sz w:val="20"/>
+      </w:rPr>
+    </w:lvl>
+    <w:lvl w:ilvl="6" w:tentative="1">
+      <w:start w:val="1"/>
+      <w:numFmt w:val="bullet"/>
+      <w:lvlText w:val=""/>
+      <w:lvlJc w:val="left"/>
+      <w:pPr>
+        <w:tabs>
+          <w:tab w:val="num" w:pos="5040"/>
+        </w:tabs>
+        <w:ind w:left="5040" w:hanging="360"/>
+      </w:pPr>
+      <w:rPr>
+        <w:rFonts w:ascii="Wingdings" w:hAnsi="Wingdings" w:hint="default"/>
+        <w:sz w:val="20"/>
+      </w:rPr>
+    </w:lvl>
+    <w:lvl w:ilvl="7" w:tentative="1">
+      <w:start w:val="1"/>
+      <w:numFmt w:val="bullet"/>
+      <w:lvlText w:val=""/>
+      <w:lvlJc w:val="left"/>
+      <w:pPr>
+        <w:tabs>
+          <w:tab w:val="num" w:pos="5760"/>
+        </w:tabs>
+        <w:ind w:left="5760" w:hanging="360"/>
+      </w:pPr>
+      <w:rPr>
+        <w:rFonts w:ascii="Wingdings" w:hAnsi="Wingdings" w:hint="default"/>
+        <w:sz w:val="20"/>
+      </w:rPr>
+    </w:lvl>
+    <w:lvl w:ilvl="8" w:tentative="1">
+      <w:start w:val="1"/>
+      <w:numFmt w:val="bullet"/>
+      <w:lvlText w:val=""/>
+      <w:lvlJc w:val="left"/>
+      <w:pPr>
+        <w:tabs>
+          <w:tab w:val="num" w:pos="6480"/>
+        </w:tabs>
+        <w:ind w:left="6480" w:hanging="360"/>
+      </w:pPr>
+      <w:rPr>
+        <w:rFonts w:ascii="Wingdings" w:hAnsi="Wingdings" w:hint="default"/>
+        <w:sz w:val="20"/>
+      </w:rPr>
+    </w:lvl>
+  </w:abstractNum>
+  <w:abstractNum w:abstractNumId="2" w15:restartNumberingAfterBreak="0">
     <w:nsid w:val="303D4589"/>
     <w:multiLevelType w:val="multilevel"/>
     <w:tmpl w:val="AFC222B6"/>
@@ -2926,7 +4611,7 @@
       </w:rPr>
     </w:lvl>
   </w:abstractNum>
-  <w:abstractNum w:abstractNumId="2" w15:restartNumberingAfterBreak="0">
+  <w:abstractNum w:abstractNumId="3" w15:restartNumberingAfterBreak="0">
     <w:nsid w:val="311D54C7"/>
     <w:multiLevelType w:val="multilevel"/>
     <w:tmpl w:val="39ACC3B6"/>
@@ -3075,7 +4760,7 @@
       </w:rPr>
     </w:lvl>
   </w:abstractNum>
-  <w:abstractNum w:abstractNumId="3" w15:restartNumberingAfterBreak="0">
+  <w:abstractNum w:abstractNumId="4" w15:restartNumberingAfterBreak="0">
     <w:nsid w:val="36A92518"/>
     <w:multiLevelType w:val="multilevel"/>
     <w:tmpl w:val="9448F632"/>
@@ -3224,7 +4909,7 @@
       </w:rPr>
     </w:lvl>
   </w:abstractNum>
-  <w:abstractNum w:abstractNumId="4" w15:restartNumberingAfterBreak="0">
+  <w:abstractNum w:abstractNumId="5" w15:restartNumberingAfterBreak="0">
     <w:nsid w:val="43793A10"/>
     <w:multiLevelType w:val="multilevel"/>
     <w:tmpl w:val="92369CD6"/>
@@ -3373,7 +5058,7 @@
       </w:rPr>
     </w:lvl>
   </w:abstractNum>
-  <w:abstractNum w:abstractNumId="5" w15:restartNumberingAfterBreak="0">
+  <w:abstractNum w:abstractNumId="6" w15:restartNumberingAfterBreak="0">
     <w:nsid w:val="492A126F"/>
     <w:multiLevelType w:val="multilevel"/>
     <w:tmpl w:val="E444C0AA"/>
@@ -3522,7 +5207,7 @@
       </w:rPr>
     </w:lvl>
   </w:abstractNum>
-  <w:abstractNum w:abstractNumId="6" w15:restartNumberingAfterBreak="0">
+  <w:abstractNum w:abstractNumId="7" w15:restartNumberingAfterBreak="0">
     <w:nsid w:val="623C56AC"/>
     <w:multiLevelType w:val="multilevel"/>
     <w:tmpl w:val="90B05342"/>
@@ -3672,25 +5357,28 @@
     </w:lvl>
   </w:abstractNum>
   <w:num w:numId="1" w16cid:durableId="968709895">
+    <w:abstractNumId w:val="4"/>
+  </w:num>
+  <w:num w:numId="2" w16cid:durableId="1226643985">
+    <w:abstractNumId w:val="7"/>
+  </w:num>
+  <w:num w:numId="3" w16cid:durableId="276910803">
+    <w:abstractNumId w:val="2"/>
+  </w:num>
+  <w:num w:numId="4" w16cid:durableId="1243949237">
     <w:abstractNumId w:val="3"/>
   </w:num>
-  <w:num w:numId="2" w16cid:durableId="1226643985">
-    <w:abstractNumId w:val="6"/>
-  </w:num>
-  <w:num w:numId="3" w16cid:durableId="276910803">
-    <w:abstractNumId w:val="1"/>
-  </w:num>
-  <w:num w:numId="4" w16cid:durableId="1243949237">
-    <w:abstractNumId w:val="2"/>
-  </w:num>
   <w:num w:numId="5" w16cid:durableId="790629237">
-    <w:abstractNumId w:val="4"/>
+    <w:abstractNumId w:val="5"/>
   </w:num>
   <w:num w:numId="6" w16cid:durableId="1972393765">
-    <w:abstractNumId w:val="5"/>
+    <w:abstractNumId w:val="6"/>
   </w:num>
   <w:num w:numId="7" w16cid:durableId="777218426">
     <w:abstractNumId w:val="0"/>
+  </w:num>
+  <w:num w:numId="8" w16cid:durableId="28067647">
+    <w:abstractNumId w:val="1"/>
   </w:num>
 </w:numbering>
 </file>
@@ -4611,6 +6299,25 @@
       <w:spacing w:val="5"/>
     </w:rPr>
   </w:style>
+  <w:style w:type="table" w:styleId="TableGrid">
+    <w:name w:val="Table Grid"/>
+    <w:basedOn w:val="TableNormal"/>
+    <w:uiPriority w:val="39"/>
+    <w:rsid w:val="005338E4"/>
+    <w:pPr>
+      <w:spacing w:after="0" w:line="240" w:lineRule="auto"/>
+    </w:pPr>
+    <w:tblPr>
+      <w:tblBorders>
+        <w:top w:val="single" w:sz="4" w:space="0" w:color="auto"/>
+        <w:left w:val="single" w:sz="4" w:space="0" w:color="auto"/>
+        <w:bottom w:val="single" w:sz="4" w:space="0" w:color="auto"/>
+        <w:right w:val="single" w:sz="4" w:space="0" w:color="auto"/>
+        <w:insideH w:val="single" w:sz="4" w:space="0" w:color="auto"/>
+        <w:insideV w:val="single" w:sz="4" w:space="0" w:color="auto"/>
+      </w:tblBorders>
+    </w:tblPr>
+  </w:style>
 </w:styles>
 </file>
 

</xml_diff>

<commit_message>
Implement Express backend with Food CRUD APIs
</commit_message>
<xml_diff>
--- a/docs/foodhub_Interview_Notes.docx
+++ b/docs/foodhub_Interview_Notes.docx
@@ -51,7 +51,7 @@
     <w:p>
       <w:r>
         <w:pict w14:anchorId="1072A254">
-          <v:rect id="_x0000_i1175" style="width:0;height:1.5pt" o:hralign="center" o:hrstd="t" o:hr="t" fillcolor="#a0a0a0" stroked="f"/>
+          <v:rect id="_x0000_i1025" style="width:0;height:1.5pt" o:hralign="center" o:hrstd="t" o:hr="t" fillcolor="#a0a0a0" stroked="f"/>
         </w:pict>
       </w:r>
     </w:p>
@@ -128,7 +128,7 @@
     <w:p>
       <w:r>
         <w:pict w14:anchorId="18CA38AD">
-          <v:rect id="_x0000_i1176" style="width:0;height:1.5pt" o:hralign="center" o:hrstd="t" o:hr="t" fillcolor="#a0a0a0" stroked="f"/>
+          <v:rect id="_x0000_i1026" style="width:0;height:1.5pt" o:hralign="center" o:hrstd="t" o:hr="t" fillcolor="#a0a0a0" stroked="f"/>
         </w:pict>
       </w:r>
     </w:p>
@@ -228,7 +228,7 @@
     <w:p>
       <w:r>
         <w:pict w14:anchorId="20ECF541">
-          <v:rect id="_x0000_i1177" style="width:0;height:1.5pt" o:hralign="center" o:hrstd="t" o:hr="t" fillcolor="#a0a0a0" stroked="f"/>
+          <v:rect id="_x0000_i1027" style="width:0;height:1.5pt" o:hralign="center" o:hrstd="t" o:hr="t" fillcolor="#a0a0a0" stroked="f"/>
         </w:pict>
       </w:r>
     </w:p>
@@ -272,7 +272,7 @@
     <w:p>
       <w:r>
         <w:pict w14:anchorId="3D897F21">
-          <v:rect id="_x0000_i1178" style="width:0;height:1.5pt" o:hralign="center" o:hrstd="t" o:hr="t" fillcolor="#a0a0a0" stroked="f"/>
+          <v:rect id="_x0000_i1028" style="width:0;height:1.5pt" o:hralign="center" o:hrstd="t" o:hr="t" fillcolor="#a0a0a0" stroked="f"/>
         </w:pict>
       </w:r>
     </w:p>
@@ -488,7 +488,7 @@
     <w:p>
       <w:r>
         <w:pict w14:anchorId="5EDED786">
-          <v:rect id="_x0000_i1179" style="width:0;height:1.5pt" o:hralign="center" o:hrstd="t" o:hr="t" fillcolor="#a0a0a0" stroked="f"/>
+          <v:rect id="_x0000_i1029" style="width:0;height:1.5pt" o:hralign="center" o:hrstd="t" o:hr="t" fillcolor="#a0a0a0" stroked="f"/>
         </w:pict>
       </w:r>
     </w:p>
@@ -524,7 +524,7 @@
     <w:p>
       <w:r>
         <w:pict w14:anchorId="25FF14E9">
-          <v:rect id="_x0000_i1180" style="width:0;height:1.5pt" o:hralign="center" o:hrstd="t" o:hr="t" fillcolor="#a0a0a0" stroked="f"/>
+          <v:rect id="_x0000_i1030" style="width:0;height:1.5pt" o:hralign="center" o:hrstd="t" o:hr="t" fillcolor="#a0a0a0" stroked="f"/>
         </w:pict>
       </w:r>
     </w:p>
@@ -610,7 +610,7 @@
     <w:p>
       <w:r>
         <w:pict w14:anchorId="45D1F155">
-          <v:rect id="_x0000_i1181" style="width:0;height:1.5pt" o:hralign="center" o:hrstd="t" o:hr="t" fillcolor="#a0a0a0" stroked="f"/>
+          <v:rect id="_x0000_i1031" style="width:0;height:1.5pt" o:hralign="center" o:hrstd="t" o:hr="t" fillcolor="#a0a0a0" stroked="f"/>
         </w:pict>
       </w:r>
     </w:p>
@@ -665,7 +665,7 @@
       <w:r>
         <w:lastRenderedPageBreak/>
         <w:pict w14:anchorId="222416AF">
-          <v:rect id="_x0000_i1182" style="width:0;height:1.5pt" o:hralign="center" o:hrstd="t" o:hr="t" fillcolor="#a0a0a0" stroked="f"/>
+          <v:rect id="_x0000_i1032" style="width:0;height:1.5pt" o:hralign="center" o:hrstd="t" o:hr="t" fillcolor="#a0a0a0" stroked="f"/>
         </w:pict>
       </w:r>
     </w:p>
@@ -761,7 +761,7 @@
     <w:p>
       <w:r>
         <w:pict w14:anchorId="5D86F204">
-          <v:rect id="_x0000_i1183" style="width:0;height:1.5pt" o:hralign="center" o:hrstd="t" o:hr="t" fillcolor="#a0a0a0" stroked="f"/>
+          <v:rect id="_x0000_i1033" style="width:0;height:1.5pt" o:hralign="center" o:hrstd="t" o:hr="t" fillcolor="#a0a0a0" stroked="f"/>
         </w:pict>
       </w:r>
     </w:p>
@@ -966,7 +966,7 @@
     <w:p>
       <w:r>
         <w:pict w14:anchorId="1CFF775F">
-          <v:rect id="_x0000_i1184" style="width:0;height:1.5pt" o:hralign="center" o:hrstd="t" o:hr="t" fillcolor="#a0a0a0" stroked="f"/>
+          <v:rect id="_x0000_i1034" style="width:0;height:1.5pt" o:hralign="center" o:hrstd="t" o:hr="t" fillcolor="#a0a0a0" stroked="f"/>
         </w:pict>
       </w:r>
     </w:p>
@@ -1027,7 +1027,7 @@
     <w:p>
       <w:r>
         <w:pict w14:anchorId="0F932AEA">
-          <v:rect id="_x0000_i1185" style="width:0;height:1.5pt" o:hralign="center" o:hrstd="t" o:hr="t" fillcolor="#a0a0a0" stroked="f"/>
+          <v:rect id="_x0000_i1035" style="width:0;height:1.5pt" o:hralign="center" o:hrstd="t" o:hr="t" fillcolor="#a0a0a0" stroked="f"/>
         </w:pict>
       </w:r>
     </w:p>
@@ -1118,7 +1118,7 @@
     <w:p>
       <w:r>
         <w:pict w14:anchorId="1BE21DB7">
-          <v:rect id="_x0000_i1186" style="width:0;height:1.5pt" o:hralign="center" o:hrstd="t" o:hr="t" fillcolor="#a0a0a0" stroked="f"/>
+          <v:rect id="_x0000_i1036" style="width:0;height:1.5pt" o:hralign="center" o:hrstd="t" o:hr="t" fillcolor="#a0a0a0" stroked="f"/>
         </w:pict>
       </w:r>
     </w:p>
@@ -1197,7 +1197,7 @@
     <w:p>
       <w:r>
         <w:pict w14:anchorId="4C9AACA1">
-          <v:rect id="_x0000_i1187" style="width:0;height:1.5pt" o:hralign="center" o:hrstd="t" o:hr="t" fillcolor="#a0a0a0" stroked="f"/>
+          <v:rect id="_x0000_i1037" style="width:0;height:1.5pt" o:hralign="center" o:hrstd="t" o:hr="t" fillcolor="#a0a0a0" stroked="f"/>
         </w:pict>
       </w:r>
     </w:p>
@@ -1404,7 +1404,7 @@
     <w:p>
       <w:r>
         <w:pict w14:anchorId="64DD6A56">
-          <v:rect id="_x0000_i1188" style="width:0;height:1.5pt" o:hralign="center" o:hrstd="t" o:hr="t" fillcolor="#a0a0a0" stroked="f"/>
+          <v:rect id="_x0000_i1038" style="width:0;height:1.5pt" o:hralign="center" o:hrstd="t" o:hr="t" fillcolor="#a0a0a0" stroked="f"/>
         </w:pict>
       </w:r>
     </w:p>
@@ -1449,7 +1449,7 @@
       <w:r>
         <w:lastRenderedPageBreak/>
         <w:pict w14:anchorId="1D455AE2">
-          <v:rect id="_x0000_i1189" style="width:0;height:1.5pt" o:hralign="center" o:hrstd="t" o:hr="t" fillcolor="#a0a0a0" stroked="f"/>
+          <v:rect id="_x0000_i1039" style="width:0;height:1.5pt" o:hralign="center" o:hrstd="t" o:hr="t" fillcolor="#a0a0a0" stroked="f"/>
         </w:pict>
       </w:r>
     </w:p>
@@ -1579,7 +1579,7 @@
     <w:p>
       <w:r>
         <w:pict w14:anchorId="08BC4A53">
-          <v:rect id="_x0000_i1190" style="width:0;height:1.5pt" o:hralign="center" o:hrstd="t" o:hr="t" fillcolor="#a0a0a0" stroked="f"/>
+          <v:rect id="_x0000_i1040" style="width:0;height:1.5pt" o:hralign="center" o:hrstd="t" o:hr="t" fillcolor="#a0a0a0" stroked="f"/>
         </w:pict>
       </w:r>
     </w:p>
@@ -1667,7 +1667,7 @@
     <w:p>
       <w:r>
         <w:pict w14:anchorId="3A7C0ACC">
-          <v:rect id="_x0000_i1191" style="width:0;height:1.5pt" o:hralign="center" o:hrstd="t" o:hr="t" fillcolor="#a0a0a0" stroked="f"/>
+          <v:rect id="_x0000_i1041" style="width:0;height:1.5pt" o:hralign="center" o:hrstd="t" o:hr="t" fillcolor="#a0a0a0" stroked="f"/>
         </w:pict>
       </w:r>
     </w:p>
@@ -1734,7 +1734,7 @@
     <w:p>
       <w:r>
         <w:pict w14:anchorId="43B71A3D">
-          <v:rect id="_x0000_i1192" style="width:0;height:1.5pt" o:hralign="center" o:hrstd="t" o:hr="t" fillcolor="#a0a0a0" stroked="f"/>
+          <v:rect id="_x0000_i1042" style="width:0;height:1.5pt" o:hralign="center" o:hrstd="t" o:hr="t" fillcolor="#a0a0a0" stroked="f"/>
         </w:pict>
       </w:r>
     </w:p>
@@ -1945,7 +1945,7 @@
     <w:p>
       <w:r>
         <w:pict w14:anchorId="62765FBD">
-          <v:rect id="_x0000_i1193" style="width:0;height:1.5pt" o:hralign="center" o:hrstd="t" o:hr="t" fillcolor="#a0a0a0" stroked="f"/>
+          <v:rect id="_x0000_i1043" style="width:0;height:1.5pt" o:hralign="center" o:hrstd="t" o:hr="t" fillcolor="#a0a0a0" stroked="f"/>
         </w:pict>
       </w:r>
     </w:p>
@@ -2006,7 +2006,7 @@
     <w:p>
       <w:r>
         <w:pict w14:anchorId="7243BDBC">
-          <v:rect id="_x0000_i1194" style="width:0;height:1.5pt" o:hralign="center" o:hrstd="t" o:hr="t" fillcolor="#a0a0a0" stroked="f"/>
+          <v:rect id="_x0000_i1044" style="width:0;height:1.5pt" o:hralign="center" o:hrstd="t" o:hr="t" fillcolor="#a0a0a0" stroked="f"/>
         </w:pict>
       </w:r>
     </w:p>
@@ -2124,7 +2124,7 @@
     <w:p>
       <w:r>
         <w:pict w14:anchorId="2BD2BA9A">
-          <v:rect id="_x0000_i1195" style="width:0;height:1.5pt" o:hralign="center" o:hrstd="t" o:hr="t" fillcolor="#a0a0a0" stroked="f"/>
+          <v:rect id="_x0000_i1045" style="width:0;height:1.5pt" o:hralign="center" o:hrstd="t" o:hr="t" fillcolor="#a0a0a0" stroked="f"/>
         </w:pict>
       </w:r>
     </w:p>
@@ -2160,7 +2160,7 @@
     <w:p>
       <w:r>
         <w:pict w14:anchorId="4E4D6F99">
-          <v:rect id="_x0000_i1196" style="width:0;height:1.5pt" o:hralign="center" o:hrstd="t" o:hr="t" fillcolor="#a0a0a0" stroked="f"/>
+          <v:rect id="_x0000_i1046" style="width:0;height:1.5pt" o:hralign="center" o:hrstd="t" o:hr="t" fillcolor="#a0a0a0" stroked="f"/>
         </w:pict>
       </w:r>
     </w:p>
@@ -2218,7 +2218,7 @@
       <w:r>
         <w:lastRenderedPageBreak/>
         <w:pict w14:anchorId="0BBF2FA1">
-          <v:rect id="_x0000_i1197" style="width:0;height:1.5pt" o:hralign="center" o:hrstd="t" o:hr="t" fillcolor="#a0a0a0" stroked="f"/>
+          <v:rect id="_x0000_i1047" style="width:0;height:1.5pt" o:hralign="center" o:hrstd="t" o:hr="t" fillcolor="#a0a0a0" stroked="f"/>
         </w:pict>
       </w:r>
     </w:p>
@@ -2278,7 +2278,7 @@
     <w:p>
       <w:r>
         <w:pict w14:anchorId="4092EE4F">
-          <v:rect id="_x0000_i1198" style="width:0;height:1.5pt" o:hralign="center" o:hrstd="t" o:hr="t" fillcolor="#a0a0a0" stroked="f"/>
+          <v:rect id="_x0000_i1048" style="width:0;height:1.5pt" o:hralign="center" o:hrstd="t" o:hr="t" fillcolor="#a0a0a0" stroked="f"/>
         </w:pict>
       </w:r>
     </w:p>
@@ -2570,7 +2570,7 @@
     <w:p>
       <w:r>
         <w:pict w14:anchorId="5FCD16BA">
-          <v:rect id="_x0000_i1199" style="width:0;height:1.5pt" o:hralign="center" o:hrstd="t" o:hr="t" fillcolor="#a0a0a0" stroked="f"/>
+          <v:rect id="_x0000_i1049" style="width:0;height:1.5pt" o:hralign="center" o:hrstd="t" o:hr="t" fillcolor="#a0a0a0" stroked="f"/>
         </w:pict>
       </w:r>
     </w:p>
@@ -2618,7 +2618,7 @@
     <w:p>
       <w:r>
         <w:pict w14:anchorId="2F2F81BC">
-          <v:rect id="_x0000_i1289" style="width:0;height:1.5pt" o:hralign="center" o:hrstd="t" o:hr="t" fillcolor="#a0a0a0" stroked="f"/>
+          <v:rect id="_x0000_i1050" style="width:0;height:1.5pt" o:hralign="center" o:hrstd="t" o:hr="t" fillcolor="#a0a0a0" stroked="f"/>
         </w:pict>
       </w:r>
     </w:p>
@@ -2849,7 +2849,7 @@
     <w:p>
       <w:r>
         <w:pict w14:anchorId="651673A0">
-          <v:rect id="_x0000_i1273" style="width:0;height:1.5pt" o:hralign="center" o:hrstd="t" o:hr="t" fillcolor="#a0a0a0" stroked="f"/>
+          <v:rect id="_x0000_i1051" style="width:0;height:1.5pt" o:hralign="center" o:hrstd="t" o:hr="t" fillcolor="#a0a0a0" stroked="f"/>
         </w:pict>
       </w:r>
     </w:p>
@@ -2920,7 +2920,7 @@
     <w:p>
       <w:r>
         <w:pict w14:anchorId="295EAE86">
-          <v:rect id="_x0000_i1274" style="width:0;height:1.5pt" o:hralign="center" o:hrstd="t" o:hr="t" fillcolor="#a0a0a0" stroked="f"/>
+          <v:rect id="_x0000_i1052" style="width:0;height:1.5pt" o:hralign="center" o:hrstd="t" o:hr="t" fillcolor="#a0a0a0" stroked="f"/>
         </w:pict>
       </w:r>
     </w:p>
@@ -3022,7 +3022,7 @@
     <w:p>
       <w:r>
         <w:pict w14:anchorId="305A05A6">
-          <v:rect id="_x0000_i1275" style="width:0;height:1.5pt" o:hralign="center" o:hrstd="t" o:hr="t" fillcolor="#a0a0a0" stroked="f"/>
+          <v:rect id="_x0000_i1053" style="width:0;height:1.5pt" o:hralign="center" o:hrstd="t" o:hr="t" fillcolor="#a0a0a0" stroked="f"/>
         </w:pict>
       </w:r>
     </w:p>
@@ -3170,7 +3170,7 @@
     <w:p>
       <w:r>
         <w:pict w14:anchorId="08978946">
-          <v:rect id="_x0000_i1276" style="width:0;height:1.5pt" o:hralign="center" o:hrstd="t" o:hr="t" fillcolor="#a0a0a0" stroked="f"/>
+          <v:rect id="_x0000_i1054" style="width:0;height:1.5pt" o:hralign="center" o:hrstd="t" o:hr="t" fillcolor="#a0a0a0" stroked="f"/>
         </w:pict>
       </w:r>
     </w:p>
@@ -3213,7 +3213,7 @@
     <w:p>
       <w:r>
         <w:pict w14:anchorId="3879FF59">
-          <v:rect id="_x0000_i1277" style="width:0;height:1.5pt" o:hralign="center" o:hrstd="t" o:hr="t" fillcolor="#a0a0a0" stroked="f"/>
+          <v:rect id="_x0000_i1055" style="width:0;height:1.5pt" o:hralign="center" o:hrstd="t" o:hr="t" fillcolor="#a0a0a0" stroked="f"/>
         </w:pict>
       </w:r>
     </w:p>
@@ -3255,7 +3255,7 @@
     <w:p>
       <w:r>
         <w:pict w14:anchorId="3B45C6A9">
-          <v:rect id="_x0000_i1278" style="width:0;height:1.5pt" o:hralign="center" o:hrstd="t" o:hr="t" fillcolor="#a0a0a0" stroked="f"/>
+          <v:rect id="_x0000_i1056" style="width:0;height:1.5pt" o:hralign="center" o:hrstd="t" o:hr="t" fillcolor="#a0a0a0" stroked="f"/>
         </w:pict>
       </w:r>
     </w:p>
@@ -3341,7 +3341,7 @@
     <w:p>
       <w:r>
         <w:pict w14:anchorId="7EE30640">
-          <v:rect id="_x0000_i1279" style="width:0;height:1.5pt" o:hralign="center" o:hrstd="t" o:hr="t" fillcolor="#a0a0a0" stroked="f"/>
+          <v:rect id="_x0000_i1057" style="width:0;height:1.5pt" o:hralign="center" o:hrstd="t" o:hr="t" fillcolor="#a0a0a0" stroked="f"/>
         </w:pict>
       </w:r>
     </w:p>
@@ -3384,7 +3384,7 @@
     <w:p>
       <w:r>
         <w:pict w14:anchorId="6673C2AE">
-          <v:rect id="_x0000_i1280" style="width:0;height:1.5pt" o:hralign="center" o:hrstd="t" o:hr="t" fillcolor="#a0a0a0" stroked="f"/>
+          <v:rect id="_x0000_i1058" style="width:0;height:1.5pt" o:hralign="center" o:hrstd="t" o:hr="t" fillcolor="#a0a0a0" stroked="f"/>
         </w:pict>
       </w:r>
     </w:p>
@@ -3550,7 +3550,13 @@
         </w:tc>
       </w:tr>
     </w:tbl>
-    <w:p/>
+    <w:p>
+      <w:r>
+        <w:pict w14:anchorId="46D9AE4C">
+          <v:rect id="_x0000_i1059" style="width:0;height:1.5pt" o:hralign="center" o:hrstd="t" o:hr="t" fillcolor="#a0a0a0" stroked="f"/>
+        </w:pict>
+      </w:r>
+    </w:p>
     <w:p>
       <w:pPr>
         <w:rPr>
@@ -3655,7 +3661,7 @@
     <w:p>
       <w:r>
         <w:pict w14:anchorId="14BC56D6">
-          <v:rect id="_x0000_i1332" style="width:0;height:1.5pt" o:hralign="center" o:hrstd="t" o:hr="t" fillcolor="#a0a0a0" stroked="f"/>
+          <v:rect id="_x0000_i1060" style="width:0;height:1.5pt" o:hralign="center" o:hrstd="t" o:hr="t" fillcolor="#a0a0a0" stroked="f"/>
         </w:pict>
       </w:r>
     </w:p>
@@ -3739,7 +3745,7 @@
     <w:p>
       <w:r>
         <w:pict w14:anchorId="185C0CD0">
-          <v:rect id="_x0000_i1333" style="width:0;height:1.5pt" o:hralign="center" o:hrstd="t" o:hr="t" fillcolor="#a0a0a0" stroked="f"/>
+          <v:rect id="_x0000_i1061" style="width:0;height:1.5pt" o:hralign="center" o:hrstd="t" o:hr="t" fillcolor="#a0a0a0" stroked="f"/>
         </w:pict>
       </w:r>
     </w:p>
@@ -3837,7 +3843,7 @@
     <w:p>
       <w:r>
         <w:pict w14:anchorId="1E643C77">
-          <v:rect id="_x0000_i1334" style="width:0;height:1.5pt" o:hralign="center" o:hrstd="t" o:hr="t" fillcolor="#a0a0a0" stroked="f"/>
+          <v:rect id="_x0000_i1062" style="width:0;height:1.5pt" o:hralign="center" o:hrstd="t" o:hr="t" fillcolor="#a0a0a0" stroked="f"/>
         </w:pict>
       </w:r>
     </w:p>
@@ -3879,7 +3885,7 @@
     <w:p>
       <w:r>
         <w:pict w14:anchorId="06705DDA">
-          <v:rect id="_x0000_i1335" style="width:0;height:1.5pt" o:hralign="center" o:hrstd="t" o:hr="t" fillcolor="#a0a0a0" stroked="f"/>
+          <v:rect id="_x0000_i1063" style="width:0;height:1.5pt" o:hralign="center" o:hrstd="t" o:hr="t" fillcolor="#a0a0a0" stroked="f"/>
         </w:pict>
       </w:r>
     </w:p>
@@ -3985,7 +3991,7 @@
     <w:p>
       <w:r>
         <w:pict w14:anchorId="1FCD25A6">
-          <v:rect id="_x0000_i1336" style="width:0;height:1.5pt" o:hralign="center" o:hrstd="t" o:hr="t" fillcolor="#a0a0a0" stroked="f"/>
+          <v:rect id="_x0000_i1064" style="width:0;height:1.5pt" o:hralign="center" o:hrstd="t" o:hr="t" fillcolor="#a0a0a0" stroked="f"/>
         </w:pict>
       </w:r>
     </w:p>
@@ -4028,7 +4034,7 @@
     <w:p>
       <w:r>
         <w:pict w14:anchorId="1C2A26A7">
-          <v:rect id="_x0000_i1337" style="width:0;height:1.5pt" o:hralign="center" o:hrstd="t" o:hr="t" fillcolor="#a0a0a0" stroked="f"/>
+          <v:rect id="_x0000_i1065" style="width:0;height:1.5pt" o:hralign="center" o:hrstd="t" o:hr="t" fillcolor="#a0a0a0" stroked="f"/>
         </w:pict>
       </w:r>
     </w:p>
@@ -4111,7 +4117,7 @@
     <w:p>
       <w:r>
         <w:pict w14:anchorId="181983E0">
-          <v:rect id="_x0000_i1338" style="width:0;height:1.5pt" o:hralign="center" o:hrstd="t" o:hr="t" fillcolor="#a0a0a0" stroked="f"/>
+          <v:rect id="_x0000_i1066" style="width:0;height:1.5pt" o:hralign="center" o:hrstd="t" o:hr="t" fillcolor="#a0a0a0" stroked="f"/>
         </w:pict>
       </w:r>
     </w:p>
@@ -4150,6 +4156,1358 @@
         <w:t>No. Unlike Django, MERN does not provide a built-in admin panel. We need to build the admin dashboard ourselves using React and connect it to Express APIs.</w:t>
       </w:r>
     </w:p>
+    <w:p>
+      <w:pPr>
+        <w:rPr>
+          <w:b/>
+          <w:bCs/>
+        </w:rPr>
+      </w:pPr>
+      <w:r>
+        <w:rPr>
+          <w:b/>
+          <w:bCs/>
+        </w:rPr>
+        <w:t>44. What is React Router?</w:t>
+      </w:r>
+    </w:p>
+    <w:p>
+      <w:pPr>
+        <w:rPr>
+          <w:b/>
+          <w:bCs/>
+        </w:rPr>
+      </w:pPr>
+      <w:r>
+        <w:rPr>
+          <w:b/>
+          <w:bCs/>
+        </w:rPr>
+        <w:t>Answer</w:t>
+      </w:r>
+    </w:p>
+    <w:p>
+      <w:r>
+        <w:t>React Router is a library used for client-side routing in React applications. It allows users to navigate between different pages without reloading the entire webpage.</w:t>
+      </w:r>
+    </w:p>
+    <w:p>
+      <w:r>
+        <w:pict w14:anchorId="2228EB8A">
+          <v:rect id="_x0000_i1067" style="width:0;height:1.5pt" o:hralign="center" o:hrstd="t" o:hr="t" fillcolor="#a0a0a0" stroked="f"/>
+        </w:pict>
+      </w:r>
+    </w:p>
+    <w:p>
+      <w:pPr>
+        <w:rPr>
+          <w:b/>
+          <w:bCs/>
+        </w:rPr>
+      </w:pPr>
+      <w:r>
+        <w:rPr>
+          <w:b/>
+          <w:bCs/>
+        </w:rPr>
+        <w:t xml:space="preserve">45. What is </w:t>
+      </w:r>
+      <w:proofErr w:type="spellStart"/>
+      <w:r>
+        <w:rPr>
+          <w:b/>
+          <w:bCs/>
+        </w:rPr>
+        <w:t>BrowserRouter</w:t>
+      </w:r>
+      <w:proofErr w:type="spellEnd"/>
+      <w:r>
+        <w:rPr>
+          <w:b/>
+          <w:bCs/>
+        </w:rPr>
+        <w:t>?</w:t>
+      </w:r>
+    </w:p>
+    <w:p>
+      <w:pPr>
+        <w:rPr>
+          <w:b/>
+          <w:bCs/>
+        </w:rPr>
+      </w:pPr>
+      <w:r>
+        <w:rPr>
+          <w:b/>
+          <w:bCs/>
+        </w:rPr>
+        <w:t>Answer</w:t>
+      </w:r>
+    </w:p>
+    <w:p>
+      <w:proofErr w:type="spellStart"/>
+      <w:r>
+        <w:lastRenderedPageBreak/>
+        <w:t>BrowserRouter</w:t>
+      </w:r>
+      <w:proofErr w:type="spellEnd"/>
+      <w:r>
+        <w:t xml:space="preserve"> enables routing in a React application. It monitors the browser URL and renders the corresponding page component.</w:t>
+      </w:r>
+    </w:p>
+    <w:p>
+      <w:r>
+        <w:rPr>
+          <w:b/>
+          <w:bCs/>
+        </w:rPr>
+        <w:t>Django Comparison</w:t>
+      </w:r>
+    </w:p>
+    <w:p>
+      <w:proofErr w:type="spellStart"/>
+      <w:r>
+        <w:t>BrowserRouter</w:t>
+      </w:r>
+      <w:proofErr w:type="spellEnd"/>
+      <w:r>
+        <w:t xml:space="preserve"> ↔ urls.py</w:t>
+      </w:r>
+    </w:p>
+    <w:p>
+      <w:r>
+        <w:pict w14:anchorId="16E0D9CA">
+          <v:rect id="_x0000_i1068" style="width:0;height:1.5pt" o:hralign="center" o:hrstd="t" o:hr="t" fillcolor="#a0a0a0" stroked="f"/>
+        </w:pict>
+      </w:r>
+    </w:p>
+    <w:p>
+      <w:pPr>
+        <w:rPr>
+          <w:b/>
+          <w:bCs/>
+        </w:rPr>
+      </w:pPr>
+      <w:r>
+        <w:rPr>
+          <w:b/>
+          <w:bCs/>
+        </w:rPr>
+        <w:t>46. What is the purpose of &lt;Routes&gt; and &lt;Route&gt;?</w:t>
+      </w:r>
+    </w:p>
+    <w:p>
+      <w:pPr>
+        <w:rPr>
+          <w:b/>
+          <w:bCs/>
+        </w:rPr>
+      </w:pPr>
+      <w:r>
+        <w:rPr>
+          <w:b/>
+          <w:bCs/>
+        </w:rPr>
+        <w:t>Answer</w:t>
+      </w:r>
+    </w:p>
+    <w:p>
+      <w:pPr>
+        <w:numPr>
+          <w:ilvl w:val="0"/>
+          <w:numId w:val="9"/>
+        </w:numPr>
+      </w:pPr>
+      <w:r>
+        <w:t xml:space="preserve">&lt;Routes&gt; groups all the application routes. </w:t>
+      </w:r>
+    </w:p>
+    <w:p>
+      <w:pPr>
+        <w:numPr>
+          <w:ilvl w:val="0"/>
+          <w:numId w:val="9"/>
+        </w:numPr>
+      </w:pPr>
+      <w:r>
+        <w:t xml:space="preserve">&lt;Route&gt; maps a URL path to a React component. </w:t>
+      </w:r>
+    </w:p>
+    <w:p>
+      <w:r>
+        <w:rPr>
+          <w:b/>
+          <w:bCs/>
+        </w:rPr>
+        <w:t>Example</w:t>
+      </w:r>
+    </w:p>
+    <w:p>
+      <w:r>
+        <w:t>&lt;Routes&gt;</w:t>
+      </w:r>
+      <w:r>
+        <w:br/>
+        <w:t xml:space="preserve">    &lt;Route path="/" element</w:t>
+      </w:r>
+      <w:proofErr w:type="gramStart"/>
+      <w:r>
+        <w:t>={</w:t>
+      </w:r>
+      <w:proofErr w:type="gramEnd"/>
+      <w:r>
+        <w:t>&lt;Home /&gt;} /&gt;</w:t>
+      </w:r>
+      <w:r>
+        <w:br/>
+        <w:t xml:space="preserve">    &lt;Route path="/login" element</w:t>
+      </w:r>
+      <w:proofErr w:type="gramStart"/>
+      <w:r>
+        <w:t>={</w:t>
+      </w:r>
+      <w:proofErr w:type="gramEnd"/>
+      <w:r>
+        <w:t>&lt;Login /&gt;} /&gt;</w:t>
+      </w:r>
+      <w:r>
+        <w:br/>
+        <w:t>&lt;/Routes&gt;</w:t>
+      </w:r>
+    </w:p>
+    <w:p>
+      <w:r>
+        <w:pict w14:anchorId="4B0FC6E4">
+          <v:rect id="_x0000_i1069" style="width:0;height:1.5pt" o:hralign="center" o:hrstd="t" o:hr="t" fillcolor="#a0a0a0" stroked="f"/>
+        </w:pict>
+      </w:r>
+    </w:p>
+    <w:p>
+      <w:pPr>
+        <w:rPr>
+          <w:b/>
+          <w:bCs/>
+        </w:rPr>
+      </w:pPr>
+      <w:r>
+        <w:rPr>
+          <w:b/>
+          <w:bCs/>
+        </w:rPr>
+        <w:t>47. What is the difference between &lt;Link&gt; and &lt;a&gt;?</w:t>
+      </w:r>
+    </w:p>
+    <w:tbl>
+      <w:tblPr>
+        <w:tblW w:w="0" w:type="auto"/>
+        <w:tblCellSpacing w:w="15" w:type="dxa"/>
+        <w:tblCellMar>
+          <w:top w:w="15" w:type="dxa"/>
+          <w:left w:w="15" w:type="dxa"/>
+          <w:bottom w:w="15" w:type="dxa"/>
+          <w:right w:w="15" w:type="dxa"/>
+        </w:tblCellMar>
+        <w:tblLook w:val="04A0" w:firstRow="1" w:lastRow="0" w:firstColumn="1" w:lastColumn="0" w:noHBand="0" w:noVBand="1"/>
+      </w:tblPr>
+      <w:tblGrid>
+        <w:gridCol w:w="3390"/>
+        <w:gridCol w:w="3808"/>
+      </w:tblGrid>
+      <w:tr>
+        <w:trPr>
+          <w:tblHeader/>
+          <w:tblCellSpacing w:w="15" w:type="dxa"/>
+        </w:trPr>
+        <w:tc>
+          <w:tcPr>
+            <w:tcW w:w="0" w:type="auto"/>
+            <w:vAlign w:val="center"/>
+            <w:hideMark/>
+          </w:tcPr>
+          <w:p>
+            <w:pPr>
+              <w:rPr>
+                <w:b/>
+                <w:bCs/>
+              </w:rPr>
+            </w:pPr>
+            <w:r>
+              <w:rPr>
+                <w:b/>
+                <w:bCs/>
+              </w:rPr>
+              <w:t>&lt;a&gt;</w:t>
+            </w:r>
+          </w:p>
+        </w:tc>
+        <w:tc>
+          <w:tcPr>
+            <w:tcW w:w="0" w:type="auto"/>
+            <w:vAlign w:val="center"/>
+            <w:hideMark/>
+          </w:tcPr>
+          <w:p>
+            <w:pPr>
+              <w:rPr>
+                <w:b/>
+                <w:bCs/>
+              </w:rPr>
+            </w:pPr>
+            <w:r>
+              <w:rPr>
+                <w:b/>
+                <w:bCs/>
+              </w:rPr>
+              <w:t>&lt;Link&gt;</w:t>
+            </w:r>
+          </w:p>
+        </w:tc>
+      </w:tr>
+      <w:tr>
+        <w:trPr>
+          <w:tblCellSpacing w:w="15" w:type="dxa"/>
+        </w:trPr>
+        <w:tc>
+          <w:tcPr>
+            <w:tcW w:w="0" w:type="auto"/>
+            <w:vAlign w:val="center"/>
+            <w:hideMark/>
+          </w:tcPr>
+          <w:p>
+            <w:r>
+              <w:t>Reloads the entire webpage</w:t>
+            </w:r>
+          </w:p>
+        </w:tc>
+        <w:tc>
+          <w:tcPr>
+            <w:tcW w:w="0" w:type="auto"/>
+            <w:vAlign w:val="center"/>
+            <w:hideMark/>
+          </w:tcPr>
+          <w:p>
+            <w:r>
+              <w:t>Changes only the required component</w:t>
+            </w:r>
+          </w:p>
+        </w:tc>
+      </w:tr>
+      <w:tr>
+        <w:trPr>
+          <w:tblCellSpacing w:w="15" w:type="dxa"/>
+        </w:trPr>
+        <w:tc>
+          <w:tcPr>
+            <w:tcW w:w="0" w:type="auto"/>
+            <w:vAlign w:val="center"/>
+            <w:hideMark/>
+          </w:tcPr>
+          <w:p>
+            <w:r>
+              <w:t>Sends a new request to the server</w:t>
+            </w:r>
+          </w:p>
+        </w:tc>
+        <w:tc>
+          <w:tcPr>
+            <w:tcW w:w="0" w:type="auto"/>
+            <w:vAlign w:val="center"/>
+            <w:hideMark/>
+          </w:tcPr>
+          <w:p>
+            <w:r>
+              <w:t>Uses client-side routing</w:t>
+            </w:r>
+          </w:p>
+        </w:tc>
+      </w:tr>
+      <w:tr>
+        <w:trPr>
+          <w:tblCellSpacing w:w="15" w:type="dxa"/>
+        </w:trPr>
+        <w:tc>
+          <w:tcPr>
+            <w:tcW w:w="0" w:type="auto"/>
+            <w:vAlign w:val="center"/>
+            <w:hideMark/>
+          </w:tcPr>
+          <w:p>
+            <w:r>
+              <w:t>Used in HTML</w:t>
+            </w:r>
+          </w:p>
+        </w:tc>
+        <w:tc>
+          <w:tcPr>
+            <w:tcW w:w="0" w:type="auto"/>
+            <w:vAlign w:val="center"/>
+            <w:hideMark/>
+          </w:tcPr>
+          <w:p>
+            <w:r>
+              <w:t>Used in React</w:t>
+            </w:r>
+          </w:p>
+        </w:tc>
+      </w:tr>
+    </w:tbl>
+    <w:p>
+      <w:r>
+        <w:pict w14:anchorId="374DEE9F">
+          <v:rect id="_x0000_i1070" style="width:0;height:1.5pt" o:hralign="center" o:hrstd="t" o:hr="t" fillcolor="#a0a0a0" stroked="f"/>
+        </w:pict>
+      </w:r>
+    </w:p>
+    <w:p>
+      <w:pPr>
+        <w:rPr>
+          <w:b/>
+          <w:bCs/>
+        </w:rPr>
+      </w:pPr>
+      <w:r>
+        <w:rPr>
+          <w:b/>
+          <w:bCs/>
+        </w:rPr>
+        <w:t>48. What is Client-Side Routing?</w:t>
+      </w:r>
+    </w:p>
+    <w:p>
+      <w:pPr>
+        <w:rPr>
+          <w:b/>
+          <w:bCs/>
+        </w:rPr>
+      </w:pPr>
+      <w:r>
+        <w:rPr>
+          <w:b/>
+          <w:bCs/>
+        </w:rPr>
+        <w:t>Answer</w:t>
+      </w:r>
+    </w:p>
+    <w:p>
+      <w:r>
+        <w:t>Client-side routing updates the displayed page by changing React components without refreshing the entire webpage, resulting in faster navigation and a better user experience.</w:t>
+      </w:r>
+    </w:p>
+    <w:p>
+      <w:r>
+        <w:pict w14:anchorId="43C822C7">
+          <v:rect id="_x0000_i1071" style="width:0;height:1.5pt" o:hralign="center" o:hrstd="t" o:hr="t" fillcolor="#a0a0a0" stroked="f"/>
+        </w:pict>
+      </w:r>
+    </w:p>
+    <w:p>
+      <w:pPr>
+        <w:rPr>
+          <w:b/>
+          <w:bCs/>
+        </w:rPr>
+      </w:pPr>
+      <w:r>
+        <w:rPr>
+          <w:b/>
+          <w:bCs/>
+        </w:rPr>
+        <w:t xml:space="preserve">49. What is </w:t>
+      </w:r>
+      <w:proofErr w:type="spellStart"/>
+      <w:r>
+        <w:rPr>
+          <w:b/>
+          <w:bCs/>
+        </w:rPr>
+        <w:t>NavLink</w:t>
+      </w:r>
+      <w:proofErr w:type="spellEnd"/>
+      <w:r>
+        <w:rPr>
+          <w:b/>
+          <w:bCs/>
+        </w:rPr>
+        <w:t>?</w:t>
+      </w:r>
+    </w:p>
+    <w:p>
+      <w:pPr>
+        <w:rPr>
+          <w:b/>
+          <w:bCs/>
+        </w:rPr>
+      </w:pPr>
+      <w:r>
+        <w:rPr>
+          <w:b/>
+          <w:bCs/>
+        </w:rPr>
+        <w:lastRenderedPageBreak/>
+        <w:t>Answer</w:t>
+      </w:r>
+    </w:p>
+    <w:p>
+      <w:proofErr w:type="spellStart"/>
+      <w:r>
+        <w:t>NavLink</w:t>
+      </w:r>
+      <w:proofErr w:type="spellEnd"/>
+      <w:r>
+        <w:t xml:space="preserve"> works like Link but automatically applies an active class to the currently selected route. It is commonly used for navigation menus.</w:t>
+      </w:r>
+    </w:p>
+    <w:p>
+      <w:r>
+        <w:pict w14:anchorId="6FEAFE0A">
+          <v:rect id="_x0000_i1072" style="width:0;height:1.5pt" o:hralign="center" o:hrstd="t" o:hr="t" fillcolor="#a0a0a0" stroked="f"/>
+        </w:pict>
+      </w:r>
+    </w:p>
+    <w:p>
+      <w:pPr>
+        <w:rPr>
+          <w:b/>
+          <w:bCs/>
+        </w:rPr>
+      </w:pPr>
+      <w:r>
+        <w:rPr>
+          <w:b/>
+          <w:bCs/>
+        </w:rPr>
+        <w:t>50. What is a 404 Route?</w:t>
+      </w:r>
+    </w:p>
+    <w:p>
+      <w:pPr>
+        <w:rPr>
+          <w:b/>
+          <w:bCs/>
+        </w:rPr>
+      </w:pPr>
+      <w:r>
+        <w:rPr>
+          <w:b/>
+          <w:bCs/>
+        </w:rPr>
+        <w:t>Answer</w:t>
+      </w:r>
+    </w:p>
+    <w:p>
+      <w:r>
+        <w:t>A 404 route is created using:</w:t>
+      </w:r>
+    </w:p>
+    <w:p>
+      <w:r>
+        <w:t>&lt;Route path="*" element</w:t>
+      </w:r>
+      <w:proofErr w:type="gramStart"/>
+      <w:r>
+        <w:t>={</w:t>
+      </w:r>
+      <w:proofErr w:type="gramEnd"/>
+      <w:r>
+        <w:t>&lt;</w:t>
+      </w:r>
+      <w:proofErr w:type="spellStart"/>
+      <w:r>
+        <w:t>NotFound</w:t>
+      </w:r>
+      <w:proofErr w:type="spellEnd"/>
+      <w:r>
+        <w:t xml:space="preserve"> /&gt;} /&gt;</w:t>
+      </w:r>
+    </w:p>
+    <w:p>
+      <w:r>
+        <w:t>It displays a custom page when the user enters an invalid URL.</w:t>
+      </w:r>
+    </w:p>
+    <w:p>
+      <w:r>
+        <w:pict w14:anchorId="2520A5FE">
+          <v:rect id="_x0000_i1073" style="width:0;height:1.5pt" o:hralign="center" o:hrstd="t" o:hr="t" fillcolor="#a0a0a0" stroked="f"/>
+        </w:pict>
+      </w:r>
+    </w:p>
+    <w:p>
+      <w:pPr>
+        <w:rPr>
+          <w:b/>
+          <w:bCs/>
+        </w:rPr>
+      </w:pPr>
+      <w:r>
+        <w:rPr>
+          <w:b/>
+          <w:bCs/>
+        </w:rPr>
+        <w:t>51. Explain the routing flow in your project.</w:t>
+      </w:r>
+    </w:p>
+    <w:p>
+      <w:pPr>
+        <w:rPr>
+          <w:b/>
+          <w:bCs/>
+        </w:rPr>
+      </w:pPr>
+      <w:r>
+        <w:rPr>
+          <w:b/>
+          <w:bCs/>
+        </w:rPr>
+        <w:t>Answer</w:t>
+      </w:r>
+    </w:p>
+    <w:p>
+      <w:r>
+        <w:t>Browser</w:t>
+      </w:r>
+      <w:r>
+        <w:br/>
+        <w:t xml:space="preserve">      ↓</w:t>
+      </w:r>
+      <w:r>
+        <w:br/>
+      </w:r>
+      <w:proofErr w:type="spellStart"/>
+      <w:r>
+        <w:t>BrowserRouter</w:t>
+      </w:r>
+      <w:proofErr w:type="spellEnd"/>
+      <w:r>
+        <w:br/>
+        <w:t xml:space="preserve">      ↓</w:t>
+      </w:r>
+      <w:r>
+        <w:br/>
+        <w:t>Routes</w:t>
+      </w:r>
+      <w:r>
+        <w:br/>
+        <w:t xml:space="preserve">      ↓</w:t>
+      </w:r>
+      <w:r>
+        <w:br/>
+        <w:t>Matching Route</w:t>
+      </w:r>
+      <w:r>
+        <w:br/>
+        <w:t xml:space="preserve">      ↓</w:t>
+      </w:r>
+      <w:r>
+        <w:br/>
+        <w:t>Component (Home, Login, Cart...)</w:t>
+      </w:r>
+    </w:p>
+    <w:p>
+      <w:r>
+        <w:t>Only the matching page component changes, while the Navbar and Footer remain the same.</w:t>
+      </w:r>
+    </w:p>
+    <w:p>
+      <w:r>
+        <w:pict w14:anchorId="708CCB86">
+          <v:rect id="_x0000_i1074" style="width:0;height:1.5pt" o:hralign="center" o:hrstd="t" o:hr="t" fillcolor="#a0a0a0" stroked="f"/>
+        </w:pict>
+      </w:r>
+    </w:p>
+    <w:p>
+      <w:pPr>
+        <w:rPr>
+          <w:b/>
+          <w:bCs/>
+        </w:rPr>
+      </w:pPr>
+      <w:r>
+        <w:rPr>
+          <w:b/>
+          <w:bCs/>
+        </w:rPr>
+        <w:t xml:space="preserve">52. Explain routing in your </w:t>
+      </w:r>
+      <w:proofErr w:type="spellStart"/>
+      <w:r>
+        <w:rPr>
+          <w:b/>
+          <w:bCs/>
+        </w:rPr>
+        <w:t>FoodHub</w:t>
+      </w:r>
+      <w:proofErr w:type="spellEnd"/>
+      <w:r>
+        <w:rPr>
+          <w:b/>
+          <w:bCs/>
+        </w:rPr>
+        <w:t xml:space="preserve"> project.</w:t>
+      </w:r>
+    </w:p>
+    <w:p>
+      <w:pPr>
+        <w:rPr>
+          <w:b/>
+          <w:bCs/>
+        </w:rPr>
+      </w:pPr>
+      <w:r>
+        <w:rPr>
+          <w:b/>
+          <w:bCs/>
+        </w:rPr>
+        <w:t>Answer</w:t>
+      </w:r>
+    </w:p>
+    <w:p>
+      <w:proofErr w:type="spellStart"/>
+      <w:r>
+        <w:t>FoodHub</w:t>
+      </w:r>
+      <w:proofErr w:type="spellEnd"/>
+      <w:r>
+        <w:t xml:space="preserve"> uses React Router for client-side routing. The application contains routes for Home, Menu, Login, Register, Cart, Orders, and Admin pages. Navigation is handled using Link/</w:t>
+      </w:r>
+      <w:proofErr w:type="spellStart"/>
+      <w:r>
+        <w:t>NavLink</w:t>
+      </w:r>
+      <w:proofErr w:type="spellEnd"/>
+      <w:r>
+        <w:t>, allowing users to move between pages without reloading the website.</w:t>
+      </w:r>
+    </w:p>
+    <w:p>
+      <w:r>
+        <w:pict w14:anchorId="03AD389C">
+          <v:rect id="_x0000_i1075" style="width:0;height:1.5pt" o:hralign="center" o:hrstd="t" o:hr="t" fillcolor="#a0a0a0" stroked="f"/>
+        </w:pict>
+      </w:r>
+    </w:p>
+    <w:p>
+      <w:pPr>
+        <w:rPr>
+          <w:b/>
+          <w:bCs/>
+        </w:rPr>
+      </w:pPr>
+      <w:r>
+        <w:rPr>
+          <w:b/>
+          <w:bCs/>
+        </w:rPr>
+        <w:lastRenderedPageBreak/>
+        <w:t xml:space="preserve">53. Why is Express a dependency and </w:t>
+      </w:r>
+      <w:proofErr w:type="spellStart"/>
+      <w:r>
+        <w:rPr>
+          <w:b/>
+          <w:bCs/>
+        </w:rPr>
+        <w:t>Nodemon</w:t>
+      </w:r>
+      <w:proofErr w:type="spellEnd"/>
+      <w:r>
+        <w:rPr>
+          <w:b/>
+          <w:bCs/>
+        </w:rPr>
+        <w:t xml:space="preserve"> a </w:t>
+      </w:r>
+      <w:proofErr w:type="spellStart"/>
+      <w:r>
+        <w:rPr>
+          <w:b/>
+          <w:bCs/>
+        </w:rPr>
+        <w:t>devDependency</w:t>
+      </w:r>
+      <w:proofErr w:type="spellEnd"/>
+      <w:r>
+        <w:rPr>
+          <w:b/>
+          <w:bCs/>
+        </w:rPr>
+        <w:t>?</w:t>
+      </w:r>
+    </w:p>
+    <w:p>
+      <w:r>
+        <w:rPr>
+          <w:b/>
+          <w:bCs/>
+        </w:rPr>
+        <w:t>Answer</w:t>
+      </w:r>
+    </w:p>
+    <w:p>
+      <w:pPr>
+        <w:numPr>
+          <w:ilvl w:val="0"/>
+          <w:numId w:val="10"/>
+        </w:numPr>
+      </w:pPr>
+      <w:r>
+        <w:rPr>
+          <w:b/>
+          <w:bCs/>
+        </w:rPr>
+        <w:t>Express</w:t>
+      </w:r>
+      <w:r>
+        <w:t xml:space="preserve"> is a dependency because it is required for the application to run in both development and production. </w:t>
+      </w:r>
+    </w:p>
+    <w:p>
+      <w:pPr>
+        <w:numPr>
+          <w:ilvl w:val="0"/>
+          <w:numId w:val="10"/>
+        </w:numPr>
+      </w:pPr>
+      <w:proofErr w:type="spellStart"/>
+      <w:r>
+        <w:rPr>
+          <w:b/>
+          <w:bCs/>
+        </w:rPr>
+        <w:t>Nodemon</w:t>
+      </w:r>
+      <w:proofErr w:type="spellEnd"/>
+      <w:r>
+        <w:t xml:space="preserve"> is a </w:t>
+      </w:r>
+      <w:proofErr w:type="spellStart"/>
+      <w:r>
+        <w:t>devDependency</w:t>
+      </w:r>
+      <w:proofErr w:type="spellEnd"/>
+      <w:r>
+        <w:t xml:space="preserve"> because it is only used during development to automatically restart the server when code changes.</w:t>
+      </w:r>
+    </w:p>
+    <w:p>
+      <w:r>
+        <w:pict w14:anchorId="40D1CC85">
+          <v:rect id="_x0000_i1076" style="width:0;height:1.5pt" o:hralign="center" o:hrstd="t" o:hr="t" fillcolor="#a0a0a0" stroked="f"/>
+        </w:pict>
+      </w:r>
+    </w:p>
+    <w:p>
+      <w:pPr>
+        <w:spacing w:before="100" w:beforeAutospacing="1" w:after="100" w:afterAutospacing="1" w:line="240" w:lineRule="auto"/>
+        <w:outlineLvl w:val="1"/>
+        <w:rPr>
+          <w:rFonts w:eastAsia="Times New Roman" w:cstheme="minorHAnsi"/>
+          <w:b/>
+          <w:bCs/>
+          <w:kern w:val="0"/>
+          <w14:ligatures w14:val="none"/>
+        </w:rPr>
+      </w:pPr>
+      <w:r>
+        <w:rPr>
+          <w:rFonts w:ascii="Times New Roman" w:eastAsia="Times New Roman" w:hAnsi="Times New Roman" w:cs="Times New Roman"/>
+          <w:b/>
+          <w:bCs/>
+          <w:kern w:val="0"/>
+          <w14:ligatures w14:val="none"/>
+        </w:rPr>
+        <w:t xml:space="preserve">54. </w:t>
+      </w:r>
+      <w:r>
+        <w:rPr>
+          <w:rFonts w:eastAsia="Times New Roman" w:cstheme="minorHAnsi"/>
+          <w:b/>
+          <w:bCs/>
+          <w:kern w:val="0"/>
+          <w14:ligatures w14:val="none"/>
+        </w:rPr>
+        <w:t>Why do we use Express instead of Node's HTTP module?</w:t>
+      </w:r>
+    </w:p>
+    <w:p>
+      <w:pPr>
+        <w:spacing w:before="100" w:beforeAutospacing="1" w:after="100" w:afterAutospacing="1" w:line="240" w:lineRule="auto"/>
+        <w:rPr>
+          <w:rFonts w:eastAsia="Times New Roman" w:cstheme="minorHAnsi"/>
+          <w:kern w:val="0"/>
+          <w14:ligatures w14:val="none"/>
+        </w:rPr>
+      </w:pPr>
+      <w:r>
+        <w:rPr>
+          <w:rFonts w:eastAsia="Times New Roman" w:cstheme="minorHAnsi"/>
+          <w:b/>
+          <w:bCs/>
+          <w:kern w:val="0"/>
+          <w14:ligatures w14:val="none"/>
+        </w:rPr>
+        <w:t>Answer</w:t>
+      </w:r>
+    </w:p>
+    <w:p>
+      <w:pPr>
+        <w:pStyle w:val="ListParagraph"/>
+        <w:numPr>
+          <w:ilvl w:val="0"/>
+          <w:numId w:val="10"/>
+        </w:numPr>
+        <w:spacing w:before="100" w:beforeAutospacing="1" w:after="100" w:afterAutospacing="1" w:line="240" w:lineRule="auto"/>
+        <w:rPr>
+          <w:rFonts w:eastAsia="Times New Roman" w:cstheme="minorHAnsi"/>
+          <w:kern w:val="0"/>
+          <w14:ligatures w14:val="none"/>
+        </w:rPr>
+      </w:pPr>
+      <w:r>
+        <w:rPr>
+          <w:rFonts w:eastAsia="Times New Roman" w:cstheme="minorHAnsi"/>
+          <w:kern w:val="0"/>
+          <w14:ligatures w14:val="none"/>
+        </w:rPr>
+        <w:t xml:space="preserve">Node.js provides the built-in </w:t>
+      </w:r>
+      <w:r>
+        <w:rPr>
+          <w:rFonts w:eastAsia="Times New Roman" w:cstheme="minorHAnsi"/>
+          <w:kern w:val="0"/>
+          <w:sz w:val="20"/>
+          <w:szCs w:val="20"/>
+          <w14:ligatures w14:val="none"/>
+        </w:rPr>
+        <w:t>http</w:t>
+      </w:r>
+      <w:r>
+        <w:rPr>
+          <w:rFonts w:eastAsia="Times New Roman" w:cstheme="minorHAnsi"/>
+          <w:kern w:val="0"/>
+          <w14:ligatures w14:val="none"/>
+        </w:rPr>
+        <w:t xml:space="preserve"> module to create web servers, but writing routes and request handling manually becomes complex. Express simplifies backend development by providing routing, middleware, request handling, and other features, making development faster and more organized.</w:t>
+      </w:r>
+    </w:p>
+    <w:p>
+      <w:pPr>
+        <w:spacing w:before="100" w:beforeAutospacing="1" w:after="100" w:afterAutospacing="1" w:line="240" w:lineRule="auto"/>
+        <w:rPr>
+          <w:rFonts w:eastAsia="Times New Roman" w:cstheme="minorHAnsi"/>
+          <w:kern w:val="0"/>
+          <w14:ligatures w14:val="none"/>
+        </w:rPr>
+      </w:pPr>
+      <w:r>
+        <w:pict w14:anchorId="2A447628">
+          <v:rect id="_x0000_i1077" style="width:0;height:1.5pt" o:hralign="center" o:hrstd="t" o:hr="t" fillcolor="#a0a0a0" stroked="f"/>
+        </w:pict>
+      </w:r>
+    </w:p>
+    <w:p>
+      <w:pPr>
+        <w:spacing w:before="100" w:beforeAutospacing="1" w:after="100" w:afterAutospacing="1" w:line="240" w:lineRule="auto"/>
+        <w:rPr>
+          <w:rFonts w:eastAsia="Times New Roman" w:cstheme="minorHAnsi"/>
+          <w:b/>
+          <w:bCs/>
+          <w:kern w:val="0"/>
+          <w14:ligatures w14:val="none"/>
+        </w:rPr>
+      </w:pPr>
+      <w:r>
+        <w:rPr>
+          <w:rFonts w:eastAsia="Times New Roman" w:cstheme="minorHAnsi"/>
+          <w:b/>
+          <w:bCs/>
+          <w:kern w:val="0"/>
+          <w14:ligatures w14:val="none"/>
+        </w:rPr>
+        <w:t xml:space="preserve">Q55. Why do we use </w:t>
+      </w:r>
+      <w:proofErr w:type="spellStart"/>
+      <w:proofErr w:type="gramStart"/>
+      <w:r>
+        <w:rPr>
+          <w:rFonts w:eastAsia="Times New Roman" w:cstheme="minorHAnsi"/>
+          <w:b/>
+          <w:bCs/>
+          <w:kern w:val="0"/>
+          <w14:ligatures w14:val="none"/>
+        </w:rPr>
+        <w:t>app.use</w:t>
+      </w:r>
+      <w:proofErr w:type="spellEnd"/>
+      <w:r>
+        <w:rPr>
+          <w:rFonts w:eastAsia="Times New Roman" w:cstheme="minorHAnsi"/>
+          <w:b/>
+          <w:bCs/>
+          <w:kern w:val="0"/>
+          <w14:ligatures w14:val="none"/>
+        </w:rPr>
+        <w:t>(</w:t>
+      </w:r>
+      <w:proofErr w:type="gramEnd"/>
+      <w:r>
+        <w:rPr>
+          <w:rFonts w:eastAsia="Times New Roman" w:cstheme="minorHAnsi"/>
+          <w:b/>
+          <w:bCs/>
+          <w:kern w:val="0"/>
+          <w14:ligatures w14:val="none"/>
+        </w:rPr>
+        <w:t xml:space="preserve">) with </w:t>
+      </w:r>
+      <w:proofErr w:type="spellStart"/>
+      <w:proofErr w:type="gramStart"/>
+      <w:r>
+        <w:rPr>
+          <w:rFonts w:eastAsia="Times New Roman" w:cstheme="minorHAnsi"/>
+          <w:b/>
+          <w:bCs/>
+          <w:kern w:val="0"/>
+          <w14:ligatures w14:val="none"/>
+        </w:rPr>
+        <w:t>express.Router</w:t>
+      </w:r>
+      <w:proofErr w:type="spellEnd"/>
+      <w:proofErr w:type="gramEnd"/>
+      <w:r>
+        <w:rPr>
+          <w:rFonts w:eastAsia="Times New Roman" w:cstheme="minorHAnsi"/>
+          <w:b/>
+          <w:bCs/>
+          <w:kern w:val="0"/>
+          <w14:ligatures w14:val="none"/>
+        </w:rPr>
+        <w:t>()?</w:t>
+      </w:r>
+    </w:p>
+    <w:p>
+      <w:pPr>
+        <w:spacing w:before="100" w:beforeAutospacing="1" w:after="100" w:afterAutospacing="1" w:line="240" w:lineRule="auto"/>
+        <w:rPr>
+          <w:rFonts w:eastAsia="Times New Roman" w:cstheme="minorHAnsi"/>
+          <w:kern w:val="0"/>
+          <w14:ligatures w14:val="none"/>
+        </w:rPr>
+      </w:pPr>
+      <w:r>
+        <w:rPr>
+          <w:rFonts w:eastAsia="Times New Roman" w:cstheme="minorHAnsi"/>
+          <w:b/>
+          <w:bCs/>
+          <w:kern w:val="0"/>
+          <w14:ligatures w14:val="none"/>
+        </w:rPr>
+        <w:t>Answer</w:t>
+      </w:r>
+    </w:p>
+    <w:p>
+      <w:pPr>
+        <w:spacing w:before="100" w:beforeAutospacing="1" w:after="100" w:afterAutospacing="1" w:line="240" w:lineRule="auto"/>
+        <w:rPr>
+          <w:rFonts w:eastAsia="Times New Roman" w:cstheme="minorHAnsi"/>
+          <w:kern w:val="0"/>
+          <w14:ligatures w14:val="none"/>
+        </w:rPr>
+      </w:pPr>
+      <w:proofErr w:type="spellStart"/>
+      <w:proofErr w:type="gramStart"/>
+      <w:r>
+        <w:rPr>
+          <w:rFonts w:eastAsia="Times New Roman" w:cstheme="minorHAnsi"/>
+          <w:kern w:val="0"/>
+          <w14:ligatures w14:val="none"/>
+        </w:rPr>
+        <w:t>app.use</w:t>
+      </w:r>
+      <w:proofErr w:type="spellEnd"/>
+      <w:r>
+        <w:rPr>
+          <w:rFonts w:eastAsia="Times New Roman" w:cstheme="minorHAnsi"/>
+          <w:kern w:val="0"/>
+          <w14:ligatures w14:val="none"/>
+        </w:rPr>
+        <w:t>(</w:t>
+      </w:r>
+      <w:proofErr w:type="gramEnd"/>
+      <w:r>
+        <w:rPr>
+          <w:rFonts w:eastAsia="Times New Roman" w:cstheme="minorHAnsi"/>
+          <w:kern w:val="0"/>
+          <w14:ligatures w14:val="none"/>
+        </w:rPr>
+        <w:t xml:space="preserve">) is used to mount a group of related routes under a common base path. Inside the route file, </w:t>
+      </w:r>
+      <w:proofErr w:type="spellStart"/>
+      <w:proofErr w:type="gramStart"/>
+      <w:r>
+        <w:rPr>
+          <w:rFonts w:eastAsia="Times New Roman" w:cstheme="minorHAnsi"/>
+          <w:kern w:val="0"/>
+          <w14:ligatures w14:val="none"/>
+        </w:rPr>
+        <w:t>express.Router</w:t>
+      </w:r>
+      <w:proofErr w:type="spellEnd"/>
+      <w:proofErr w:type="gramEnd"/>
+      <w:r>
+        <w:rPr>
+          <w:rFonts w:eastAsia="Times New Roman" w:cstheme="minorHAnsi"/>
+          <w:kern w:val="0"/>
+          <w14:ligatures w14:val="none"/>
+        </w:rPr>
+        <w:t>() defines only the remaining part of the URL, making the project modular and easier to maintain.</w:t>
+      </w:r>
+    </w:p>
+    <w:p>
+      <w:pPr>
+        <w:spacing w:before="100" w:beforeAutospacing="1" w:after="100" w:afterAutospacing="1" w:line="240" w:lineRule="auto"/>
+      </w:pPr>
+      <w:r>
+        <w:pict w14:anchorId="300D3313">
+          <v:rect id="_x0000_i1078" style="width:0;height:1.5pt" o:hralign="center" o:hrstd="t" o:hr="t" fillcolor="#a0a0a0" stroked="f"/>
+        </w:pict>
+      </w:r>
+    </w:p>
+    <w:p>
+      <w:pPr>
+        <w:spacing w:before="100" w:beforeAutospacing="1" w:after="100" w:afterAutospacing="1" w:line="240" w:lineRule="auto"/>
+        <w:rPr>
+          <w:rFonts w:eastAsia="Times New Roman" w:cstheme="minorHAnsi"/>
+          <w:b/>
+          <w:bCs/>
+          <w:kern w:val="0"/>
+          <w14:ligatures w14:val="none"/>
+        </w:rPr>
+      </w:pPr>
+      <w:r>
+        <w:rPr>
+          <w:rFonts w:eastAsia="Times New Roman" w:cstheme="minorHAnsi"/>
+          <w:b/>
+          <w:bCs/>
+          <w:kern w:val="0"/>
+          <w14:ligatures w14:val="none"/>
+        </w:rPr>
+        <w:t>Q56. Why do we separate Routes and Controllers?</w:t>
+      </w:r>
+    </w:p>
+    <w:p>
+      <w:pPr>
+        <w:spacing w:before="100" w:beforeAutospacing="1" w:after="100" w:afterAutospacing="1" w:line="240" w:lineRule="auto"/>
+        <w:rPr>
+          <w:rFonts w:eastAsia="Times New Roman" w:cstheme="minorHAnsi"/>
+          <w:kern w:val="0"/>
+          <w14:ligatures w14:val="none"/>
+        </w:rPr>
+      </w:pPr>
+      <w:r>
+        <w:rPr>
+          <w:rFonts w:eastAsia="Times New Roman" w:cstheme="minorHAnsi"/>
+          <w:b/>
+          <w:bCs/>
+          <w:kern w:val="0"/>
+          <w14:ligatures w14:val="none"/>
+        </w:rPr>
+        <w:t>Answer</w:t>
+      </w:r>
+    </w:p>
+    <w:p>
+      <w:pPr>
+        <w:spacing w:before="100" w:beforeAutospacing="1" w:after="100" w:afterAutospacing="1" w:line="240" w:lineRule="auto"/>
+        <w:rPr>
+          <w:rFonts w:eastAsia="Times New Roman" w:cstheme="minorHAnsi"/>
+          <w:kern w:val="0"/>
+          <w14:ligatures w14:val="none"/>
+        </w:rPr>
+      </w:pPr>
+      <w:r>
+        <w:rPr>
+          <w:rFonts w:eastAsia="Times New Roman" w:cstheme="minorHAnsi"/>
+          <w:kern w:val="0"/>
+          <w14:ligatures w14:val="none"/>
+        </w:rPr>
+        <w:t>Routes define the API endpoints, while controllers contain the business logic. This separation keeps the code modular, easier to maintain, and easier to test.</w:t>
+      </w:r>
+    </w:p>
+    <w:p>
+      <w:pPr>
+        <w:spacing w:before="100" w:beforeAutospacing="1" w:after="100" w:afterAutospacing="1" w:line="240" w:lineRule="auto"/>
+        <w:rPr>
+          <w:rFonts w:eastAsia="Times New Roman" w:cstheme="minorHAnsi"/>
+          <w:kern w:val="0"/>
+          <w14:ligatures w14:val="none"/>
+        </w:rPr>
+      </w:pPr>
+      <w:r>
+        <w:pict w14:anchorId="052CF62C">
+          <v:rect id="_x0000_i1079" style="width:0;height:1.5pt" o:hralign="center" o:hrstd="t" o:hr="t" fillcolor="#a0a0a0" stroked="f"/>
+        </w:pict>
+      </w:r>
+    </w:p>
+    <w:p>
+      <w:pPr>
+        <w:spacing w:before="100" w:beforeAutospacing="1" w:after="100" w:afterAutospacing="1" w:line="240" w:lineRule="auto"/>
+        <w:rPr>
+          <w:rFonts w:eastAsia="Times New Roman" w:cstheme="minorHAnsi"/>
+          <w:b/>
+          <w:bCs/>
+          <w:kern w:val="0"/>
+          <w14:ligatures w14:val="none"/>
+        </w:rPr>
+      </w:pPr>
+    </w:p>
+    <w:p>
+      <w:pPr>
+        <w:spacing w:before="100" w:beforeAutospacing="1" w:after="100" w:afterAutospacing="1" w:line="240" w:lineRule="auto"/>
+        <w:rPr>
+          <w:rFonts w:eastAsia="Times New Roman" w:cstheme="minorHAnsi"/>
+          <w:b/>
+          <w:bCs/>
+          <w:kern w:val="0"/>
+          <w14:ligatures w14:val="none"/>
+        </w:rPr>
+      </w:pPr>
+    </w:p>
+    <w:p>
+      <w:pPr>
+        <w:spacing w:before="100" w:beforeAutospacing="1" w:after="100" w:afterAutospacing="1" w:line="240" w:lineRule="auto"/>
+        <w:rPr>
+          <w:rFonts w:eastAsia="Times New Roman" w:cstheme="minorHAnsi"/>
+          <w:b/>
+          <w:bCs/>
+          <w:kern w:val="0"/>
+          <w14:ligatures w14:val="none"/>
+        </w:rPr>
+      </w:pPr>
+      <w:r>
+        <w:rPr>
+          <w:rFonts w:eastAsia="Times New Roman" w:cstheme="minorHAnsi"/>
+          <w:b/>
+          <w:bCs/>
+          <w:kern w:val="0"/>
+          <w14:ligatures w14:val="none"/>
+        </w:rPr>
+        <w:lastRenderedPageBreak/>
+        <w:t>Q</w:t>
+      </w:r>
+      <w:r>
+        <w:rPr>
+          <w:rFonts w:eastAsia="Times New Roman" w:cstheme="minorHAnsi"/>
+          <w:b/>
+          <w:bCs/>
+          <w:kern w:val="0"/>
+          <w14:ligatures w14:val="none"/>
+        </w:rPr>
+        <w:t xml:space="preserve">57. What is </w:t>
+      </w:r>
+      <w:proofErr w:type="spellStart"/>
+      <w:proofErr w:type="gramStart"/>
+      <w:r>
+        <w:rPr>
+          <w:rFonts w:eastAsia="Times New Roman" w:cstheme="minorHAnsi"/>
+          <w:b/>
+          <w:bCs/>
+          <w:kern w:val="0"/>
+          <w14:ligatures w14:val="none"/>
+        </w:rPr>
+        <w:t>req.params</w:t>
+      </w:r>
+      <w:proofErr w:type="spellEnd"/>
+      <w:proofErr w:type="gramEnd"/>
+      <w:r>
+        <w:rPr>
+          <w:rFonts w:eastAsia="Times New Roman" w:cstheme="minorHAnsi"/>
+          <w:b/>
+          <w:bCs/>
+          <w:kern w:val="0"/>
+          <w14:ligatures w14:val="none"/>
+        </w:rPr>
+        <w:t>?</w:t>
+      </w:r>
+    </w:p>
+    <w:p>
+      <w:pPr>
+        <w:spacing w:before="100" w:beforeAutospacing="1" w:after="100" w:afterAutospacing="1" w:line="240" w:lineRule="auto"/>
+        <w:rPr>
+          <w:rFonts w:eastAsia="Times New Roman" w:cstheme="minorHAnsi"/>
+          <w:kern w:val="0"/>
+          <w14:ligatures w14:val="none"/>
+        </w:rPr>
+      </w:pPr>
+      <w:r>
+        <w:rPr>
+          <w:rFonts w:eastAsia="Times New Roman" w:cstheme="minorHAnsi"/>
+          <w:b/>
+          <w:bCs/>
+          <w:kern w:val="0"/>
+          <w14:ligatures w14:val="none"/>
+        </w:rPr>
+        <w:t>Answer:</w:t>
+      </w:r>
+    </w:p>
+    <w:p>
+      <w:pPr>
+        <w:spacing w:before="100" w:beforeAutospacing="1" w:after="100" w:afterAutospacing="1" w:line="240" w:lineRule="auto"/>
+        <w:rPr>
+          <w:rFonts w:eastAsia="Times New Roman" w:cstheme="minorHAnsi"/>
+          <w:kern w:val="0"/>
+          <w14:ligatures w14:val="none"/>
+        </w:rPr>
+      </w:pPr>
+      <w:proofErr w:type="spellStart"/>
+      <w:proofErr w:type="gramStart"/>
+      <w:r>
+        <w:rPr>
+          <w:rFonts w:eastAsia="Times New Roman" w:cstheme="minorHAnsi"/>
+          <w:kern w:val="0"/>
+          <w14:ligatures w14:val="none"/>
+        </w:rPr>
+        <w:t>req.params</w:t>
+      </w:r>
+      <w:proofErr w:type="spellEnd"/>
+      <w:proofErr w:type="gramEnd"/>
+      <w:r>
+        <w:rPr>
+          <w:rFonts w:eastAsia="Times New Roman" w:cstheme="minorHAnsi"/>
+          <w:kern w:val="0"/>
+          <w14:ligatures w14:val="none"/>
+        </w:rPr>
+        <w:t xml:space="preserve"> is an object that contains the values of route parameters from the URL. It is commonly used to access dynamic values such as IDs.</w:t>
+      </w:r>
+    </w:p>
+    <w:p>
+      <w:pPr>
+        <w:spacing w:before="100" w:beforeAutospacing="1" w:after="100" w:afterAutospacing="1" w:line="240" w:lineRule="auto"/>
+        <w:rPr>
+          <w:rFonts w:eastAsia="Times New Roman" w:cstheme="minorHAnsi"/>
+          <w:kern w:val="0"/>
+          <w14:ligatures w14:val="none"/>
+        </w:rPr>
+      </w:pPr>
+    </w:p>
+    <w:p>
+      <w:pPr>
+        <w:spacing w:before="100" w:beforeAutospacing="1" w:after="100" w:afterAutospacing="1" w:line="240" w:lineRule="auto"/>
+        <w:rPr>
+          <w:rFonts w:eastAsia="Times New Roman" w:cstheme="minorHAnsi"/>
+          <w:kern w:val="0"/>
+          <w14:ligatures w14:val="none"/>
+        </w:rPr>
+      </w:pPr>
+    </w:p>
+    <w:p>
+      <w:pPr>
+        <w:rPr>
+          <w:rFonts w:cstheme="minorHAnsi"/>
+        </w:rPr>
+      </w:pPr>
+    </w:p>
+    <w:p/>
+    <w:p/>
     <w:p/>
     <w:p/>
     <w:sectPr>
@@ -4165,6 +5523,155 @@
 <file path=word/numbering.xml><?xml version="1.0" encoding="utf-8"?>
 <w:numbering xmlns:wpc="http://schemas.microsoft.com/office/word/2010/wordprocessingCanvas" xmlns:cx="http://schemas.microsoft.com/office/drawing/2014/chartex" xmlns:cx1="http://schemas.microsoft.com/office/drawing/2015/9/8/chartex" xmlns:cx2="http://schemas.microsoft.com/office/drawing/2015/10/21/chartex" xmlns:cx3="http://schemas.microsoft.com/office/drawing/2016/5/9/chartex" xmlns:cx4="http://schemas.microsoft.com/office/drawing/2016/5/10/chartex" xmlns:cx5="http://schemas.microsoft.com/office/drawing/2016/5/11/chartex" xmlns:cx6="http://schemas.microsoft.com/office/drawing/2016/5/12/chartex" xmlns:cx7="http://schemas.microsoft.com/office/drawing/2016/5/13/chartex" xmlns:cx8="http://schemas.microsoft.com/office/drawing/2016/5/14/chartex" xmlns:mc="http://schemas.openxmlformats.org/markup-compatibility/2006" xmlns:aink="http://schemas.microsoft.com/office/drawing/2016/ink" xmlns:am3d="http://schemas.microsoft.com/office/drawing/2017/model3d" xmlns:o="urn:schemas-microsoft-com:office:office" xmlns:oel="http://schemas.microsoft.com/office/2019/extlst" xmlns:r="http://schemas.openxmlformats.org/officeDocument/2006/relationships" xmlns:m="http://schemas.openxmlformats.org/officeDocument/2006/math" xmlns:v="urn:schemas-microsoft-com:vml" xmlns:wp14="http://schemas.microsoft.com/office/word/2010/wordprocessingDrawing" xmlns:wp="http://schemas.openxmlformats.org/drawingml/2006/wordprocessingDrawing" xmlns:w10="urn:schemas-microsoft-com:office:word" xmlns:w="http://schemas.openxmlformats.org/wordprocessingml/2006/main" xmlns:w14="http://schemas.microsoft.com/office/word/2010/wordml" xmlns:w15="http://schemas.microsoft.com/office/word/2012/wordml" xmlns:w16cex="http://schemas.microsoft.com/office/word/2018/wordml/cex" xmlns:w16cid="http://schemas.microsoft.com/office/word/2016/wordml/cid" xmlns:w16="http://schemas.microsoft.com/office/word/2018/wordml" xmlns:w16du="http://schemas.microsoft.com/office/word/2023/wordml/word16du" xmlns:w16sdtdh="http://schemas.microsoft.com/office/word/2020/wordml/sdtdatahash" xmlns:w16sdtfl="http://schemas.microsoft.com/office/word/2024/wordml/sdtformatlock" xmlns:w16se="http://schemas.microsoft.com/office/word/2015/wordml/symex" xmlns:wpg="http://schemas.microsoft.com/office/word/2010/wordprocessingGroup" xmlns:wpi="http://schemas.microsoft.com/office/word/2010/wordprocessingInk" xmlns:wne="http://schemas.microsoft.com/office/word/2006/wordml" xmlns:wps="http://schemas.microsoft.com/office/word/2010/wordprocessingShape" mc:Ignorable="w14 w15 w16se w16cid w16 w16cex w16sdtdh w16sdtfl w16du wp14">
   <w:abstractNum w:abstractNumId="0" w15:restartNumberingAfterBreak="0">
+    <w:nsid w:val="14C32C3C"/>
+    <w:multiLevelType w:val="multilevel"/>
+    <w:tmpl w:val="74960048"/>
+    <w:lvl w:ilvl="0">
+      <w:start w:val="1"/>
+      <w:numFmt w:val="bullet"/>
+      <w:lvlText w:val=""/>
+      <w:lvlJc w:val="left"/>
+      <w:pPr>
+        <w:tabs>
+          <w:tab w:val="num" w:pos="720"/>
+        </w:tabs>
+        <w:ind w:left="720" w:hanging="360"/>
+      </w:pPr>
+      <w:rPr>
+        <w:rFonts w:ascii="Symbol" w:hAnsi="Symbol" w:hint="default"/>
+        <w:sz w:val="20"/>
+      </w:rPr>
+    </w:lvl>
+    <w:lvl w:ilvl="1" w:tentative="1">
+      <w:start w:val="1"/>
+      <w:numFmt w:val="bullet"/>
+      <w:lvlText w:val="o"/>
+      <w:lvlJc w:val="left"/>
+      <w:pPr>
+        <w:tabs>
+          <w:tab w:val="num" w:pos="1440"/>
+        </w:tabs>
+        <w:ind w:left="1440" w:hanging="360"/>
+      </w:pPr>
+      <w:rPr>
+        <w:rFonts w:ascii="Courier New" w:hAnsi="Courier New" w:hint="default"/>
+        <w:sz w:val="20"/>
+      </w:rPr>
+    </w:lvl>
+    <w:lvl w:ilvl="2" w:tentative="1">
+      <w:start w:val="1"/>
+      <w:numFmt w:val="bullet"/>
+      <w:lvlText w:val=""/>
+      <w:lvlJc w:val="left"/>
+      <w:pPr>
+        <w:tabs>
+          <w:tab w:val="num" w:pos="2160"/>
+        </w:tabs>
+        <w:ind w:left="2160" w:hanging="360"/>
+      </w:pPr>
+      <w:rPr>
+        <w:rFonts w:ascii="Wingdings" w:hAnsi="Wingdings" w:hint="default"/>
+        <w:sz w:val="20"/>
+      </w:rPr>
+    </w:lvl>
+    <w:lvl w:ilvl="3" w:tentative="1">
+      <w:start w:val="1"/>
+      <w:numFmt w:val="bullet"/>
+      <w:lvlText w:val=""/>
+      <w:lvlJc w:val="left"/>
+      <w:pPr>
+        <w:tabs>
+          <w:tab w:val="num" w:pos="2880"/>
+        </w:tabs>
+        <w:ind w:left="2880" w:hanging="360"/>
+      </w:pPr>
+      <w:rPr>
+        <w:rFonts w:ascii="Wingdings" w:hAnsi="Wingdings" w:hint="default"/>
+        <w:sz w:val="20"/>
+      </w:rPr>
+    </w:lvl>
+    <w:lvl w:ilvl="4" w:tentative="1">
+      <w:start w:val="1"/>
+      <w:numFmt w:val="bullet"/>
+      <w:lvlText w:val=""/>
+      <w:lvlJc w:val="left"/>
+      <w:pPr>
+        <w:tabs>
+          <w:tab w:val="num" w:pos="3600"/>
+        </w:tabs>
+        <w:ind w:left="3600" w:hanging="360"/>
+      </w:pPr>
+      <w:rPr>
+        <w:rFonts w:ascii="Wingdings" w:hAnsi="Wingdings" w:hint="default"/>
+        <w:sz w:val="20"/>
+      </w:rPr>
+    </w:lvl>
+    <w:lvl w:ilvl="5" w:tentative="1">
+      <w:start w:val="1"/>
+      <w:numFmt w:val="bullet"/>
+      <w:lvlText w:val=""/>
+      <w:lvlJc w:val="left"/>
+      <w:pPr>
+        <w:tabs>
+          <w:tab w:val="num" w:pos="4320"/>
+        </w:tabs>
+        <w:ind w:left="4320" w:hanging="360"/>
+      </w:pPr>
+      <w:rPr>
+        <w:rFonts w:ascii="Wingdings" w:hAnsi="Wingdings" w:hint="default"/>
+        <w:sz w:val="20"/>
+      </w:rPr>
+    </w:lvl>
+    <w:lvl w:ilvl="6" w:tentative="1">
+      <w:start w:val="1"/>
+      <w:numFmt w:val="bullet"/>
+      <w:lvlText w:val=""/>
+      <w:lvlJc w:val="left"/>
+      <w:pPr>
+        <w:tabs>
+          <w:tab w:val="num" w:pos="5040"/>
+        </w:tabs>
+        <w:ind w:left="5040" w:hanging="360"/>
+      </w:pPr>
+      <w:rPr>
+        <w:rFonts w:ascii="Wingdings" w:hAnsi="Wingdings" w:hint="default"/>
+        <w:sz w:val="20"/>
+      </w:rPr>
+    </w:lvl>
+    <w:lvl w:ilvl="7" w:tentative="1">
+      <w:start w:val="1"/>
+      <w:numFmt w:val="bullet"/>
+      <w:lvlText w:val=""/>
+      <w:lvlJc w:val="left"/>
+      <w:pPr>
+        <w:tabs>
+          <w:tab w:val="num" w:pos="5760"/>
+        </w:tabs>
+        <w:ind w:left="5760" w:hanging="360"/>
+      </w:pPr>
+      <w:rPr>
+        <w:rFonts w:ascii="Wingdings" w:hAnsi="Wingdings" w:hint="default"/>
+        <w:sz w:val="20"/>
+      </w:rPr>
+    </w:lvl>
+    <w:lvl w:ilvl="8" w:tentative="1">
+      <w:start w:val="1"/>
+      <w:numFmt w:val="bullet"/>
+      <w:lvlText w:val=""/>
+      <w:lvlJc w:val="left"/>
+      <w:pPr>
+        <w:tabs>
+          <w:tab w:val="num" w:pos="6480"/>
+        </w:tabs>
+        <w:ind w:left="6480" w:hanging="360"/>
+      </w:pPr>
+      <w:rPr>
+        <w:rFonts w:ascii="Wingdings" w:hAnsi="Wingdings" w:hint="default"/>
+        <w:sz w:val="20"/>
+      </w:rPr>
+    </w:lvl>
+  </w:abstractNum>
+  <w:abstractNum w:abstractNumId="1" w15:restartNumberingAfterBreak="0">
     <w:nsid w:val="1AC77633"/>
     <w:multiLevelType w:val="multilevel"/>
     <w:tmpl w:val="B58AF6A2"/>
@@ -4313,7 +5820,7 @@
       </w:rPr>
     </w:lvl>
   </w:abstractNum>
-  <w:abstractNum w:abstractNumId="1" w15:restartNumberingAfterBreak="0">
+  <w:abstractNum w:abstractNumId="2" w15:restartNumberingAfterBreak="0">
     <w:nsid w:val="2EE24D80"/>
     <w:multiLevelType w:val="multilevel"/>
     <w:tmpl w:val="D9E604E4"/>
@@ -4462,7 +5969,7 @@
       </w:rPr>
     </w:lvl>
   </w:abstractNum>
-  <w:abstractNum w:abstractNumId="2" w15:restartNumberingAfterBreak="0">
+  <w:abstractNum w:abstractNumId="3" w15:restartNumberingAfterBreak="0">
     <w:nsid w:val="303D4589"/>
     <w:multiLevelType w:val="multilevel"/>
     <w:tmpl w:val="AFC222B6"/>
@@ -4611,7 +6118,7 @@
       </w:rPr>
     </w:lvl>
   </w:abstractNum>
-  <w:abstractNum w:abstractNumId="3" w15:restartNumberingAfterBreak="0">
+  <w:abstractNum w:abstractNumId="4" w15:restartNumberingAfterBreak="0">
     <w:nsid w:val="311D54C7"/>
     <w:multiLevelType w:val="multilevel"/>
     <w:tmpl w:val="39ACC3B6"/>
@@ -4760,7 +6267,7 @@
       </w:rPr>
     </w:lvl>
   </w:abstractNum>
-  <w:abstractNum w:abstractNumId="4" w15:restartNumberingAfterBreak="0">
+  <w:abstractNum w:abstractNumId="5" w15:restartNumberingAfterBreak="0">
     <w:nsid w:val="36A92518"/>
     <w:multiLevelType w:val="multilevel"/>
     <w:tmpl w:val="9448F632"/>
@@ -4909,7 +6416,7 @@
       </w:rPr>
     </w:lvl>
   </w:abstractNum>
-  <w:abstractNum w:abstractNumId="5" w15:restartNumberingAfterBreak="0">
+  <w:abstractNum w:abstractNumId="6" w15:restartNumberingAfterBreak="0">
     <w:nsid w:val="43793A10"/>
     <w:multiLevelType w:val="multilevel"/>
     <w:tmpl w:val="92369CD6"/>
@@ -5058,7 +6565,7 @@
       </w:rPr>
     </w:lvl>
   </w:abstractNum>
-  <w:abstractNum w:abstractNumId="6" w15:restartNumberingAfterBreak="0">
+  <w:abstractNum w:abstractNumId="7" w15:restartNumberingAfterBreak="0">
     <w:nsid w:val="492A126F"/>
     <w:multiLevelType w:val="multilevel"/>
     <w:tmpl w:val="E444C0AA"/>
@@ -5207,7 +6714,7 @@
       </w:rPr>
     </w:lvl>
   </w:abstractNum>
-  <w:abstractNum w:abstractNumId="7" w15:restartNumberingAfterBreak="0">
+  <w:abstractNum w:abstractNumId="8" w15:restartNumberingAfterBreak="0">
     <w:nsid w:val="623C56AC"/>
     <w:multiLevelType w:val="multilevel"/>
     <w:tmpl w:val="90B05342"/>
@@ -5356,29 +6863,184 @@
       </w:rPr>
     </w:lvl>
   </w:abstractNum>
+  <w:abstractNum w:abstractNumId="9" w15:restartNumberingAfterBreak="0">
+    <w:nsid w:val="6F5E2C4C"/>
+    <w:multiLevelType w:val="multilevel"/>
+    <w:tmpl w:val="13AE5D70"/>
+    <w:lvl w:ilvl="0">
+      <w:start w:val="1"/>
+      <w:numFmt w:val="bullet"/>
+      <w:lvlText w:val=""/>
+      <w:lvlJc w:val="left"/>
+      <w:pPr>
+        <w:tabs>
+          <w:tab w:val="num" w:pos="720"/>
+        </w:tabs>
+        <w:ind w:left="720" w:hanging="360"/>
+      </w:pPr>
+      <w:rPr>
+        <w:rFonts w:ascii="Symbol" w:hAnsi="Symbol" w:hint="default"/>
+        <w:sz w:val="20"/>
+      </w:rPr>
+    </w:lvl>
+    <w:lvl w:ilvl="1" w:tentative="1">
+      <w:start w:val="1"/>
+      <w:numFmt w:val="bullet"/>
+      <w:lvlText w:val="o"/>
+      <w:lvlJc w:val="left"/>
+      <w:pPr>
+        <w:tabs>
+          <w:tab w:val="num" w:pos="1440"/>
+        </w:tabs>
+        <w:ind w:left="1440" w:hanging="360"/>
+      </w:pPr>
+      <w:rPr>
+        <w:rFonts w:ascii="Courier New" w:hAnsi="Courier New" w:hint="default"/>
+        <w:sz w:val="20"/>
+      </w:rPr>
+    </w:lvl>
+    <w:lvl w:ilvl="2" w:tentative="1">
+      <w:start w:val="1"/>
+      <w:numFmt w:val="bullet"/>
+      <w:lvlText w:val=""/>
+      <w:lvlJc w:val="left"/>
+      <w:pPr>
+        <w:tabs>
+          <w:tab w:val="num" w:pos="2160"/>
+        </w:tabs>
+        <w:ind w:left="2160" w:hanging="360"/>
+      </w:pPr>
+      <w:rPr>
+        <w:rFonts w:ascii="Wingdings" w:hAnsi="Wingdings" w:hint="default"/>
+        <w:sz w:val="20"/>
+      </w:rPr>
+    </w:lvl>
+    <w:lvl w:ilvl="3" w:tentative="1">
+      <w:start w:val="1"/>
+      <w:numFmt w:val="bullet"/>
+      <w:lvlText w:val=""/>
+      <w:lvlJc w:val="left"/>
+      <w:pPr>
+        <w:tabs>
+          <w:tab w:val="num" w:pos="2880"/>
+        </w:tabs>
+        <w:ind w:left="2880" w:hanging="360"/>
+      </w:pPr>
+      <w:rPr>
+        <w:rFonts w:ascii="Wingdings" w:hAnsi="Wingdings" w:hint="default"/>
+        <w:sz w:val="20"/>
+      </w:rPr>
+    </w:lvl>
+    <w:lvl w:ilvl="4" w:tentative="1">
+      <w:start w:val="1"/>
+      <w:numFmt w:val="bullet"/>
+      <w:lvlText w:val=""/>
+      <w:lvlJc w:val="left"/>
+      <w:pPr>
+        <w:tabs>
+          <w:tab w:val="num" w:pos="3600"/>
+        </w:tabs>
+        <w:ind w:left="3600" w:hanging="360"/>
+      </w:pPr>
+      <w:rPr>
+        <w:rFonts w:ascii="Wingdings" w:hAnsi="Wingdings" w:hint="default"/>
+        <w:sz w:val="20"/>
+      </w:rPr>
+    </w:lvl>
+    <w:lvl w:ilvl="5" w:tentative="1">
+      <w:start w:val="1"/>
+      <w:numFmt w:val="bullet"/>
+      <w:lvlText w:val=""/>
+      <w:lvlJc w:val="left"/>
+      <w:pPr>
+        <w:tabs>
+          <w:tab w:val="num" w:pos="4320"/>
+        </w:tabs>
+        <w:ind w:left="4320" w:hanging="360"/>
+      </w:pPr>
+      <w:rPr>
+        <w:rFonts w:ascii="Wingdings" w:hAnsi="Wingdings" w:hint="default"/>
+        <w:sz w:val="20"/>
+      </w:rPr>
+    </w:lvl>
+    <w:lvl w:ilvl="6" w:tentative="1">
+      <w:start w:val="1"/>
+      <w:numFmt w:val="bullet"/>
+      <w:lvlText w:val=""/>
+      <w:lvlJc w:val="left"/>
+      <w:pPr>
+        <w:tabs>
+          <w:tab w:val="num" w:pos="5040"/>
+        </w:tabs>
+        <w:ind w:left="5040" w:hanging="360"/>
+      </w:pPr>
+      <w:rPr>
+        <w:rFonts w:ascii="Wingdings" w:hAnsi="Wingdings" w:hint="default"/>
+        <w:sz w:val="20"/>
+      </w:rPr>
+    </w:lvl>
+    <w:lvl w:ilvl="7" w:tentative="1">
+      <w:start w:val="1"/>
+      <w:numFmt w:val="bullet"/>
+      <w:lvlText w:val=""/>
+      <w:lvlJc w:val="left"/>
+      <w:pPr>
+        <w:tabs>
+          <w:tab w:val="num" w:pos="5760"/>
+        </w:tabs>
+        <w:ind w:left="5760" w:hanging="360"/>
+      </w:pPr>
+      <w:rPr>
+        <w:rFonts w:ascii="Wingdings" w:hAnsi="Wingdings" w:hint="default"/>
+        <w:sz w:val="20"/>
+      </w:rPr>
+    </w:lvl>
+    <w:lvl w:ilvl="8" w:tentative="1">
+      <w:start w:val="1"/>
+      <w:numFmt w:val="bullet"/>
+      <w:lvlText w:val=""/>
+      <w:lvlJc w:val="left"/>
+      <w:pPr>
+        <w:tabs>
+          <w:tab w:val="num" w:pos="6480"/>
+        </w:tabs>
+        <w:ind w:left="6480" w:hanging="360"/>
+      </w:pPr>
+      <w:rPr>
+        <w:rFonts w:ascii="Wingdings" w:hAnsi="Wingdings" w:hint="default"/>
+        <w:sz w:val="20"/>
+      </w:rPr>
+    </w:lvl>
+  </w:abstractNum>
   <w:num w:numId="1" w16cid:durableId="968709895">
+    <w:abstractNumId w:val="5"/>
+  </w:num>
+  <w:num w:numId="2" w16cid:durableId="1226643985">
+    <w:abstractNumId w:val="8"/>
+  </w:num>
+  <w:num w:numId="3" w16cid:durableId="276910803">
+    <w:abstractNumId w:val="3"/>
+  </w:num>
+  <w:num w:numId="4" w16cid:durableId="1243949237">
     <w:abstractNumId w:val="4"/>
   </w:num>
-  <w:num w:numId="2" w16cid:durableId="1226643985">
+  <w:num w:numId="5" w16cid:durableId="790629237">
+    <w:abstractNumId w:val="6"/>
+  </w:num>
+  <w:num w:numId="6" w16cid:durableId="1972393765">
     <w:abstractNumId w:val="7"/>
   </w:num>
-  <w:num w:numId="3" w16cid:durableId="276910803">
+  <w:num w:numId="7" w16cid:durableId="777218426">
+    <w:abstractNumId w:val="1"/>
+  </w:num>
+  <w:num w:numId="8" w16cid:durableId="28067647">
     <w:abstractNumId w:val="2"/>
   </w:num>
-  <w:num w:numId="4" w16cid:durableId="1243949237">
-    <w:abstractNumId w:val="3"/>
-  </w:num>
-  <w:num w:numId="5" w16cid:durableId="790629237">
-    <w:abstractNumId w:val="5"/>
-  </w:num>
-  <w:num w:numId="6" w16cid:durableId="1972393765">
-    <w:abstractNumId w:val="6"/>
-  </w:num>
-  <w:num w:numId="7" w16cid:durableId="777218426">
+  <w:num w:numId="9" w16cid:durableId="638608033">
     <w:abstractNumId w:val="0"/>
   </w:num>
-  <w:num w:numId="8" w16cid:durableId="28067647">
-    <w:abstractNumId w:val="1"/>
+  <w:num w:numId="10" w16cid:durableId="94717793">
+    <w:abstractNumId w:val="9"/>
   </w:num>
 </w:numbering>
 </file>
@@ -5811,7 +7473,6 @@
     <w:next w:val="Normal"/>
     <w:link w:val="Heading2Char"/>
     <w:uiPriority w:val="9"/>
-    <w:semiHidden/>
     <w:unhideWhenUsed/>
     <w:qFormat/>
     <w:rsid w:val="00F81636"/>
@@ -5834,7 +7495,6 @@
     <w:next w:val="Normal"/>
     <w:link w:val="Heading3Char"/>
     <w:uiPriority w:val="9"/>
-    <w:semiHidden/>
     <w:unhideWhenUsed/>
     <w:qFormat/>
     <w:rsid w:val="00F81636"/>
@@ -6027,7 +7687,6 @@
     <w:basedOn w:val="DefaultParagraphFont"/>
     <w:link w:val="Heading2"/>
     <w:uiPriority w:val="9"/>
-    <w:semiHidden/>
     <w:rsid w:val="00F81636"/>
     <w:rPr>
       <w:rFonts w:asciiTheme="majorHAnsi" w:eastAsiaTheme="majorEastAsia" w:hAnsiTheme="majorHAnsi" w:cstheme="majorBidi"/>
@@ -6041,7 +7700,6 @@
     <w:basedOn w:val="DefaultParagraphFont"/>
     <w:link w:val="Heading3"/>
     <w:uiPriority w:val="9"/>
-    <w:semiHidden/>
     <w:rsid w:val="00F81636"/>
     <w:rPr>
       <w:rFonts w:eastAsiaTheme="majorEastAsia" w:cstheme="majorBidi"/>
@@ -6317,6 +7975,46 @@
         <w:insideV w:val="single" w:sz="4" w:space="0" w:color="auto"/>
       </w:tblBorders>
     </w:tblPr>
+  </w:style>
+  <w:style w:type="paragraph" w:styleId="NormalWeb">
+    <w:name w:val="Normal (Web)"/>
+    <w:basedOn w:val="Normal"/>
+    <w:uiPriority w:val="99"/>
+    <w:semiHidden/>
+    <w:unhideWhenUsed/>
+    <w:rsid w:val="007B2D30"/>
+    <w:pPr>
+      <w:spacing w:before="100" w:beforeAutospacing="1" w:after="100" w:afterAutospacing="1" w:line="240" w:lineRule="auto"/>
+    </w:pPr>
+    <w:rPr>
+      <w:rFonts w:ascii="Times New Roman" w:eastAsia="Times New Roman" w:hAnsi="Times New Roman" w:cs="Times New Roman"/>
+      <w:kern w:val="0"/>
+      <w14:ligatures w14:val="none"/>
+    </w:rPr>
+  </w:style>
+  <w:style w:type="character" w:styleId="Strong">
+    <w:name w:val="Strong"/>
+    <w:basedOn w:val="DefaultParagraphFont"/>
+    <w:uiPriority w:val="22"/>
+    <w:qFormat/>
+    <w:rsid w:val="007B2D30"/>
+    <w:rPr>
+      <w:b/>
+      <w:bCs/>
+    </w:rPr>
+  </w:style>
+  <w:style w:type="character" w:styleId="HTMLCode">
+    <w:name w:val="HTML Code"/>
+    <w:basedOn w:val="DefaultParagraphFont"/>
+    <w:uiPriority w:val="99"/>
+    <w:semiHidden/>
+    <w:unhideWhenUsed/>
+    <w:rsid w:val="007B2D30"/>
+    <w:rPr>
+      <w:rFonts w:ascii="Courier New" w:eastAsia="Times New Roman" w:hAnsi="Courier New" w:cs="Courier New"/>
+      <w:sz w:val="20"/>
+      <w:szCs w:val="20"/>
+    </w:rPr>
   </w:style>
 </w:styles>
 </file>

</xml_diff>

<commit_message>
feat(order): add checkout flow and customer order management
</commit_message>
<xml_diff>
--- a/docs/foodhub_Interview_Notes.docx
+++ b/docs/foodhub_Interview_Notes.docx
@@ -10358,7 +10358,7 @@
         </w:rPr>
         <w:lastRenderedPageBreak/>
         <w:pict w14:anchorId="42E20D9D">
-          <v:rect id="_x0000_i1222" style="width:0;height:1.5pt" o:hralign="center" o:hrstd="t" o:hr="t" fillcolor="#a0a0a0" stroked="f"/>
+          <v:rect id="_x0000_i1102" style="width:0;height:1.5pt" o:hralign="center" o:hrstd="t" o:hr="t" fillcolor="#a0a0a0" stroked="f"/>
         </w:pict>
       </w:r>
     </w:p>
@@ -10744,7 +10744,7 @@
           <w14:ligatures w14:val="none"/>
         </w:rPr>
         <w:pict w14:anchorId="75311560">
-          <v:rect id="_x0000_i1223" style="width:0;height:1.5pt" o:hralign="center" o:hrstd="t" o:hr="t" fillcolor="#a0a0a0" stroked="f"/>
+          <v:rect id="_x0000_i1103" style="width:0;height:1.5pt" o:hralign="center" o:hrstd="t" o:hr="t" fillcolor="#a0a0a0" stroked="f"/>
         </w:pict>
       </w:r>
     </w:p>
@@ -10825,7 +10825,7 @@
           <w14:ligatures w14:val="none"/>
         </w:rPr>
         <w:pict w14:anchorId="770DFFCE">
-          <v:rect id="_x0000_i1224" style="width:0;height:1.5pt" o:hralign="center" o:hrstd="t" o:hr="t" fillcolor="#a0a0a0" stroked="f"/>
+          <v:rect id="_x0000_i1104" style="width:0;height:1.5pt" o:hralign="center" o:hrstd="t" o:hr="t" fillcolor="#a0a0a0" stroked="f"/>
         </w:pict>
       </w:r>
     </w:p>
@@ -10905,7 +10905,7 @@
           <w14:ligatures w14:val="none"/>
         </w:rPr>
         <w:pict w14:anchorId="6F1B6C75">
-          <v:rect id="_x0000_i1225" style="width:0;height:1.5pt" o:hralign="center" o:hrstd="t" o:hr="t" fillcolor="#a0a0a0" stroked="f"/>
+          <v:rect id="_x0000_i1105" style="width:0;height:1.5pt" o:hralign="center" o:hrstd="t" o:hr="t" fillcolor="#a0a0a0" stroked="f"/>
         </w:pict>
       </w:r>
     </w:p>
@@ -11005,7 +11005,7 @@
           <w14:ligatures w14:val="none"/>
         </w:rPr>
         <w:pict w14:anchorId="0A1CB0A1">
-          <v:rect id="_x0000_i1226" style="width:0;height:1.5pt" o:hralign="center" o:hrstd="t" o:hr="t" fillcolor="#a0a0a0" stroked="f"/>
+          <v:rect id="_x0000_i1106" style="width:0;height:1.5pt" o:hralign="center" o:hrstd="t" o:hr="t" fillcolor="#a0a0a0" stroked="f"/>
         </w:pict>
       </w:r>
     </w:p>
@@ -11117,7 +11117,7 @@
           <w14:ligatures w14:val="none"/>
         </w:rPr>
         <w:pict w14:anchorId="09B0C82A">
-          <v:rect id="_x0000_i1227" style="width:0;height:1.5pt" o:hralign="center" o:hrstd="t" o:hr="t" fillcolor="#a0a0a0" stroked="f"/>
+          <v:rect id="_x0000_i1107" style="width:0;height:1.5pt" o:hralign="center" o:hrstd="t" o:hr="t" fillcolor="#a0a0a0" stroked="f"/>
         </w:pict>
       </w:r>
     </w:p>
@@ -11197,7 +11197,7 @@
           <w14:ligatures w14:val="none"/>
         </w:rPr>
         <w:pict w14:anchorId="5DFBA529">
-          <v:rect id="_x0000_i1228" style="width:0;height:1.5pt" o:hralign="center" o:hrstd="t" o:hr="t" fillcolor="#a0a0a0" stroked="f"/>
+          <v:rect id="_x0000_i1108" style="width:0;height:1.5pt" o:hralign="center" o:hrstd="t" o:hr="t" fillcolor="#a0a0a0" stroked="f"/>
         </w:pict>
       </w:r>
     </w:p>
@@ -11278,7 +11278,7 @@
           <w14:ligatures w14:val="none"/>
         </w:rPr>
         <w:pict w14:anchorId="19FBEEB0">
-          <v:rect id="_x0000_i1229" style="width:0;height:1.5pt" o:hralign="center" o:hrstd="t" o:hr="t" fillcolor="#a0a0a0" stroked="f"/>
+          <v:rect id="_x0000_i1109" style="width:0;height:1.5pt" o:hralign="center" o:hrstd="t" o:hr="t" fillcolor="#a0a0a0" stroked="f"/>
         </w:pict>
       </w:r>
     </w:p>
@@ -11390,7 +11390,7 @@
           <w14:ligatures w14:val="none"/>
         </w:rPr>
         <w:pict w14:anchorId="710092C7">
-          <v:rect id="_x0000_i1230" style="width:0;height:1.5pt" o:hralign="center" o:hrstd="t" o:hr="t" fillcolor="#a0a0a0" stroked="f"/>
+          <v:rect id="_x0000_i1110" style="width:0;height:1.5pt" o:hralign="center" o:hrstd="t" o:hr="t" fillcolor="#a0a0a0" stroked="f"/>
         </w:pict>
       </w:r>
     </w:p>
@@ -11470,7 +11470,7 @@
           <w14:ligatures w14:val="none"/>
         </w:rPr>
         <w:pict w14:anchorId="3E0BC904">
-          <v:rect id="_x0000_i1231" style="width:0;height:1.5pt" o:hralign="center" o:hrstd="t" o:hr="t" fillcolor="#a0a0a0" stroked="f"/>
+          <v:rect id="_x0000_i1111" style="width:0;height:1.5pt" o:hralign="center" o:hrstd="t" o:hr="t" fillcolor="#a0a0a0" stroked="f"/>
         </w:pict>
       </w:r>
     </w:p>
@@ -11678,7 +11678,7 @@
           <w14:ligatures w14:val="none"/>
         </w:rPr>
         <w:pict w14:anchorId="652B6782">
-          <v:rect id="_x0000_i1232" style="width:0;height:1.5pt" o:hralign="center" o:hrstd="t" o:hr="t" fillcolor="#a0a0a0" stroked="f"/>
+          <v:rect id="_x0000_i1112" style="width:0;height:1.5pt" o:hralign="center" o:hrstd="t" o:hr="t" fillcolor="#a0a0a0" stroked="f"/>
         </w:pict>
       </w:r>
     </w:p>
@@ -11813,7 +11813,7 @@
           <w14:ligatures w14:val="none"/>
         </w:rPr>
         <w:pict w14:anchorId="4D2EC3E3">
-          <v:rect id="_x0000_i1233" style="width:0;height:1.5pt" o:hralign="center" o:hrstd="t" o:hr="t" fillcolor="#a0a0a0" stroked="f"/>
+          <v:rect id="_x0000_i1113" style="width:0;height:1.5pt" o:hralign="center" o:hrstd="t" o:hr="t" fillcolor="#a0a0a0" stroked="f"/>
         </w:pict>
       </w:r>
     </w:p>
@@ -11911,7 +11911,7 @@
           <w14:ligatures w14:val="none"/>
         </w:rPr>
         <w:pict w14:anchorId="161DB741">
-          <v:rect id="_x0000_i1234" style="width:0;height:1.5pt" o:hralign="center" o:hrstd="t" o:hr="t" fillcolor="#a0a0a0" stroked="f"/>
+          <v:rect id="_x0000_i1114" style="width:0;height:1.5pt" o:hralign="center" o:hrstd="t" o:hr="t" fillcolor="#a0a0a0" stroked="f"/>
         </w:pict>
       </w:r>
     </w:p>
@@ -12053,7 +12053,7 @@
           <w14:ligatures w14:val="none"/>
         </w:rPr>
         <w:pict w14:anchorId="0D0BFFA6">
-          <v:rect id="_x0000_i1235" style="width:0;height:1.5pt" o:hralign="center" o:hrstd="t" o:hr="t" fillcolor="#a0a0a0" stroked="f"/>
+          <v:rect id="_x0000_i1115" style="width:0;height:1.5pt" o:hralign="center" o:hrstd="t" o:hr="t" fillcolor="#a0a0a0" stroked="f"/>
         </w:pict>
       </w:r>
     </w:p>
@@ -12179,7 +12179,7 @@
           <w14:ligatures w14:val="none"/>
         </w:rPr>
         <w:pict w14:anchorId="205B3E47">
-          <v:rect id="_x0000_i1236" style="width:0;height:1.5pt" o:hralign="center" o:hrstd="t" o:hr="t" fillcolor="#a0a0a0" stroked="f"/>
+          <v:rect id="_x0000_i1116" style="width:0;height:1.5pt" o:hralign="center" o:hrstd="t" o:hr="t" fillcolor="#a0a0a0" stroked="f"/>
         </w:pict>
       </w:r>
     </w:p>
@@ -12313,7 +12313,7 @@
           <w14:ligatures w14:val="none"/>
         </w:rPr>
         <w:pict w14:anchorId="6770DB65">
-          <v:rect id="_x0000_i1237" style="width:0;height:1.5pt" o:hralign="center" o:hrstd="t" o:hr="t" fillcolor="#a0a0a0" stroked="f"/>
+          <v:rect id="_x0000_i1117" style="width:0;height:1.5pt" o:hralign="center" o:hrstd="t" o:hr="t" fillcolor="#a0a0a0" stroked="f"/>
         </w:pict>
       </w:r>
     </w:p>
@@ -12394,7 +12394,7 @@
           <w14:ligatures w14:val="none"/>
         </w:rPr>
         <w:pict w14:anchorId="6F9D94F8">
-          <v:rect id="_x0000_i1238" style="width:0;height:1.5pt" o:hralign="center" o:hrstd="t" o:hr="t" fillcolor="#a0a0a0" stroked="f"/>
+          <v:rect id="_x0000_i1118" style="width:0;height:1.5pt" o:hralign="center" o:hrstd="t" o:hr="t" fillcolor="#a0a0a0" stroked="f"/>
         </w:pict>
       </w:r>
     </w:p>
@@ -12808,7 +12808,7 @@
           <w14:ligatures w14:val="none"/>
         </w:rPr>
         <w:pict w14:anchorId="0B68E1C9">
-          <v:rect id="_x0000_i1239" style="width:0;height:1.5pt" o:hralign="center" o:hrstd="t" o:hr="t" fillcolor="#a0a0a0" stroked="f"/>
+          <v:rect id="_x0000_i1119" style="width:0;height:1.5pt" o:hralign="center" o:hrstd="t" o:hr="t" fillcolor="#a0a0a0" stroked="f"/>
         </w:pict>
       </w:r>
     </w:p>
@@ -12888,7 +12888,7 @@
           <w14:ligatures w14:val="none"/>
         </w:rPr>
         <w:pict w14:anchorId="51AAA0E1">
-          <v:rect id="_x0000_i1240" style="width:0;height:1.5pt" o:hralign="center" o:hrstd="t" o:hr="t" fillcolor="#a0a0a0" stroked="f"/>
+          <v:rect id="_x0000_i1120" style="width:0;height:1.5pt" o:hralign="center" o:hrstd="t" o:hr="t" fillcolor="#a0a0a0" stroked="f"/>
         </w:pict>
       </w:r>
     </w:p>
@@ -12969,7 +12969,7 @@
           <w14:ligatures w14:val="none"/>
         </w:rPr>
         <w:pict w14:anchorId="19EAAECF">
-          <v:rect id="_x0000_i1241" style="width:0;height:1.5pt" o:hralign="center" o:hrstd="t" o:hr="t" fillcolor="#a0a0a0" stroked="f"/>
+          <v:rect id="_x0000_i1121" style="width:0;height:1.5pt" o:hralign="center" o:hrstd="t" o:hr="t" fillcolor="#a0a0a0" stroked="f"/>
         </w:pict>
       </w:r>
     </w:p>
@@ -13251,7 +13251,7 @@
           <w14:ligatures w14:val="none"/>
         </w:rPr>
         <w:pict w14:anchorId="4AA0CC2F">
-          <v:rect id="_x0000_i1336" style="width:0;height:1.5pt" o:hralign="center" o:hrstd="t" o:hr="t" fillcolor="#a0a0a0" stroked="f"/>
+          <v:rect id="_x0000_i1122" style="width:0;height:1.5pt" o:hralign="center" o:hrstd="t" o:hr="t" fillcolor="#a0a0a0" stroked="f"/>
         </w:pict>
       </w:r>
     </w:p>
@@ -13287,7 +13287,7 @@
     <w:p>
       <w:r>
         <w:pict w14:anchorId="061C272F">
-          <v:rect id="_x0000_i1318" style="width:0;height:1.5pt" o:hralign="center" o:hrstd="t" o:hr="t" fillcolor="#a0a0a0" stroked="f"/>
+          <v:rect id="_x0000_i1123" style="width:0;height:1.5pt" o:hralign="center" o:hrstd="t" o:hr="t" fillcolor="#a0a0a0" stroked="f"/>
         </w:pict>
       </w:r>
     </w:p>
@@ -13370,7 +13370,7 @@
     <w:p>
       <w:r>
         <w:pict w14:anchorId="0117F4B8">
-          <v:rect id="_x0000_i1319" style="width:0;height:1.5pt" o:hralign="center" o:hrstd="t" o:hr="t" fillcolor="#a0a0a0" stroked="f"/>
+          <v:rect id="_x0000_i1124" style="width:0;height:1.5pt" o:hralign="center" o:hrstd="t" o:hr="t" fillcolor="#a0a0a0" stroked="f"/>
         </w:pict>
       </w:r>
     </w:p>
@@ -13407,7 +13407,7 @@
     <w:p>
       <w:r>
         <w:pict w14:anchorId="0F13E4A1">
-          <v:rect id="_x0000_i1320" style="width:0;height:1.5pt" o:hralign="center" o:hrstd="t" o:hr="t" fillcolor="#a0a0a0" stroked="f"/>
+          <v:rect id="_x0000_i1125" style="width:0;height:1.5pt" o:hralign="center" o:hrstd="t" o:hr="t" fillcolor="#a0a0a0" stroked="f"/>
         </w:pict>
       </w:r>
     </w:p>
@@ -13481,7 +13481,7 @@
     <w:p>
       <w:r>
         <w:pict w14:anchorId="0936A74B">
-          <v:rect id="_x0000_i1321" style="width:0;height:1.5pt" o:hralign="center" o:hrstd="t" o:hr="t" fillcolor="#a0a0a0" stroked="f"/>
+          <v:rect id="_x0000_i1126" style="width:0;height:1.5pt" o:hralign="center" o:hrstd="t" o:hr="t" fillcolor="#a0a0a0" stroked="f"/>
         </w:pict>
       </w:r>
     </w:p>
@@ -13533,7 +13533,7 @@
     <w:p>
       <w:r>
         <w:pict w14:anchorId="10BCAD12">
-          <v:rect id="_x0000_i1322" style="width:0;height:1.5pt" o:hralign="center" o:hrstd="t" o:hr="t" fillcolor="#a0a0a0" stroked="f"/>
+          <v:rect id="_x0000_i1127" style="width:0;height:1.5pt" o:hralign="center" o:hrstd="t" o:hr="t" fillcolor="#a0a0a0" stroked="f"/>
         </w:pict>
       </w:r>
     </w:p>
@@ -13590,7 +13590,7 @@
     <w:p>
       <w:r>
         <w:pict w14:anchorId="31484BF1">
-          <v:rect id="_x0000_i1323" style="width:0;height:1.5pt" o:hralign="center" o:hrstd="t" o:hr="t" fillcolor="#a0a0a0" stroked="f"/>
+          <v:rect id="_x0000_i1128" style="width:0;height:1.5pt" o:hralign="center" o:hrstd="t" o:hr="t" fillcolor="#a0a0a0" stroked="f"/>
         </w:pict>
       </w:r>
     </w:p>
@@ -13648,7 +13648,7 @@
       <w:r>
         <w:lastRenderedPageBreak/>
         <w:pict w14:anchorId="3D9627D1">
-          <v:rect id="_x0000_i1324" style="width:0;height:1.5pt" o:hralign="center" o:hrstd="t" o:hr="t" fillcolor="#a0a0a0" stroked="f"/>
+          <v:rect id="_x0000_i1129" style="width:0;height:1.5pt" o:hralign="center" o:hrstd="t" o:hr="t" fillcolor="#a0a0a0" stroked="f"/>
         </w:pict>
       </w:r>
     </w:p>
@@ -13713,7 +13713,7 @@
     <w:p>
       <w:r>
         <w:pict w14:anchorId="44825527">
-          <v:rect id="_x0000_i1325" style="width:0;height:1.5pt" o:hralign="center" o:hrstd="t" o:hr="t" fillcolor="#a0a0a0" stroked="f"/>
+          <v:rect id="_x0000_i1130" style="width:0;height:1.5pt" o:hralign="center" o:hrstd="t" o:hr="t" fillcolor="#a0a0a0" stroked="f"/>
         </w:pict>
       </w:r>
     </w:p>
@@ -13775,7 +13775,7 @@
     <w:p>
       <w:r>
         <w:pict w14:anchorId="5709A19E">
-          <v:rect id="_x0000_i1326" style="width:0;height:1.5pt" o:hralign="center" o:hrstd="t" o:hr="t" fillcolor="#a0a0a0" stroked="f"/>
+          <v:rect id="_x0000_i1131" style="width:0;height:1.5pt" o:hralign="center" o:hrstd="t" o:hr="t" fillcolor="#a0a0a0" stroked="f"/>
         </w:pict>
       </w:r>
     </w:p>
@@ -14015,7 +14015,7 @@
     <w:p>
       <w:r>
         <w:pict w14:anchorId="4BDC941B">
-          <v:rect id="_x0000_i1337" style="width:0;height:1.5pt" o:hralign="center" o:hrstd="t" o:hr="t" fillcolor="#a0a0a0" stroked="f"/>
+          <v:rect id="_x0000_i1132" style="width:0;height:1.5pt" o:hralign="center" o:hrstd="t" o:hr="t" fillcolor="#a0a0a0" stroked="f"/>
         </w:pict>
       </w:r>
     </w:p>
@@ -14060,7 +14060,7 @@
     <w:p>
       <w:r>
         <w:pict w14:anchorId="6C00AB8A">
-          <v:rect id="_x0000_i1416" style="width:0;height:1.5pt" o:hralign="center" o:hrstd="t" o:hr="t" fillcolor="#a0a0a0" stroked="f"/>
+          <v:rect id="_x0000_i1133" style="width:0;height:1.5pt" o:hralign="center" o:hrstd="t" o:hr="t" fillcolor="#a0a0a0" stroked="f"/>
         </w:pict>
       </w:r>
     </w:p>
@@ -14096,7 +14096,7 @@
     <w:p>
       <w:r>
         <w:pict w14:anchorId="70C1CDEF">
-          <v:rect id="_x0000_i1417" style="width:0;height:1.5pt" o:hralign="center" o:hrstd="t" o:hr="t" fillcolor="#a0a0a0" stroked="f"/>
+          <v:rect id="_x0000_i1134" style="width:0;height:1.5pt" o:hralign="center" o:hrstd="t" o:hr="t" fillcolor="#a0a0a0" stroked="f"/>
         </w:pict>
       </w:r>
     </w:p>
@@ -14140,7 +14140,7 @@
     <w:p>
       <w:r>
         <w:pict w14:anchorId="56062CF4">
-          <v:rect id="_x0000_i1418" style="width:0;height:1.5pt" o:hralign="center" o:hrstd="t" o:hr="t" fillcolor="#a0a0a0" stroked="f"/>
+          <v:rect id="_x0000_i1135" style="width:0;height:1.5pt" o:hralign="center" o:hrstd="t" o:hr="t" fillcolor="#a0a0a0" stroked="f"/>
         </w:pict>
       </w:r>
     </w:p>
@@ -14205,7 +14205,7 @@
     <w:p>
       <w:r>
         <w:pict w14:anchorId="45F77278">
-          <v:rect id="_x0000_i1419" style="width:0;height:1.5pt" o:hralign="center" o:hrstd="t" o:hr="t" fillcolor="#a0a0a0" stroked="f"/>
+          <v:rect id="_x0000_i1136" style="width:0;height:1.5pt" o:hralign="center" o:hrstd="t" o:hr="t" fillcolor="#a0a0a0" stroked="f"/>
         </w:pict>
       </w:r>
     </w:p>
@@ -14241,7 +14241,7 @@
     <w:p>
       <w:r>
         <w:pict w14:anchorId="40EF39AA">
-          <v:rect id="_x0000_i1420" style="width:0;height:1.5pt" o:hralign="center" o:hrstd="t" o:hr="t" fillcolor="#a0a0a0" stroked="f"/>
+          <v:rect id="_x0000_i1137" style="width:0;height:1.5pt" o:hralign="center" o:hrstd="t" o:hr="t" fillcolor="#a0a0a0" stroked="f"/>
         </w:pict>
       </w:r>
     </w:p>
@@ -14288,7 +14288,7 @@
     <w:p>
       <w:r>
         <w:pict w14:anchorId="348400F5">
-          <v:rect id="_x0000_i1421" style="width:0;height:1.5pt" o:hralign="center" o:hrstd="t" o:hr="t" fillcolor="#a0a0a0" stroked="f"/>
+          <v:rect id="_x0000_i1138" style="width:0;height:1.5pt" o:hralign="center" o:hrstd="t" o:hr="t" fillcolor="#a0a0a0" stroked="f"/>
         </w:pict>
       </w:r>
     </w:p>
@@ -14350,7 +14350,7 @@
     <w:p>
       <w:r>
         <w:pict w14:anchorId="47257472">
-          <v:rect id="_x0000_i1422" style="width:0;height:1.5pt" o:hralign="center" o:hrstd="t" o:hr="t" fillcolor="#a0a0a0" stroked="f"/>
+          <v:rect id="_x0000_i1139" style="width:0;height:1.5pt" o:hralign="center" o:hrstd="t" o:hr="t" fillcolor="#a0a0a0" stroked="f"/>
         </w:pict>
       </w:r>
     </w:p>
@@ -14412,7 +14412,7 @@
     <w:p>
       <w:r>
         <w:pict w14:anchorId="02F11129">
-          <v:rect id="_x0000_i1423" style="width:0;height:1.5pt" o:hralign="center" o:hrstd="t" o:hr="t" fillcolor="#a0a0a0" stroked="f"/>
+          <v:rect id="_x0000_i1140" style="width:0;height:1.5pt" o:hralign="center" o:hrstd="t" o:hr="t" fillcolor="#a0a0a0" stroked="f"/>
         </w:pict>
       </w:r>
     </w:p>
@@ -14474,7 +14474,7 @@
     <w:p>
       <w:r>
         <w:pict w14:anchorId="752BF9E7">
-          <v:rect id="_x0000_i1424" style="width:0;height:1.5pt" o:hralign="center" o:hrstd="t" o:hr="t" fillcolor="#a0a0a0" stroked="f"/>
+          <v:rect id="_x0000_i1141" style="width:0;height:1.5pt" o:hralign="center" o:hrstd="t" o:hr="t" fillcolor="#a0a0a0" stroked="f"/>
         </w:pict>
       </w:r>
     </w:p>
@@ -14574,7 +14574,7 @@
     <w:p>
       <w:r>
         <w:pict w14:anchorId="331F12F9">
-          <v:rect id="_x0000_i1425" style="width:0;height:1.5pt" o:hralign="center" o:hrstd="t" o:hr="t" fillcolor="#a0a0a0" stroked="f"/>
+          <v:rect id="_x0000_i1142" style="width:0;height:1.5pt" o:hralign="center" o:hrstd="t" o:hr="t" fillcolor="#a0a0a0" stroked="f"/>
         </w:pict>
       </w:r>
     </w:p>
@@ -14634,7 +14634,7 @@
     <w:p>
       <w:r>
         <w:pict w14:anchorId="4A27B532">
-          <v:rect id="_x0000_i1426" style="width:0;height:1.5pt" o:hralign="center" o:hrstd="t" o:hr="t" fillcolor="#a0a0a0" stroked="f"/>
+          <v:rect id="_x0000_i1143" style="width:0;height:1.5pt" o:hralign="center" o:hrstd="t" o:hr="t" fillcolor="#a0a0a0" stroked="f"/>
         </w:pict>
       </w:r>
     </w:p>
@@ -14677,7 +14677,7 @@
     <w:p>
       <w:r>
         <w:pict w14:anchorId="705F17BA">
-          <v:rect id="_x0000_i1427" style="width:0;height:1.5pt" o:hralign="center" o:hrstd="t" o:hr="t" fillcolor="#a0a0a0" stroked="f"/>
+          <v:rect id="_x0000_i1144" style="width:0;height:1.5pt" o:hralign="center" o:hrstd="t" o:hr="t" fillcolor="#a0a0a0" stroked="f"/>
         </w:pict>
       </w:r>
     </w:p>
@@ -14713,7 +14713,7 @@
     <w:p>
       <w:r>
         <w:pict w14:anchorId="0B1E2F3D">
-          <v:rect id="_x0000_i1428" style="width:0;height:1.5pt" o:hralign="center" o:hrstd="t" o:hr="t" fillcolor="#a0a0a0" stroked="f"/>
+          <v:rect id="_x0000_i1145" style="width:0;height:1.5pt" o:hralign="center" o:hrstd="t" o:hr="t" fillcolor="#a0a0a0" stroked="f"/>
         </w:pict>
       </w:r>
     </w:p>
@@ -14859,6 +14859,1664 @@
     <w:p>
       <w:r>
         <w:t>These APIs require the user to be logged in before accessing them.</w:t>
+      </w:r>
+    </w:p>
+    <w:p/>
+    <w:p>
+      <w:pPr>
+        <w:rPr>
+          <w:b/>
+          <w:bCs/>
+        </w:rPr>
+      </w:pPr>
+      <w:r>
+        <w:rPr>
+          <w:rFonts w:ascii="Segoe UI Emoji" w:hAnsi="Segoe UI Emoji" w:cs="Segoe UI Emoji"/>
+          <w:b/>
+          <w:bCs/>
+        </w:rPr>
+        <w:lastRenderedPageBreak/>
+        <w:t>🛒</w:t>
+      </w:r>
+      <w:r>
+        <w:rPr>
+          <w:b/>
+          <w:bCs/>
+        </w:rPr>
+        <w:t xml:space="preserve"> Cart Module</w:t>
+      </w:r>
+    </w:p>
+    <w:p>
+      <w:pPr>
+        <w:rPr>
+          <w:b/>
+          <w:bCs/>
+        </w:rPr>
+      </w:pPr>
+      <w:r>
+        <w:rPr>
+          <w:b/>
+          <w:bCs/>
+        </w:rPr>
+        <w:t>Q125. Why did we create a separate Cart model?</w:t>
+      </w:r>
+    </w:p>
+    <w:p>
+      <w:r>
+        <w:rPr>
+          <w:b/>
+          <w:bCs/>
+        </w:rPr>
+        <w:t>Answer:</w:t>
+      </w:r>
+      <w:r>
+        <w:br/>
+        <w:t>A separate Cart model stores each user's selected food items independently. This keeps cart data organized and prevents mixing it with User or Food data.</w:t>
+      </w:r>
+    </w:p>
+    <w:p>
+      <w:r>
+        <w:pict w14:anchorId="02338C15">
+          <v:rect id="_x0000_i1248" style="width:0;height:1.5pt" o:hralign="center" o:hrstd="t" o:hr="t" fillcolor="#a0a0a0" stroked="f"/>
+        </w:pict>
+      </w:r>
+    </w:p>
+    <w:p>
+      <w:pPr>
+        <w:rPr>
+          <w:b/>
+          <w:bCs/>
+        </w:rPr>
+      </w:pPr>
+      <w:r>
+        <w:rPr>
+          <w:b/>
+          <w:bCs/>
+        </w:rPr>
+        <w:t>Q126. Why does the Cart model store a reference to the User?</w:t>
+      </w:r>
+    </w:p>
+    <w:p>
+      <w:r>
+        <w:rPr>
+          <w:b/>
+          <w:bCs/>
+        </w:rPr>
+        <w:t>Answer:</w:t>
+      </w:r>
+      <w:r>
+        <w:br/>
+        <w:t>Each cart belongs to one logged-in user. The user field links the cart to its owner, allowing us to fetch the correct cart using req.user.id.</w:t>
+      </w:r>
+    </w:p>
+    <w:p>
+      <w:r>
+        <w:pict w14:anchorId="0E91C4D8">
+          <v:rect id="_x0000_i1249" style="width:0;height:1.5pt" o:hralign="center" o:hrstd="t" o:hr="t" fillcolor="#a0a0a0" stroked="f"/>
+        </w:pict>
+      </w:r>
+    </w:p>
+    <w:p>
+      <w:pPr>
+        <w:rPr>
+          <w:b/>
+          <w:bCs/>
+        </w:rPr>
+      </w:pPr>
+      <w:r>
+        <w:rPr>
+          <w:b/>
+          <w:bCs/>
+        </w:rPr>
+        <w:t xml:space="preserve">Q127. Why do we store Food as an </w:t>
+      </w:r>
+      <w:proofErr w:type="spellStart"/>
+      <w:r>
+        <w:rPr>
+          <w:b/>
+          <w:bCs/>
+        </w:rPr>
+        <w:t>ObjectId</w:t>
+      </w:r>
+      <w:proofErr w:type="spellEnd"/>
+      <w:r>
+        <w:rPr>
+          <w:b/>
+          <w:bCs/>
+        </w:rPr>
+        <w:t xml:space="preserve"> instead of storing the complete food details?</w:t>
+      </w:r>
+    </w:p>
+    <w:p>
+      <w:r>
+        <w:rPr>
+          <w:b/>
+          <w:bCs/>
+        </w:rPr>
+        <w:t>Answer:</w:t>
+      </w:r>
+      <w:r>
+        <w:br/>
+        <w:t xml:space="preserve">Using an </w:t>
+      </w:r>
+      <w:proofErr w:type="spellStart"/>
+      <w:r>
+        <w:t>ObjectId</w:t>
+      </w:r>
+      <w:proofErr w:type="spellEnd"/>
+      <w:r>
+        <w:t xml:space="preserve"> avoids duplicate data. Food details are stored only once in the Food collection and can be retrieved later using </w:t>
+      </w:r>
+      <w:proofErr w:type="gramStart"/>
+      <w:r>
+        <w:t>populate(</w:t>
+      </w:r>
+      <w:proofErr w:type="gramEnd"/>
+      <w:r>
+        <w:t>).</w:t>
+      </w:r>
+    </w:p>
+    <w:p>
+      <w:r>
+        <w:pict w14:anchorId="09394354">
+          <v:rect id="_x0000_i1250" style="width:0;height:1.5pt" o:hralign="center" o:hrstd="t" o:hr="t" fillcolor="#a0a0a0" stroked="f"/>
+        </w:pict>
+      </w:r>
+    </w:p>
+    <w:p>
+      <w:pPr>
+        <w:rPr>
+          <w:b/>
+          <w:bCs/>
+        </w:rPr>
+      </w:pPr>
+      <w:r>
+        <w:rPr>
+          <w:b/>
+          <w:bCs/>
+        </w:rPr>
+        <w:t>Q128. Why do we use populate("</w:t>
+      </w:r>
+      <w:proofErr w:type="spellStart"/>
+      <w:proofErr w:type="gramStart"/>
+      <w:r>
+        <w:rPr>
+          <w:b/>
+          <w:bCs/>
+        </w:rPr>
+        <w:t>items.food</w:t>
+      </w:r>
+      <w:proofErr w:type="spellEnd"/>
+      <w:proofErr w:type="gramEnd"/>
+      <w:r>
+        <w:rPr>
+          <w:b/>
+          <w:bCs/>
+        </w:rPr>
+        <w:t>") while fetching the cart?</w:t>
+      </w:r>
+    </w:p>
+    <w:p>
+      <w:r>
+        <w:rPr>
+          <w:b/>
+          <w:bCs/>
+        </w:rPr>
+        <w:t>Answer:</w:t>
+      </w:r>
+      <w:r>
+        <w:br/>
+      </w:r>
+      <w:proofErr w:type="gramStart"/>
+      <w:r>
+        <w:t>populate(</w:t>
+      </w:r>
+      <w:proofErr w:type="gramEnd"/>
+      <w:r>
+        <w:t xml:space="preserve">) replaces the Food </w:t>
+      </w:r>
+      <w:proofErr w:type="spellStart"/>
+      <w:r>
+        <w:t>ObjectId</w:t>
+      </w:r>
+      <w:proofErr w:type="spellEnd"/>
+      <w:r>
+        <w:t xml:space="preserve"> with the complete Food document, allowing the frontend to display the food name, price, image, and description.</w:t>
+      </w:r>
+    </w:p>
+    <w:p>
+      <w:r>
+        <w:pict w14:anchorId="74D8A21D">
+          <v:rect id="_x0000_i1251" style="width:0;height:1.5pt" o:hralign="center" o:hrstd="t" o:hr="t" fillcolor="#a0a0a0" stroked="f"/>
+        </w:pict>
+      </w:r>
+    </w:p>
+    <w:p>
+      <w:pPr>
+        <w:rPr>
+          <w:b/>
+          <w:bCs/>
+        </w:rPr>
+      </w:pPr>
+      <w:r>
+        <w:rPr>
+          <w:b/>
+          <w:bCs/>
+        </w:rPr>
+        <w:t>Q129. Why do we use req.user.id instead of sending the user ID from the frontend?</w:t>
+      </w:r>
+    </w:p>
+    <w:p>
+      <w:r>
+        <w:rPr>
+          <w:b/>
+          <w:bCs/>
+        </w:rPr>
+        <w:t>Answer:</w:t>
+      </w:r>
+      <w:r>
+        <w:br/>
+        <w:t>The authenticated user's ID is obtained from the verified JWT. This is more secure because the client cannot modify req.user.id.</w:t>
+      </w:r>
+    </w:p>
+    <w:p>
+      <w:r>
+        <w:pict w14:anchorId="35D02002">
+          <v:rect id="_x0000_i1252" style="width:0;height:1.5pt" o:hralign="center" o:hrstd="t" o:hr="t" fillcolor="#a0a0a0" stroked="f"/>
+        </w:pict>
+      </w:r>
+    </w:p>
+    <w:p>
+      <w:pPr>
+        <w:rPr>
+          <w:b/>
+          <w:bCs/>
+        </w:rPr>
+      </w:pPr>
+      <w:r>
+        <w:rPr>
+          <w:b/>
+          <w:bCs/>
+        </w:rPr>
+        <w:t>Q130. What happens when the user adds the same food again?</w:t>
+      </w:r>
+    </w:p>
+    <w:p>
+      <w:r>
+        <w:rPr>
+          <w:b/>
+          <w:bCs/>
+        </w:rPr>
+        <w:t>Answer:</w:t>
+      </w:r>
+      <w:r>
+        <w:br/>
+        <w:t>Instead of creating another cart item, the backend increases the quantity of the existing item.</w:t>
+      </w:r>
+    </w:p>
+    <w:p>
+      <w:r>
+        <w:lastRenderedPageBreak/>
+        <w:pict w14:anchorId="0C68AEBE">
+          <v:rect id="_x0000_i1253" style="width:0;height:1.5pt" o:hralign="center" o:hrstd="t" o:hr="t" fillcolor="#a0a0a0" stroked="f"/>
+        </w:pict>
+      </w:r>
+    </w:p>
+    <w:p>
+      <w:pPr>
+        <w:rPr>
+          <w:b/>
+          <w:bCs/>
+        </w:rPr>
+      </w:pPr>
+      <w:r>
+        <w:rPr>
+          <w:b/>
+          <w:bCs/>
+        </w:rPr>
+        <w:t>Q131. Why do we validate the quantity before adding or updating the cart?</w:t>
+      </w:r>
+    </w:p>
+    <w:p>
+      <w:r>
+        <w:rPr>
+          <w:b/>
+          <w:bCs/>
+        </w:rPr>
+        <w:t>Answer:</w:t>
+      </w:r>
+      <w:r>
+        <w:br/>
+        <w:t>To prevent invalid values like 0 or negative numbers from being stored in the database.</w:t>
+      </w:r>
+    </w:p>
+    <w:p>
+      <w:r>
+        <w:pict w14:anchorId="2704637A">
+          <v:rect id="_x0000_i1254" style="width:0;height:1.5pt" o:hralign="center" o:hrstd="t" o:hr="t" fillcolor="#a0a0a0" stroked="f"/>
+        </w:pict>
+      </w:r>
+    </w:p>
+    <w:p>
+      <w:pPr>
+        <w:rPr>
+          <w:b/>
+          <w:bCs/>
+        </w:rPr>
+      </w:pPr>
+      <w:r>
+        <w:rPr>
+          <w:b/>
+          <w:bCs/>
+        </w:rPr>
+        <w:t xml:space="preserve">Q132. Why do we validate the Food </w:t>
+      </w:r>
+      <w:proofErr w:type="spellStart"/>
+      <w:r>
+        <w:rPr>
+          <w:b/>
+          <w:bCs/>
+        </w:rPr>
+        <w:t>ObjectId</w:t>
+      </w:r>
+      <w:proofErr w:type="spellEnd"/>
+      <w:r>
+        <w:rPr>
+          <w:b/>
+          <w:bCs/>
+        </w:rPr>
+        <w:t>?</w:t>
+      </w:r>
+    </w:p>
+    <w:p>
+      <w:r>
+        <w:rPr>
+          <w:b/>
+          <w:bCs/>
+        </w:rPr>
+        <w:t>Answer:</w:t>
+      </w:r>
+      <w:r>
+        <w:br/>
+        <w:t xml:space="preserve">To prevent invalid MongoDB IDs from causing a </w:t>
+      </w:r>
+      <w:proofErr w:type="spellStart"/>
+      <w:r>
+        <w:t>CastError</w:t>
+      </w:r>
+      <w:proofErr w:type="spellEnd"/>
+      <w:r>
+        <w:t xml:space="preserve"> and return a proper 400 Bad Request.</w:t>
+      </w:r>
+    </w:p>
+    <w:p>
+      <w:r>
+        <w:pict w14:anchorId="6E68F87D">
+          <v:rect id="_x0000_i1255" style="width:0;height:1.5pt" o:hralign="center" o:hrstd="t" o:hr="t" fillcolor="#a0a0a0" stroked="f"/>
+        </w:pict>
+      </w:r>
+    </w:p>
+    <w:p>
+      <w:pPr>
+        <w:rPr>
+          <w:b/>
+          <w:bCs/>
+        </w:rPr>
+      </w:pPr>
+      <w:r>
+        <w:rPr>
+          <w:b/>
+          <w:bCs/>
+        </w:rPr>
+        <w:t>Q133. Why do we check whether the food exists before adding it to the cart?</w:t>
+      </w:r>
+    </w:p>
+    <w:p>
+      <w:r>
+        <w:rPr>
+          <w:b/>
+          <w:bCs/>
+        </w:rPr>
+        <w:t>Answer:</w:t>
+      </w:r>
+      <w:r>
+        <w:br/>
+        <w:t>This ensures only valid food items can be added and prevents storing invalid references.</w:t>
+      </w:r>
+    </w:p>
+    <w:p>
+      <w:r>
+        <w:pict w14:anchorId="4C11C3F4">
+          <v:rect id="_x0000_i1256" style="width:0;height:1.5pt" o:hralign="center" o:hrstd="t" o:hr="t" fillcolor="#a0a0a0" stroked="f"/>
+        </w:pict>
+      </w:r>
+    </w:p>
+    <w:p>
+      <w:pPr>
+        <w:rPr>
+          <w:b/>
+          <w:bCs/>
+        </w:rPr>
+      </w:pPr>
+      <w:r>
+        <w:rPr>
+          <w:b/>
+          <w:bCs/>
+        </w:rPr>
+        <w:t>Q134. Which HTTP methods did we use in the Cart module?</w:t>
+      </w:r>
+    </w:p>
+    <w:p>
+      <w:r>
+        <w:rPr>
+          <w:b/>
+          <w:bCs/>
+        </w:rPr>
+        <w:t>Answer:</w:t>
+      </w:r>
+    </w:p>
+    <w:p>
+      <w:pPr>
+        <w:numPr>
+          <w:ilvl w:val="0"/>
+          <w:numId w:val="18"/>
+        </w:numPr>
+      </w:pPr>
+      <w:r>
+        <w:rPr>
+          <w:b/>
+          <w:bCs/>
+        </w:rPr>
+        <w:t>POST</w:t>
+      </w:r>
+      <w:r>
+        <w:t xml:space="preserve"> → Add item </w:t>
+      </w:r>
+    </w:p>
+    <w:p>
+      <w:pPr>
+        <w:numPr>
+          <w:ilvl w:val="0"/>
+          <w:numId w:val="18"/>
+        </w:numPr>
+      </w:pPr>
+      <w:r>
+        <w:rPr>
+          <w:b/>
+          <w:bCs/>
+        </w:rPr>
+        <w:t>GET</w:t>
+      </w:r>
+      <w:r>
+        <w:t xml:space="preserve"> → Fetch cart </w:t>
+      </w:r>
+    </w:p>
+    <w:p>
+      <w:pPr>
+        <w:numPr>
+          <w:ilvl w:val="0"/>
+          <w:numId w:val="18"/>
+        </w:numPr>
+      </w:pPr>
+      <w:r>
+        <w:rPr>
+          <w:b/>
+          <w:bCs/>
+        </w:rPr>
+        <w:t>PUT</w:t>
+      </w:r>
+      <w:r>
+        <w:t xml:space="preserve"> → Update quantity </w:t>
+      </w:r>
+    </w:p>
+    <w:p>
+      <w:pPr>
+        <w:numPr>
+          <w:ilvl w:val="0"/>
+          <w:numId w:val="18"/>
+        </w:numPr>
+      </w:pPr>
+      <w:r>
+        <w:rPr>
+          <w:b/>
+          <w:bCs/>
+        </w:rPr>
+        <w:t>DELETE</w:t>
+      </w:r>
+      <w:r>
+        <w:t xml:space="preserve"> → Remove item / Clear cart </w:t>
+      </w:r>
+    </w:p>
+    <w:p>
+      <w:r>
+        <w:pict w14:anchorId="60973AE2">
+          <v:rect id="_x0000_i1257" style="width:0;height:1.5pt" o:hralign="center" o:hrstd="t" o:hr="t" fillcolor="#a0a0a0" stroked="f"/>
+        </w:pict>
+      </w:r>
+    </w:p>
+    <w:p>
+      <w:pPr>
+        <w:rPr>
+          <w:b/>
+          <w:bCs/>
+        </w:rPr>
+      </w:pPr>
+      <w:r>
+        <w:rPr>
+          <w:b/>
+          <w:bCs/>
+        </w:rPr>
+        <w:t>Q135. Why did we create separate APIs for Remove Item and Clear Cart?</w:t>
+      </w:r>
+    </w:p>
+    <w:p>
+      <w:r>
+        <w:rPr>
+          <w:b/>
+          <w:bCs/>
+        </w:rPr>
+        <w:t>Answer:</w:t>
+      </w:r>
+      <w:r>
+        <w:br/>
+        <w:t>Removing an item deletes only one food item, while Clear Cart removes all items. Keeping them separate follows REST API principles.</w:t>
+      </w:r>
+    </w:p>
+    <w:p>
+      <w:r>
+        <w:pict w14:anchorId="24BAE8BD">
+          <v:rect id="_x0000_i1258" style="width:0;height:1.5pt" o:hralign="center" o:hrstd="t" o:hr="t" fillcolor="#a0a0a0" stroked="f"/>
+        </w:pict>
+      </w:r>
+    </w:p>
+    <w:p>
+      <w:pPr>
+        <w:rPr>
+          <w:b/>
+          <w:bCs/>
+        </w:rPr>
+      </w:pPr>
+      <w:r>
+        <w:rPr>
+          <w:b/>
+          <w:bCs/>
+        </w:rPr>
+        <w:t xml:space="preserve">Q136. Why do we create </w:t>
+      </w:r>
+      <w:proofErr w:type="spellStart"/>
+      <w:proofErr w:type="gramStart"/>
+      <w:r>
+        <w:rPr>
+          <w:b/>
+          <w:bCs/>
+        </w:rPr>
+        <w:t>fetchCart</w:t>
+      </w:r>
+      <w:proofErr w:type="spellEnd"/>
+      <w:r>
+        <w:rPr>
+          <w:b/>
+          <w:bCs/>
+        </w:rPr>
+        <w:t>(</w:t>
+      </w:r>
+      <w:proofErr w:type="gramEnd"/>
+      <w:r>
+        <w:rPr>
+          <w:b/>
+          <w:bCs/>
+        </w:rPr>
+        <w:t>) in React?</w:t>
+      </w:r>
+    </w:p>
+    <w:p>
+      <w:r>
+        <w:rPr>
+          <w:b/>
+          <w:bCs/>
+        </w:rPr>
+        <w:lastRenderedPageBreak/>
+        <w:t>Answer:</w:t>
+      </w:r>
+      <w:r>
+        <w:br/>
+      </w:r>
+      <w:proofErr w:type="spellStart"/>
+      <w:proofErr w:type="gramStart"/>
+      <w:r>
+        <w:t>fetchCart</w:t>
+      </w:r>
+      <w:proofErr w:type="spellEnd"/>
+      <w:r>
+        <w:t>(</w:t>
+      </w:r>
+      <w:proofErr w:type="gramEnd"/>
+      <w:r>
+        <w:t>) is reusable. It is called when the page loads and after updating, removing, or clearing items to refresh the UI.</w:t>
+      </w:r>
+    </w:p>
+    <w:p>
+      <w:r>
+        <w:pict w14:anchorId="317F5F12">
+          <v:rect id="_x0000_i1259" style="width:0;height:1.5pt" o:hralign="center" o:hrstd="t" o:hr="t" fillcolor="#a0a0a0" stroked="f"/>
+        </w:pict>
+      </w:r>
+    </w:p>
+    <w:p>
+      <w:pPr>
+        <w:rPr>
+          <w:b/>
+          <w:bCs/>
+        </w:rPr>
+      </w:pPr>
+      <w:r>
+        <w:rPr>
+          <w:b/>
+          <w:bCs/>
+        </w:rPr>
+        <w:t xml:space="preserve">Q137. Why do we call </w:t>
+      </w:r>
+      <w:proofErr w:type="spellStart"/>
+      <w:proofErr w:type="gramStart"/>
+      <w:r>
+        <w:rPr>
+          <w:b/>
+          <w:bCs/>
+        </w:rPr>
+        <w:t>fetchCart</w:t>
+      </w:r>
+      <w:proofErr w:type="spellEnd"/>
+      <w:r>
+        <w:rPr>
+          <w:b/>
+          <w:bCs/>
+        </w:rPr>
+        <w:t>(</w:t>
+      </w:r>
+      <w:proofErr w:type="gramEnd"/>
+      <w:r>
+        <w:rPr>
+          <w:b/>
+          <w:bCs/>
+        </w:rPr>
+        <w:t>) after every cart operation?</w:t>
+      </w:r>
+    </w:p>
+    <w:p>
+      <w:r>
+        <w:rPr>
+          <w:b/>
+          <w:bCs/>
+        </w:rPr>
+        <w:t>Answer:</w:t>
+      </w:r>
+      <w:r>
+        <w:br/>
+        <w:t>It fetches the latest data from MongoDB so the frontend always stays synchronized with the backend.</w:t>
+      </w:r>
+    </w:p>
+    <w:p>
+      <w:r>
+        <w:pict w14:anchorId="7E6F0928">
+          <v:rect id="_x0000_i1260" style="width:0;height:1.5pt" o:hralign="center" o:hrstd="t" o:hr="t" fillcolor="#a0a0a0" stroked="f"/>
+        </w:pict>
+      </w:r>
+    </w:p>
+    <w:p>
+      <w:pPr>
+        <w:rPr>
+          <w:b/>
+          <w:bCs/>
+        </w:rPr>
+      </w:pPr>
+      <w:r>
+        <w:rPr>
+          <w:b/>
+          <w:bCs/>
+        </w:rPr>
+        <w:t>Q138. Why do we send the JWT in every Cart request?</w:t>
+      </w:r>
+    </w:p>
+    <w:p>
+      <w:r>
+        <w:rPr>
+          <w:b/>
+          <w:bCs/>
+        </w:rPr>
+        <w:t>Answer:</w:t>
+      </w:r>
+      <w:r>
+        <w:br/>
+        <w:t>The Cart APIs are protected. The JWT identifies the logged-in user so the backend knows which cart to access.</w:t>
+      </w:r>
+    </w:p>
+    <w:p>
+      <w:r>
+        <w:pict w14:anchorId="04BF38A6">
+          <v:rect id="_x0000_i1261" style="width:0;height:1.5pt" o:hralign="center" o:hrstd="t" o:hr="t" fillcolor="#a0a0a0" stroked="f"/>
+        </w:pict>
+      </w:r>
+    </w:p>
+    <w:p>
+      <w:pPr>
+        <w:rPr>
+          <w:b/>
+          <w:bCs/>
+        </w:rPr>
+      </w:pPr>
+      <w:r>
+        <w:rPr>
+          <w:b/>
+          <w:bCs/>
+        </w:rPr>
+        <w:t>Q139. How is the Grand Total calculated?</w:t>
+      </w:r>
+    </w:p>
+    <w:p>
+      <w:r>
+        <w:rPr>
+          <w:b/>
+          <w:bCs/>
+        </w:rPr>
+        <w:t>Answer:</w:t>
+      </w:r>
+      <w:r>
+        <w:br/>
+        <w:t xml:space="preserve">We use JavaScript's </w:t>
+      </w:r>
+      <w:proofErr w:type="gramStart"/>
+      <w:r>
+        <w:t>reduce(</w:t>
+      </w:r>
+      <w:proofErr w:type="gramEnd"/>
+      <w:r>
+        <w:t>) method to sum the subtotal of every cart item.</w:t>
+      </w:r>
+    </w:p>
+    <w:p>
+      <w:r>
+        <w:t>Example:</w:t>
+      </w:r>
+    </w:p>
+    <w:p>
+      <w:r>
+        <w:t xml:space="preserve">const total = </w:t>
+      </w:r>
+      <w:proofErr w:type="spellStart"/>
+      <w:proofErr w:type="gramStart"/>
+      <w:r>
+        <w:t>cart.reduce</w:t>
+      </w:r>
+      <w:proofErr w:type="spellEnd"/>
+      <w:proofErr w:type="gramEnd"/>
+      <w:r>
+        <w:t>(</w:t>
+      </w:r>
+    </w:p>
+    <w:p>
+      <w:r>
+        <w:t xml:space="preserve">  (sum, item) =&gt; sum + </w:t>
+      </w:r>
+      <w:proofErr w:type="spellStart"/>
+      <w:proofErr w:type="gramStart"/>
+      <w:r>
+        <w:t>item.food</w:t>
+      </w:r>
+      <w:proofErr w:type="gramEnd"/>
+      <w:r>
+        <w:t>.price</w:t>
+      </w:r>
+      <w:proofErr w:type="spellEnd"/>
+      <w:r>
+        <w:t xml:space="preserve"> * </w:t>
+      </w:r>
+      <w:proofErr w:type="spellStart"/>
+      <w:proofErr w:type="gramStart"/>
+      <w:r>
+        <w:t>item.quantity</w:t>
+      </w:r>
+      <w:proofErr w:type="spellEnd"/>
+      <w:proofErr w:type="gramEnd"/>
+      <w:r>
+        <w:t>,</w:t>
+      </w:r>
+    </w:p>
+    <w:p>
+      <w:r>
+        <w:t xml:space="preserve">  0</w:t>
+      </w:r>
+    </w:p>
+    <w:p>
+      <w:r>
+        <w:t>);</w:t>
+      </w:r>
+    </w:p>
+    <w:p>
+      <w:r>
+        <w:pict w14:anchorId="36ECE82F">
+          <v:rect id="_x0000_i1262" style="width:0;height:1.5pt" o:hralign="center" o:hrstd="t" o:hr="t" fillcolor="#a0a0a0" stroked="f"/>
+        </w:pict>
+      </w:r>
+    </w:p>
+    <w:p>
+      <w:pPr>
+        <w:rPr>
+          <w:b/>
+          <w:bCs/>
+        </w:rPr>
+      </w:pPr>
+      <w:r>
+        <w:rPr>
+          <w:b/>
+          <w:bCs/>
+        </w:rPr>
+        <w:t xml:space="preserve">Q140. What is the complete Cart workflow in </w:t>
+      </w:r>
+      <w:proofErr w:type="spellStart"/>
+      <w:r>
+        <w:rPr>
+          <w:b/>
+          <w:bCs/>
+        </w:rPr>
+        <w:t>FoodHub</w:t>
+      </w:r>
+      <w:proofErr w:type="spellEnd"/>
+      <w:r>
+        <w:rPr>
+          <w:b/>
+          <w:bCs/>
+        </w:rPr>
+        <w:t>?</w:t>
+      </w:r>
+    </w:p>
+    <w:p>
+      <w:r>
+        <w:rPr>
+          <w:b/>
+          <w:bCs/>
+        </w:rPr>
+        <w:t>Answer:</w:t>
+      </w:r>
+    </w:p>
+    <w:p>
+      <w:pPr>
+        <w:spacing w:after="0"/>
+      </w:pPr>
+      <w:r>
+        <w:t>User clicks Add to Cart</w:t>
+      </w:r>
+    </w:p>
+    <w:p>
+      <w:pPr>
+        <w:spacing w:after="0"/>
+      </w:pPr>
+      <w:r>
+        <w:t xml:space="preserve">        │</w:t>
+      </w:r>
+    </w:p>
+    <w:p>
+      <w:pPr>
+        <w:spacing w:after="0"/>
+      </w:pPr>
+      <w:r>
+        <w:t xml:space="preserve">        </w:t>
+      </w:r>
+      <w:r>
+        <w:rPr>
+          <w:rFonts w:ascii="Arial" w:hAnsi="Arial" w:cs="Arial"/>
+        </w:rPr>
+        <w:t>▼</w:t>
+      </w:r>
+    </w:p>
+    <w:p>
+      <w:pPr>
+        <w:spacing w:after="0"/>
+      </w:pPr>
+      <w:r>
+        <w:t>React sends POST request</w:t>
+      </w:r>
+    </w:p>
+    <w:p>
+      <w:pPr>
+        <w:spacing w:after="0"/>
+      </w:pPr>
+      <w:r>
+        <w:lastRenderedPageBreak/>
+        <w:t xml:space="preserve">        │</w:t>
+      </w:r>
+    </w:p>
+    <w:p>
+      <w:pPr>
+        <w:spacing w:after="0"/>
+      </w:pPr>
+      <w:r>
+        <w:t xml:space="preserve">        </w:t>
+      </w:r>
+      <w:r>
+        <w:rPr>
+          <w:rFonts w:ascii="Arial" w:hAnsi="Arial" w:cs="Arial"/>
+        </w:rPr>
+        <w:t>▼</w:t>
+      </w:r>
+    </w:p>
+    <w:p>
+      <w:pPr>
+        <w:spacing w:after="0"/>
+      </w:pPr>
+      <w:r>
+        <w:t>JWT Authentication</w:t>
+      </w:r>
+    </w:p>
+    <w:p>
+      <w:pPr>
+        <w:spacing w:after="0"/>
+      </w:pPr>
+      <w:r>
+        <w:t xml:space="preserve">        │</w:t>
+      </w:r>
+    </w:p>
+    <w:p>
+      <w:pPr>
+        <w:spacing w:after="0"/>
+      </w:pPr>
+      <w:r>
+        <w:t xml:space="preserve">        </w:t>
+      </w:r>
+      <w:r>
+        <w:rPr>
+          <w:rFonts w:ascii="Arial" w:hAnsi="Arial" w:cs="Arial"/>
+        </w:rPr>
+        <w:t>▼</w:t>
+      </w:r>
+    </w:p>
+    <w:p>
+      <w:pPr>
+        <w:spacing w:after="0"/>
+      </w:pPr>
+      <w:r>
+        <w:t>Cart Controller</w:t>
+      </w:r>
+    </w:p>
+    <w:p>
+      <w:pPr>
+        <w:spacing w:after="0"/>
+      </w:pPr>
+      <w:r>
+        <w:t xml:space="preserve">        │</w:t>
+      </w:r>
+    </w:p>
+    <w:p>
+      <w:pPr>
+        <w:spacing w:after="0"/>
+      </w:pPr>
+      <w:r>
+        <w:t xml:space="preserve">        </w:t>
+      </w:r>
+      <w:r>
+        <w:rPr>
+          <w:rFonts w:ascii="Arial" w:hAnsi="Arial" w:cs="Arial"/>
+        </w:rPr>
+        <w:t>▼</w:t>
+      </w:r>
+    </w:p>
+    <w:p>
+      <w:pPr>
+        <w:spacing w:after="0"/>
+      </w:pPr>
+      <w:r>
+        <w:t>MongoDB</w:t>
+      </w:r>
+    </w:p>
+    <w:p>
+      <w:pPr>
+        <w:spacing w:after="0"/>
+      </w:pPr>
+      <w:r>
+        <w:t xml:space="preserve">        │</w:t>
+      </w:r>
+    </w:p>
+    <w:p>
+      <w:pPr>
+        <w:spacing w:after="0"/>
+      </w:pPr>
+      <w:r>
+        <w:t xml:space="preserve">        </w:t>
+      </w:r>
+      <w:r>
+        <w:rPr>
+          <w:rFonts w:ascii="Arial" w:hAnsi="Arial" w:cs="Arial"/>
+        </w:rPr>
+        <w:t>▼</w:t>
+      </w:r>
+    </w:p>
+    <w:p>
+      <w:pPr>
+        <w:spacing w:after="0"/>
+      </w:pPr>
+      <w:r>
+        <w:t>Cart Page fetches updated data</w:t>
+      </w:r>
+    </w:p>
+    <w:p>
+      <w:pPr>
+        <w:spacing w:after="0"/>
+      </w:pPr>
+      <w:r>
+        <w:t xml:space="preserve">        │</w:t>
+      </w:r>
+    </w:p>
+    <w:p>
+      <w:pPr>
+        <w:spacing w:after="0"/>
+      </w:pPr>
+      <w:r>
+        <w:t xml:space="preserve">        </w:t>
+      </w:r>
+      <w:r>
+        <w:rPr>
+          <w:rFonts w:ascii="Arial" w:hAnsi="Arial" w:cs="Arial"/>
+        </w:rPr>
+        <w:t>▼</w:t>
+      </w:r>
+    </w:p>
+    <w:p>
+      <w:pPr>
+        <w:spacing w:after="0"/>
+      </w:pPr>
+      <w:r>
+        <w:t>User can Update / Remove / Clear Cart</w:t>
+      </w:r>
+    </w:p>
+    <w:p>
+      <w:pPr>
+        <w:spacing w:after="0"/>
+      </w:pPr>
+      <w:r>
+        <w:pict w14:anchorId="39942F89">
+          <v:rect id="_x0000_i1263" style="width:0;height:1.5pt" o:hralign="center" o:hrstd="t" o:hr="t" fillcolor="#a0a0a0" stroked="f"/>
+        </w:pict>
+      </w:r>
+    </w:p>
+    <w:p>
+      <w:pPr>
+        <w:rPr>
+          <w:b/>
+          <w:bCs/>
+        </w:rPr>
+      </w:pPr>
+      <w:r>
+        <w:rPr>
+          <w:b/>
+          <w:bCs/>
+        </w:rPr>
+        <w:t>Q141. How did we test the Auth Middleware in our project?</w:t>
+      </w:r>
+    </w:p>
+    <w:p>
+      <w:r>
+        <w:rPr>
+          <w:b/>
+          <w:bCs/>
+        </w:rPr>
+        <w:t>Answer:</w:t>
+      </w:r>
+      <w:r>
+        <w:br/>
+        <w:t>We tested it using both Postman and React.</w:t>
+      </w:r>
+    </w:p>
+    <w:p>
+      <w:pPr>
+        <w:numPr>
+          <w:ilvl w:val="0"/>
+          <w:numId w:val="19"/>
+        </w:numPr>
+      </w:pPr>
+      <w:r>
+        <w:t xml:space="preserve">Without JWT → 401 Unauthorized </w:t>
+      </w:r>
+    </w:p>
+    <w:p>
+      <w:pPr>
+        <w:numPr>
+          <w:ilvl w:val="0"/>
+          <w:numId w:val="19"/>
+        </w:numPr>
+      </w:pPr>
+      <w:r>
+        <w:t xml:space="preserve">Invalid JWT → 401 Unauthorized </w:t>
+      </w:r>
+    </w:p>
+    <w:p>
+      <w:pPr>
+        <w:numPr>
+          <w:ilvl w:val="0"/>
+          <w:numId w:val="19"/>
+        </w:numPr>
+      </w:pPr>
+      <w:r>
+        <w:t xml:space="preserve">Valid JWT → Access granted to all Cart APIs </w:t>
+      </w:r>
+    </w:p>
+    <w:p>
+      <w:r>
+        <w:t>This confirmed the middleware was working correctly.</w:t>
+      </w:r>
+    </w:p>
+    <w:p>
+      <w:r>
+        <w:pict w14:anchorId="04F07A28">
+          <v:rect id="_x0000_i1264" style="width:0;height:1.5pt" o:hralign="center" o:hrstd="t" o:hr="t" fillcolor="#a0a0a0" stroked="f"/>
+        </w:pict>
+      </w:r>
+    </w:p>
+    <w:p>
+      <w:pPr>
+        <w:rPr>
+          <w:b/>
+          <w:bCs/>
+        </w:rPr>
+      </w:pPr>
+      <w:r>
+        <w:rPr>
+          <w:b/>
+          <w:bCs/>
+        </w:rPr>
+        <w:t>Q142. Why is the Cart module implemented before Checkout?</w:t>
+      </w:r>
+    </w:p>
+    <w:p>
+      <w:r>
+        <w:rPr>
+          <w:b/>
+          <w:bCs/>
+        </w:rPr>
+        <w:t>Answer:</w:t>
+      </w:r>
+      <w:r>
+        <w:br/>
+        <w:t>Checkout depends on the selected cart items. Users must first manage their cart before selecting an address and placing an order.</w:t>
+      </w:r>
+    </w:p>
+    <w:p>
+      <w:r>
+        <w:pict w14:anchorId="682BEDBC">
+          <v:rect id="_x0000_i1291" style="width:0;height:1.5pt" o:hralign="center" o:hrstd="t" o:hr="t" fillcolor="#a0a0a0" stroked="f"/>
+        </w:pict>
+      </w:r>
+    </w:p>
+    <w:p>
+      <w:pPr>
+        <w:rPr>
+          <w:b/>
+          <w:bCs/>
+        </w:rPr>
+      </w:pPr>
+    </w:p>
+    <w:p>
+      <w:pPr>
+        <w:rPr>
+          <w:b/>
+          <w:bCs/>
+        </w:rPr>
+      </w:pPr>
+    </w:p>
+    <w:p>
+      <w:r>
+        <w:rPr>
+          <w:b/>
+          <w:bCs/>
+        </w:rPr>
+        <w:lastRenderedPageBreak/>
+        <w:t>Q143. Why did we create a separate Address collection instead of storing addresses inside the User document?</w:t>
+      </w:r>
+    </w:p>
+    <w:p>
+      <w:r>
+        <w:rPr>
+          <w:b/>
+          <w:bCs/>
+        </w:rPr>
+        <w:t>Answer:</w:t>
+      </w:r>
+    </w:p>
+    <w:p>
+      <w:r>
+        <w:t>A user can have multiple addresses. Creating a separate Address collection avoids embedding large amounts of data in the User document, simplifies CRUD operations, and follows a scalable one-to-many database design.</w:t>
+      </w:r>
+    </w:p>
+    <w:p>
+      <w:r>
+        <w:pict w14:anchorId="15F3D8D4">
+          <v:rect id="_x0000_i1292" style="width:0;height:1.5pt" o:hralign="center" o:hrstd="t" o:hr="t" fillcolor="#a0a0a0" stroked="f"/>
+        </w:pict>
+      </w:r>
+    </w:p>
+    <w:p>
+      <w:pPr>
+        <w:rPr>
+          <w:b/>
+          <w:bCs/>
+        </w:rPr>
+      </w:pPr>
+      <w:r>
+        <w:rPr>
+          <w:b/>
+          <w:bCs/>
+        </w:rPr>
+        <w:t>Q144. Why do we use req.user.id while creating an address?</w:t>
+      </w:r>
+    </w:p>
+    <w:p>
+      <w:r>
+        <w:rPr>
+          <w:b/>
+          <w:bCs/>
+        </w:rPr>
+        <w:t>Answer:</w:t>
+      </w:r>
+    </w:p>
+    <w:p>
+      <w:r>
+        <w:t xml:space="preserve">The authenticated user's ID is obtained from the verified JWT in </w:t>
+      </w:r>
+      <w:proofErr w:type="spellStart"/>
+      <w:r>
+        <w:t>authMiddleware</w:t>
+      </w:r>
+      <w:proofErr w:type="spellEnd"/>
+      <w:r>
+        <w:t>. This is more secure than accepting a user ID from the frontend because the client cannot impersonate another user.</w:t>
+      </w:r>
+    </w:p>
+    <w:p>
+      <w:r>
+        <w:pict w14:anchorId="6C2FC0BE">
+          <v:rect id="_x0000_i1293" style="width:0;height:1.5pt" o:hralign="center" o:hrstd="t" o:hr="t" fillcolor="#a0a0a0" stroked="f"/>
+        </w:pict>
+      </w:r>
+    </w:p>
+    <w:p>
+      <w:pPr>
+        <w:rPr>
+          <w:b/>
+          <w:bCs/>
+        </w:rPr>
+      </w:pPr>
+      <w:r>
+        <w:rPr>
+          <w:b/>
+          <w:bCs/>
+        </w:rPr>
+        <w:t xml:space="preserve">Q145. Why is the Address API protected using </w:t>
+      </w:r>
+      <w:proofErr w:type="spellStart"/>
+      <w:r>
+        <w:rPr>
+          <w:b/>
+          <w:bCs/>
+        </w:rPr>
+        <w:t>authMiddleware</w:t>
+      </w:r>
+      <w:proofErr w:type="spellEnd"/>
+      <w:r>
+        <w:rPr>
+          <w:b/>
+          <w:bCs/>
+        </w:rPr>
+        <w:t>?</w:t>
+      </w:r>
+    </w:p>
+    <w:p>
+      <w:r>
+        <w:rPr>
+          <w:b/>
+          <w:bCs/>
+        </w:rPr>
+        <w:t>Answer:</w:t>
+      </w:r>
+    </w:p>
+    <w:p>
+      <w:r>
+        <w:t xml:space="preserve">Addresses are user-specific data. Using </w:t>
+      </w:r>
+      <w:proofErr w:type="spellStart"/>
+      <w:r>
+        <w:t>authMiddleware</w:t>
+      </w:r>
+      <w:proofErr w:type="spellEnd"/>
+      <w:r>
+        <w:t xml:space="preserve"> ensures that only the logged-in user can create and manage their own addresses.</w:t>
+      </w:r>
+    </w:p>
+    <w:p>
+      <w:r>
+        <w:pict w14:anchorId="2D9EF7D5">
+          <v:rect id="_x0000_i1289" style="width:0;height:1.5pt" o:hralign="center" o:hrstd="t" o:hr="t" fillcolor="#a0a0a0" stroked="f"/>
+        </w:pict>
+      </w:r>
+    </w:p>
+    <w:p>
+      <w:pPr>
+        <w:rPr>
+          <w:b/>
+          <w:bCs/>
+        </w:rPr>
+      </w:pPr>
+      <w:r>
+        <w:rPr>
+          <w:b/>
+          <w:bCs/>
+        </w:rPr>
+        <w:t>Q146. Why do we use POST for adding an address?</w:t>
+      </w:r>
+    </w:p>
+    <w:p>
+      <w:r>
+        <w:rPr>
+          <w:b/>
+          <w:bCs/>
+        </w:rPr>
+        <w:t>Answer:</w:t>
+      </w:r>
+    </w:p>
+    <w:p>
+      <w:r>
+        <w:t>POST is used to create a new resource. Since adding an address creates a new document in the Address collection, POST is the appropriate HTTP method.</w:t>
+      </w:r>
+    </w:p>
+    <w:p>
+      <w:r>
+        <w:pict w14:anchorId="270F3FD1">
+          <v:rect id="_x0000_i1310" style="width:0;height:1.5pt" o:hralign="center" o:hrstd="t" o:hr="t" fillcolor="#a0a0a0" stroked="f"/>
+        </w:pict>
+      </w:r>
+    </w:p>
+    <w:p>
+      <w:pPr>
+        <w:rPr>
+          <w:b/>
+          <w:bCs/>
+        </w:rPr>
+      </w:pPr>
+      <w:r>
+        <w:rPr>
+          <w:b/>
+          <w:bCs/>
+        </w:rPr>
+        <w:t xml:space="preserve">Q147. Why do we use </w:t>
+      </w:r>
+      <w:proofErr w:type="gramStart"/>
+      <w:r>
+        <w:rPr>
+          <w:b/>
+          <w:bCs/>
+        </w:rPr>
+        <w:t>find({ user</w:t>
+      </w:r>
+      <w:proofErr w:type="gramEnd"/>
+      <w:r>
+        <w:rPr>
+          <w:b/>
+          <w:bCs/>
+        </w:rPr>
+        <w:t xml:space="preserve"> }) instead of </w:t>
+      </w:r>
+      <w:proofErr w:type="gramStart"/>
+      <w:r>
+        <w:rPr>
+          <w:b/>
+          <w:bCs/>
+        </w:rPr>
+        <w:t>find(</w:t>
+      </w:r>
+      <w:proofErr w:type="gramEnd"/>
+      <w:r>
+        <w:rPr>
+          <w:b/>
+          <w:bCs/>
+        </w:rPr>
+        <w:t>) while fetching addresses?</w:t>
+      </w:r>
+    </w:p>
+    <w:p>
+      <w:r>
+        <w:rPr>
+          <w:b/>
+          <w:bCs/>
+        </w:rPr>
+        <w:t>Answer:</w:t>
+      </w:r>
+    </w:p>
+    <w:p>
+      <w:r>
+        <w:t>Each user should only see their own saved addresses. Filtering by user ensures that addresses belonging to other users are never returned.</w:t>
+      </w:r>
+    </w:p>
+    <w:p>
+      <w:r>
+        <w:pict w14:anchorId="587D985D">
+          <v:rect id="_x0000_i1306" style="width:0;height:1.5pt" o:hralign="center" o:hrstd="t" o:hr="t" fillcolor="#a0a0a0" stroked="f"/>
+        </w:pict>
+      </w:r>
+    </w:p>
+    <w:p>
+      <w:pPr>
+        <w:rPr>
+          <w:b/>
+          <w:bCs/>
+        </w:rPr>
+      </w:pPr>
+      <w:r>
+        <w:rPr>
+          <w:b/>
+          <w:bCs/>
+        </w:rPr>
+        <w:lastRenderedPageBreak/>
+        <w:t xml:space="preserve">Q148. Why do we use </w:t>
+      </w:r>
+      <w:proofErr w:type="spellStart"/>
+      <w:proofErr w:type="gramStart"/>
+      <w:r>
+        <w:rPr>
+          <w:b/>
+          <w:bCs/>
+        </w:rPr>
+        <w:t>findOne</w:t>
+      </w:r>
+      <w:proofErr w:type="spellEnd"/>
+      <w:r>
+        <w:rPr>
+          <w:b/>
+          <w:bCs/>
+        </w:rPr>
+        <w:t>({ _</w:t>
+      </w:r>
+      <w:proofErr w:type="gramEnd"/>
+      <w:r>
+        <w:rPr>
+          <w:b/>
+          <w:bCs/>
+        </w:rPr>
+        <w:t xml:space="preserve">id: id, </w:t>
+      </w:r>
+      <w:proofErr w:type="gramStart"/>
+      <w:r>
+        <w:rPr>
+          <w:b/>
+          <w:bCs/>
+        </w:rPr>
+        <w:t>user }</w:t>
+      </w:r>
+      <w:proofErr w:type="gramEnd"/>
+      <w:r>
+        <w:rPr>
+          <w:b/>
+          <w:bCs/>
+        </w:rPr>
+        <w:t>) while updating an address?</w:t>
+      </w:r>
+    </w:p>
+    <w:p>
+      <w:r>
+        <w:rPr>
+          <w:b/>
+          <w:bCs/>
+        </w:rPr>
+        <w:t>Answer:</w:t>
+      </w:r>
+    </w:p>
+    <w:p>
+      <w:r>
+        <w:t>It verifies both the address ID and the logged-in user. This prevents a user from updating another user's address even if they know its ID.</w:t>
+      </w:r>
+    </w:p>
+    <w:p>
+      <w:r>
+        <w:pict w14:anchorId="654B0DC3">
+          <v:rect id="_x0000_i1307" style="width:0;height:1.5pt" o:hralign="center" o:hrstd="t" o:hr="t" fillcolor="#a0a0a0" stroked="f"/>
+        </w:pict>
+      </w:r>
+    </w:p>
+    <w:p>
+      <w:pPr>
+        <w:rPr>
+          <w:b/>
+          <w:bCs/>
+        </w:rPr>
+      </w:pPr>
+      <w:r>
+        <w:rPr>
+          <w:b/>
+          <w:bCs/>
+        </w:rPr>
+        <w:t>Q149. Why do we validate the Address ID before querying MongoDB?</w:t>
+      </w:r>
+    </w:p>
+    <w:p>
+      <w:r>
+        <w:rPr>
+          <w:b/>
+          <w:bCs/>
+        </w:rPr>
+        <w:t>Answer:</w:t>
+      </w:r>
+    </w:p>
+    <w:p>
+      <w:r>
+        <w:t xml:space="preserve">Validating the </w:t>
+      </w:r>
+      <w:proofErr w:type="spellStart"/>
+      <w:r>
+        <w:t>ObjectId</w:t>
+      </w:r>
+      <w:proofErr w:type="spellEnd"/>
+      <w:r>
+        <w:t xml:space="preserve"> prevents Mongoose </w:t>
+      </w:r>
+      <w:proofErr w:type="spellStart"/>
+      <w:r>
+        <w:t>CastErrors</w:t>
+      </w:r>
+      <w:proofErr w:type="spellEnd"/>
+      <w:r>
+        <w:t xml:space="preserve"> and allows the API to return a clean 400 Bad Request for invalid IDs.</w:t>
+      </w:r>
+    </w:p>
+    <w:p>
+      <w:r>
+        <w:pict w14:anchorId="1BDF5AC5">
+          <v:rect id="_x0000_i1319" style="width:0;height:1.5pt" o:hralign="center" o:hrstd="t" o:hr="t" fillcolor="#a0a0a0" stroked="f"/>
+        </w:pict>
+      </w:r>
+    </w:p>
+    <w:p>
+      <w:pPr>
+        <w:rPr>
+          <w:b/>
+          <w:bCs/>
+        </w:rPr>
+      </w:pPr>
+      <w:r>
+        <w:rPr>
+          <w:b/>
+          <w:bCs/>
+        </w:rPr>
+        <w:t xml:space="preserve">Q152. Why did we add the </w:t>
+      </w:r>
+      <w:proofErr w:type="spellStart"/>
+      <w:r>
+        <w:rPr>
+          <w:b/>
+          <w:bCs/>
+        </w:rPr>
+        <w:t>isDefault</w:t>
+      </w:r>
+      <w:proofErr w:type="spellEnd"/>
+      <w:r>
+        <w:rPr>
+          <w:b/>
+          <w:bCs/>
+        </w:rPr>
+        <w:t xml:space="preserve"> field to the Address model?</w:t>
+      </w:r>
+    </w:p>
+    <w:p>
+      <w:r>
+        <w:rPr>
+          <w:b/>
+          <w:bCs/>
+        </w:rPr>
+        <w:t>Answer:</w:t>
+      </w:r>
+    </w:p>
+    <w:p>
+      <w:r>
+        <w:t xml:space="preserve">A user can save multiple addresses. The </w:t>
+      </w:r>
+      <w:proofErr w:type="spellStart"/>
+      <w:r>
+        <w:t>isDefault</w:t>
+      </w:r>
+      <w:proofErr w:type="spellEnd"/>
+      <w:r>
+        <w:t xml:space="preserve"> field identifies the primary address, allowing the application to automatically select it during checkout and improve the user experience.</w:t>
+      </w:r>
+    </w:p>
+    <w:p>
+      <w:r>
+        <w:pict w14:anchorId="66E47EBA">
+          <v:rect id="_x0000_i1317" style="width:0;height:1.5pt" o:hralign="center" o:hrstd="t" o:hr="t" fillcolor="#a0a0a0" stroked="f"/>
+        </w:pict>
+      </w:r>
+    </w:p>
+    <w:p>
+      <w:pPr>
+        <w:rPr>
+          <w:b/>
+          <w:bCs/>
+        </w:rPr>
+      </w:pPr>
+      <w:r>
+        <w:rPr>
+          <w:b/>
+          <w:bCs/>
+        </w:rPr>
+        <w:t>Q153. Why is the first address marked as the default?</w:t>
+      </w:r>
+    </w:p>
+    <w:p>
+      <w:r>
+        <w:rPr>
+          <w:b/>
+          <w:bCs/>
+        </w:rPr>
+        <w:t>Answer:</w:t>
+      </w:r>
+    </w:p>
+    <w:p>
+      <w:r>
+        <w:t>When a user adds their first address, there are no existing addresses to choose from. Making it the default automatically avoids requiring an extra selection step during checkout.</w:t>
       </w:r>
     </w:p>
     <w:p/>
@@ -14878,9 +16536,9 @@
 <file path=word/numbering.xml><?xml version="1.0" encoding="utf-8"?>
 <w:numbering xmlns:wpc="http://schemas.microsoft.com/office/word/2010/wordprocessingCanvas" xmlns:cx="http://schemas.microsoft.com/office/drawing/2014/chartex" xmlns:cx1="http://schemas.microsoft.com/office/drawing/2015/9/8/chartex" xmlns:cx2="http://schemas.microsoft.com/office/drawing/2015/10/21/chartex" xmlns:cx3="http://schemas.microsoft.com/office/drawing/2016/5/9/chartex" xmlns:cx4="http://schemas.microsoft.com/office/drawing/2016/5/10/chartex" xmlns:cx5="http://schemas.microsoft.com/office/drawing/2016/5/11/chartex" xmlns:cx6="http://schemas.microsoft.com/office/drawing/2016/5/12/chartex" xmlns:cx7="http://schemas.microsoft.com/office/drawing/2016/5/13/chartex" xmlns:cx8="http://schemas.microsoft.com/office/drawing/2016/5/14/chartex" xmlns:mc="http://schemas.openxmlformats.org/markup-compatibility/2006" xmlns:aink="http://schemas.microsoft.com/office/drawing/2016/ink" xmlns:am3d="http://schemas.microsoft.com/office/drawing/2017/model3d" xmlns:o="urn:schemas-microsoft-com:office:office" xmlns:oel="http://schemas.microsoft.com/office/2019/extlst" xmlns:r="http://schemas.openxmlformats.org/officeDocument/2006/relationships" xmlns:m="http://schemas.openxmlformats.org/officeDocument/2006/math" xmlns:v="urn:schemas-microsoft-com:vml" xmlns:wp14="http://schemas.microsoft.com/office/word/2010/wordprocessingDrawing" xmlns:wp="http://schemas.openxmlformats.org/drawingml/2006/wordprocessingDrawing" xmlns:w10="urn:schemas-microsoft-com:office:word" xmlns:w="http://schemas.openxmlformats.org/wordprocessingml/2006/main" xmlns:w14="http://schemas.microsoft.com/office/word/2010/wordml" xmlns:w15="http://schemas.microsoft.com/office/word/2012/wordml" xmlns:w16cex="http://schemas.microsoft.com/office/word/2018/wordml/cex" xmlns:w16cid="http://schemas.microsoft.com/office/word/2016/wordml/cid" xmlns:w16="http://schemas.microsoft.com/office/word/2018/wordml" xmlns:w16du="http://schemas.microsoft.com/office/word/2023/wordml/word16du" xmlns:w16sdtdh="http://schemas.microsoft.com/office/word/2020/wordml/sdtdatahash" xmlns:w16sdtfl="http://schemas.microsoft.com/office/word/2024/wordml/sdtformatlock" xmlns:w16se="http://schemas.microsoft.com/office/word/2015/wordml/symex" xmlns:wpg="http://schemas.microsoft.com/office/word/2010/wordprocessingGroup" xmlns:wpi="http://schemas.microsoft.com/office/word/2010/wordprocessingInk" xmlns:wne="http://schemas.microsoft.com/office/word/2006/wordml" xmlns:wps="http://schemas.microsoft.com/office/word/2010/wordprocessingShape" mc:Ignorable="w14 w15 w16se w16cid w16 w16cex w16sdtdh w16sdtfl w16du wp14">
   <w:abstractNum w:abstractNumId="0" w15:restartNumberingAfterBreak="0">
-    <w:nsid w:val="14C32C3C"/>
+    <w:nsid w:val="00347407"/>
     <w:multiLevelType w:val="multilevel"/>
-    <w:tmpl w:val="74960048"/>
+    <w:tmpl w:val="07D85A36"/>
     <w:lvl w:ilvl="0">
       <w:start w:val="1"/>
       <w:numFmt w:val="bullet"/>
@@ -15027,9 +16685,9 @@
     </w:lvl>
   </w:abstractNum>
   <w:abstractNum w:abstractNumId="1" w15:restartNumberingAfterBreak="0">
-    <w:nsid w:val="1AC77633"/>
+    <w:nsid w:val="14C32C3C"/>
     <w:multiLevelType w:val="multilevel"/>
-    <w:tmpl w:val="B58AF6A2"/>
+    <w:tmpl w:val="74960048"/>
     <w:lvl w:ilvl="0">
       <w:start w:val="1"/>
       <w:numFmt w:val="bullet"/>
@@ -15176,9 +16834,9 @@
     </w:lvl>
   </w:abstractNum>
   <w:abstractNum w:abstractNumId="2" w15:restartNumberingAfterBreak="0">
-    <w:nsid w:val="1CC55C4E"/>
+    <w:nsid w:val="1AC77633"/>
     <w:multiLevelType w:val="multilevel"/>
-    <w:tmpl w:val="D6B68AF6"/>
+    <w:tmpl w:val="B58AF6A2"/>
     <w:lvl w:ilvl="0">
       <w:start w:val="1"/>
       <w:numFmt w:val="bullet"/>
@@ -15325,9 +16983,9 @@
     </w:lvl>
   </w:abstractNum>
   <w:abstractNum w:abstractNumId="3" w15:restartNumberingAfterBreak="0">
-    <w:nsid w:val="247317E3"/>
+    <w:nsid w:val="1CC55C4E"/>
     <w:multiLevelType w:val="multilevel"/>
-    <w:tmpl w:val="0EF050A4"/>
+    <w:tmpl w:val="D6B68AF6"/>
     <w:lvl w:ilvl="0">
       <w:start w:val="1"/>
       <w:numFmt w:val="bullet"/>
@@ -15474,9 +17132,9 @@
     </w:lvl>
   </w:abstractNum>
   <w:abstractNum w:abstractNumId="4" w15:restartNumberingAfterBreak="0">
-    <w:nsid w:val="2EE24D80"/>
+    <w:nsid w:val="247317E3"/>
     <w:multiLevelType w:val="multilevel"/>
-    <w:tmpl w:val="D9E604E4"/>
+    <w:tmpl w:val="0EF050A4"/>
     <w:lvl w:ilvl="0">
       <w:start w:val="1"/>
       <w:numFmt w:val="bullet"/>
@@ -15623,9 +17281,9 @@
     </w:lvl>
   </w:abstractNum>
   <w:abstractNum w:abstractNumId="5" w15:restartNumberingAfterBreak="0">
-    <w:nsid w:val="303D4589"/>
+    <w:nsid w:val="2EE24D80"/>
     <w:multiLevelType w:val="multilevel"/>
-    <w:tmpl w:val="AFC222B6"/>
+    <w:tmpl w:val="D9E604E4"/>
     <w:lvl w:ilvl="0">
       <w:start w:val="1"/>
       <w:numFmt w:val="bullet"/>
@@ -15772,9 +17430,9 @@
     </w:lvl>
   </w:abstractNum>
   <w:abstractNum w:abstractNumId="6" w15:restartNumberingAfterBreak="0">
-    <w:nsid w:val="311D54C7"/>
+    <w:nsid w:val="303D4589"/>
     <w:multiLevelType w:val="multilevel"/>
-    <w:tmpl w:val="39ACC3B6"/>
+    <w:tmpl w:val="AFC222B6"/>
     <w:lvl w:ilvl="0">
       <w:start w:val="1"/>
       <w:numFmt w:val="bullet"/>
@@ -15921,9 +17579,9 @@
     </w:lvl>
   </w:abstractNum>
   <w:abstractNum w:abstractNumId="7" w15:restartNumberingAfterBreak="0">
-    <w:nsid w:val="36A92518"/>
+    <w:nsid w:val="311D54C7"/>
     <w:multiLevelType w:val="multilevel"/>
-    <w:tmpl w:val="9448F632"/>
+    <w:tmpl w:val="39ACC3B6"/>
     <w:lvl w:ilvl="0">
       <w:start w:val="1"/>
       <w:numFmt w:val="bullet"/>
@@ -16070,9 +17728,9 @@
     </w:lvl>
   </w:abstractNum>
   <w:abstractNum w:abstractNumId="8" w15:restartNumberingAfterBreak="0">
-    <w:nsid w:val="389E406E"/>
+    <w:nsid w:val="36A92518"/>
     <w:multiLevelType w:val="multilevel"/>
-    <w:tmpl w:val="0CBCE568"/>
+    <w:tmpl w:val="9448F632"/>
     <w:lvl w:ilvl="0">
       <w:start w:val="1"/>
       <w:numFmt w:val="bullet"/>
@@ -16219,9 +17877,9 @@
     </w:lvl>
   </w:abstractNum>
   <w:abstractNum w:abstractNumId="9" w15:restartNumberingAfterBreak="0">
-    <w:nsid w:val="43793A10"/>
+    <w:nsid w:val="389E406E"/>
     <w:multiLevelType w:val="multilevel"/>
-    <w:tmpl w:val="92369CD6"/>
+    <w:tmpl w:val="0CBCE568"/>
     <w:lvl w:ilvl="0">
       <w:start w:val="1"/>
       <w:numFmt w:val="bullet"/>
@@ -16368,9 +18026,9 @@
     </w:lvl>
   </w:abstractNum>
   <w:abstractNum w:abstractNumId="10" w15:restartNumberingAfterBreak="0">
-    <w:nsid w:val="492A126F"/>
+    <w:nsid w:val="43793A10"/>
     <w:multiLevelType w:val="multilevel"/>
-    <w:tmpl w:val="E444C0AA"/>
+    <w:tmpl w:val="92369CD6"/>
     <w:lvl w:ilvl="0">
       <w:start w:val="1"/>
       <w:numFmt w:val="bullet"/>
@@ -16517,9 +18175,9 @@
     </w:lvl>
   </w:abstractNum>
   <w:abstractNum w:abstractNumId="11" w15:restartNumberingAfterBreak="0">
-    <w:nsid w:val="5C94650F"/>
+    <w:nsid w:val="492A126F"/>
     <w:multiLevelType w:val="multilevel"/>
-    <w:tmpl w:val="5E20556C"/>
+    <w:tmpl w:val="E444C0AA"/>
     <w:lvl w:ilvl="0">
       <w:start w:val="1"/>
       <w:numFmt w:val="bullet"/>
@@ -16666,122 +18324,9 @@
     </w:lvl>
   </w:abstractNum>
   <w:abstractNum w:abstractNumId="12" w15:restartNumberingAfterBreak="0">
-    <w:nsid w:val="5EF820AE"/>
+    <w:nsid w:val="50447E28"/>
     <w:multiLevelType w:val="multilevel"/>
-    <w:tmpl w:val="DE4A48B8"/>
-    <w:lvl w:ilvl="0">
-      <w:start w:val="1"/>
-      <w:numFmt w:val="decimal"/>
-      <w:lvlText w:val="%1."/>
-      <w:lvlJc w:val="left"/>
-      <w:pPr>
-        <w:tabs>
-          <w:tab w:val="num" w:pos="720"/>
-        </w:tabs>
-        <w:ind w:left="720" w:hanging="360"/>
-      </w:pPr>
-    </w:lvl>
-    <w:lvl w:ilvl="1" w:tentative="1">
-      <w:start w:val="1"/>
-      <w:numFmt w:val="decimal"/>
-      <w:lvlText w:val="%2."/>
-      <w:lvlJc w:val="left"/>
-      <w:pPr>
-        <w:tabs>
-          <w:tab w:val="num" w:pos="1440"/>
-        </w:tabs>
-        <w:ind w:left="1440" w:hanging="360"/>
-      </w:pPr>
-    </w:lvl>
-    <w:lvl w:ilvl="2" w:tentative="1">
-      <w:start w:val="1"/>
-      <w:numFmt w:val="decimal"/>
-      <w:lvlText w:val="%3."/>
-      <w:lvlJc w:val="left"/>
-      <w:pPr>
-        <w:tabs>
-          <w:tab w:val="num" w:pos="2160"/>
-        </w:tabs>
-        <w:ind w:left="2160" w:hanging="360"/>
-      </w:pPr>
-    </w:lvl>
-    <w:lvl w:ilvl="3" w:tentative="1">
-      <w:start w:val="1"/>
-      <w:numFmt w:val="decimal"/>
-      <w:lvlText w:val="%4."/>
-      <w:lvlJc w:val="left"/>
-      <w:pPr>
-        <w:tabs>
-          <w:tab w:val="num" w:pos="2880"/>
-        </w:tabs>
-        <w:ind w:left="2880" w:hanging="360"/>
-      </w:pPr>
-    </w:lvl>
-    <w:lvl w:ilvl="4" w:tentative="1">
-      <w:start w:val="1"/>
-      <w:numFmt w:val="decimal"/>
-      <w:lvlText w:val="%5."/>
-      <w:lvlJc w:val="left"/>
-      <w:pPr>
-        <w:tabs>
-          <w:tab w:val="num" w:pos="3600"/>
-        </w:tabs>
-        <w:ind w:left="3600" w:hanging="360"/>
-      </w:pPr>
-    </w:lvl>
-    <w:lvl w:ilvl="5" w:tentative="1">
-      <w:start w:val="1"/>
-      <w:numFmt w:val="decimal"/>
-      <w:lvlText w:val="%6."/>
-      <w:lvlJc w:val="left"/>
-      <w:pPr>
-        <w:tabs>
-          <w:tab w:val="num" w:pos="4320"/>
-        </w:tabs>
-        <w:ind w:left="4320" w:hanging="360"/>
-      </w:pPr>
-    </w:lvl>
-    <w:lvl w:ilvl="6" w:tentative="1">
-      <w:start w:val="1"/>
-      <w:numFmt w:val="decimal"/>
-      <w:lvlText w:val="%7."/>
-      <w:lvlJc w:val="left"/>
-      <w:pPr>
-        <w:tabs>
-          <w:tab w:val="num" w:pos="5040"/>
-        </w:tabs>
-        <w:ind w:left="5040" w:hanging="360"/>
-      </w:pPr>
-    </w:lvl>
-    <w:lvl w:ilvl="7" w:tentative="1">
-      <w:start w:val="1"/>
-      <w:numFmt w:val="decimal"/>
-      <w:lvlText w:val="%8."/>
-      <w:lvlJc w:val="left"/>
-      <w:pPr>
-        <w:tabs>
-          <w:tab w:val="num" w:pos="5760"/>
-        </w:tabs>
-        <w:ind w:left="5760" w:hanging="360"/>
-      </w:pPr>
-    </w:lvl>
-    <w:lvl w:ilvl="8" w:tentative="1">
-      <w:start w:val="1"/>
-      <w:numFmt w:val="decimal"/>
-      <w:lvlText w:val="%9."/>
-      <w:lvlJc w:val="left"/>
-      <w:pPr>
-        <w:tabs>
-          <w:tab w:val="num" w:pos="6480"/>
-        </w:tabs>
-        <w:ind w:left="6480" w:hanging="360"/>
-      </w:pPr>
-    </w:lvl>
-  </w:abstractNum>
-  <w:abstractNum w:abstractNumId="13" w15:restartNumberingAfterBreak="0">
-    <w:nsid w:val="623C56AC"/>
-    <w:multiLevelType w:val="multilevel"/>
-    <w:tmpl w:val="90B05342"/>
+    <w:tmpl w:val="26C471FE"/>
     <w:lvl w:ilvl="0">
       <w:start w:val="1"/>
       <w:numFmt w:val="bullet"/>
@@ -16927,10 +18472,10 @@
       </w:rPr>
     </w:lvl>
   </w:abstractNum>
-  <w:abstractNum w:abstractNumId="14" w15:restartNumberingAfterBreak="0">
-    <w:nsid w:val="6B3C1C45"/>
+  <w:abstractNum w:abstractNumId="13" w15:restartNumberingAfterBreak="0">
+    <w:nsid w:val="5C94650F"/>
     <w:multiLevelType w:val="multilevel"/>
-    <w:tmpl w:val="527CC97C"/>
+    <w:tmpl w:val="5E20556C"/>
     <w:lvl w:ilvl="0">
       <w:start w:val="1"/>
       <w:numFmt w:val="bullet"/>
@@ -17076,10 +18621,123 @@
       </w:rPr>
     </w:lvl>
   </w:abstractNum>
+  <w:abstractNum w:abstractNumId="14" w15:restartNumberingAfterBreak="0">
+    <w:nsid w:val="5EF820AE"/>
+    <w:multiLevelType w:val="multilevel"/>
+    <w:tmpl w:val="DE4A48B8"/>
+    <w:lvl w:ilvl="0">
+      <w:start w:val="1"/>
+      <w:numFmt w:val="decimal"/>
+      <w:lvlText w:val="%1."/>
+      <w:lvlJc w:val="left"/>
+      <w:pPr>
+        <w:tabs>
+          <w:tab w:val="num" w:pos="720"/>
+        </w:tabs>
+        <w:ind w:left="720" w:hanging="360"/>
+      </w:pPr>
+    </w:lvl>
+    <w:lvl w:ilvl="1" w:tentative="1">
+      <w:start w:val="1"/>
+      <w:numFmt w:val="decimal"/>
+      <w:lvlText w:val="%2."/>
+      <w:lvlJc w:val="left"/>
+      <w:pPr>
+        <w:tabs>
+          <w:tab w:val="num" w:pos="1440"/>
+        </w:tabs>
+        <w:ind w:left="1440" w:hanging="360"/>
+      </w:pPr>
+    </w:lvl>
+    <w:lvl w:ilvl="2" w:tentative="1">
+      <w:start w:val="1"/>
+      <w:numFmt w:val="decimal"/>
+      <w:lvlText w:val="%3."/>
+      <w:lvlJc w:val="left"/>
+      <w:pPr>
+        <w:tabs>
+          <w:tab w:val="num" w:pos="2160"/>
+        </w:tabs>
+        <w:ind w:left="2160" w:hanging="360"/>
+      </w:pPr>
+    </w:lvl>
+    <w:lvl w:ilvl="3" w:tentative="1">
+      <w:start w:val="1"/>
+      <w:numFmt w:val="decimal"/>
+      <w:lvlText w:val="%4."/>
+      <w:lvlJc w:val="left"/>
+      <w:pPr>
+        <w:tabs>
+          <w:tab w:val="num" w:pos="2880"/>
+        </w:tabs>
+        <w:ind w:left="2880" w:hanging="360"/>
+      </w:pPr>
+    </w:lvl>
+    <w:lvl w:ilvl="4" w:tentative="1">
+      <w:start w:val="1"/>
+      <w:numFmt w:val="decimal"/>
+      <w:lvlText w:val="%5."/>
+      <w:lvlJc w:val="left"/>
+      <w:pPr>
+        <w:tabs>
+          <w:tab w:val="num" w:pos="3600"/>
+        </w:tabs>
+        <w:ind w:left="3600" w:hanging="360"/>
+      </w:pPr>
+    </w:lvl>
+    <w:lvl w:ilvl="5" w:tentative="1">
+      <w:start w:val="1"/>
+      <w:numFmt w:val="decimal"/>
+      <w:lvlText w:val="%6."/>
+      <w:lvlJc w:val="left"/>
+      <w:pPr>
+        <w:tabs>
+          <w:tab w:val="num" w:pos="4320"/>
+        </w:tabs>
+        <w:ind w:left="4320" w:hanging="360"/>
+      </w:pPr>
+    </w:lvl>
+    <w:lvl w:ilvl="6" w:tentative="1">
+      <w:start w:val="1"/>
+      <w:numFmt w:val="decimal"/>
+      <w:lvlText w:val="%7."/>
+      <w:lvlJc w:val="left"/>
+      <w:pPr>
+        <w:tabs>
+          <w:tab w:val="num" w:pos="5040"/>
+        </w:tabs>
+        <w:ind w:left="5040" w:hanging="360"/>
+      </w:pPr>
+    </w:lvl>
+    <w:lvl w:ilvl="7" w:tentative="1">
+      <w:start w:val="1"/>
+      <w:numFmt w:val="decimal"/>
+      <w:lvlText w:val="%8."/>
+      <w:lvlJc w:val="left"/>
+      <w:pPr>
+        <w:tabs>
+          <w:tab w:val="num" w:pos="5760"/>
+        </w:tabs>
+        <w:ind w:left="5760" w:hanging="360"/>
+      </w:pPr>
+    </w:lvl>
+    <w:lvl w:ilvl="8" w:tentative="1">
+      <w:start w:val="1"/>
+      <w:numFmt w:val="decimal"/>
+      <w:lvlText w:val="%9."/>
+      <w:lvlJc w:val="left"/>
+      <w:pPr>
+        <w:tabs>
+          <w:tab w:val="num" w:pos="6480"/>
+        </w:tabs>
+        <w:ind w:left="6480" w:hanging="360"/>
+      </w:pPr>
+    </w:lvl>
+  </w:abstractNum>
   <w:abstractNum w:abstractNumId="15" w15:restartNumberingAfterBreak="0">
-    <w:nsid w:val="6F5E2C4C"/>
+    <w:nsid w:val="623C56AC"/>
     <w:multiLevelType w:val="multilevel"/>
-    <w:tmpl w:val="13AE5D70"/>
+    <w:tmpl w:val="90B05342"/>
     <w:lvl w:ilvl="0">
       <w:start w:val="1"/>
       <w:numFmt w:val="bullet"/>
@@ -17226,9 +18884,9 @@
     </w:lvl>
   </w:abstractNum>
   <w:abstractNum w:abstractNumId="16" w15:restartNumberingAfterBreak="0">
-    <w:nsid w:val="7A457456"/>
+    <w:nsid w:val="6B3C1C45"/>
     <w:multiLevelType w:val="multilevel"/>
-    <w:tmpl w:val="CCB0112A"/>
+    <w:tmpl w:val="527CC97C"/>
     <w:lvl w:ilvl="0">
       <w:start w:val="1"/>
       <w:numFmt w:val="bullet"/>
@@ -17374,56 +19032,360 @@
       </w:rPr>
     </w:lvl>
   </w:abstractNum>
+  <w:abstractNum w:abstractNumId="17" w15:restartNumberingAfterBreak="0">
+    <w:nsid w:val="6F5E2C4C"/>
+    <w:multiLevelType w:val="multilevel"/>
+    <w:tmpl w:val="13AE5D70"/>
+    <w:lvl w:ilvl="0">
+      <w:start w:val="1"/>
+      <w:numFmt w:val="bullet"/>
+      <w:lvlText w:val=""/>
+      <w:lvlJc w:val="left"/>
+      <w:pPr>
+        <w:tabs>
+          <w:tab w:val="num" w:pos="720"/>
+        </w:tabs>
+        <w:ind w:left="720" w:hanging="360"/>
+      </w:pPr>
+      <w:rPr>
+        <w:rFonts w:ascii="Symbol" w:hAnsi="Symbol" w:hint="default"/>
+        <w:sz w:val="20"/>
+      </w:rPr>
+    </w:lvl>
+    <w:lvl w:ilvl="1" w:tentative="1">
+      <w:start w:val="1"/>
+      <w:numFmt w:val="bullet"/>
+      <w:lvlText w:val="o"/>
+      <w:lvlJc w:val="left"/>
+      <w:pPr>
+        <w:tabs>
+          <w:tab w:val="num" w:pos="1440"/>
+        </w:tabs>
+        <w:ind w:left="1440" w:hanging="360"/>
+      </w:pPr>
+      <w:rPr>
+        <w:rFonts w:ascii="Courier New" w:hAnsi="Courier New" w:hint="default"/>
+        <w:sz w:val="20"/>
+      </w:rPr>
+    </w:lvl>
+    <w:lvl w:ilvl="2" w:tentative="1">
+      <w:start w:val="1"/>
+      <w:numFmt w:val="bullet"/>
+      <w:lvlText w:val=""/>
+      <w:lvlJc w:val="left"/>
+      <w:pPr>
+        <w:tabs>
+          <w:tab w:val="num" w:pos="2160"/>
+        </w:tabs>
+        <w:ind w:left="2160" w:hanging="360"/>
+      </w:pPr>
+      <w:rPr>
+        <w:rFonts w:ascii="Wingdings" w:hAnsi="Wingdings" w:hint="default"/>
+        <w:sz w:val="20"/>
+      </w:rPr>
+    </w:lvl>
+    <w:lvl w:ilvl="3" w:tentative="1">
+      <w:start w:val="1"/>
+      <w:numFmt w:val="bullet"/>
+      <w:lvlText w:val=""/>
+      <w:lvlJc w:val="left"/>
+      <w:pPr>
+        <w:tabs>
+          <w:tab w:val="num" w:pos="2880"/>
+        </w:tabs>
+        <w:ind w:left="2880" w:hanging="360"/>
+      </w:pPr>
+      <w:rPr>
+        <w:rFonts w:ascii="Wingdings" w:hAnsi="Wingdings" w:hint="default"/>
+        <w:sz w:val="20"/>
+      </w:rPr>
+    </w:lvl>
+    <w:lvl w:ilvl="4" w:tentative="1">
+      <w:start w:val="1"/>
+      <w:numFmt w:val="bullet"/>
+      <w:lvlText w:val=""/>
+      <w:lvlJc w:val="left"/>
+      <w:pPr>
+        <w:tabs>
+          <w:tab w:val="num" w:pos="3600"/>
+        </w:tabs>
+        <w:ind w:left="3600" w:hanging="360"/>
+      </w:pPr>
+      <w:rPr>
+        <w:rFonts w:ascii="Wingdings" w:hAnsi="Wingdings" w:hint="default"/>
+        <w:sz w:val="20"/>
+      </w:rPr>
+    </w:lvl>
+    <w:lvl w:ilvl="5" w:tentative="1">
+      <w:start w:val="1"/>
+      <w:numFmt w:val="bullet"/>
+      <w:lvlText w:val=""/>
+      <w:lvlJc w:val="left"/>
+      <w:pPr>
+        <w:tabs>
+          <w:tab w:val="num" w:pos="4320"/>
+        </w:tabs>
+        <w:ind w:left="4320" w:hanging="360"/>
+      </w:pPr>
+      <w:rPr>
+        <w:rFonts w:ascii="Wingdings" w:hAnsi="Wingdings" w:hint="default"/>
+        <w:sz w:val="20"/>
+      </w:rPr>
+    </w:lvl>
+    <w:lvl w:ilvl="6" w:tentative="1">
+      <w:start w:val="1"/>
+      <w:numFmt w:val="bullet"/>
+      <w:lvlText w:val=""/>
+      <w:lvlJc w:val="left"/>
+      <w:pPr>
+        <w:tabs>
+          <w:tab w:val="num" w:pos="5040"/>
+        </w:tabs>
+        <w:ind w:left="5040" w:hanging="360"/>
+      </w:pPr>
+      <w:rPr>
+        <w:rFonts w:ascii="Wingdings" w:hAnsi="Wingdings" w:hint="default"/>
+        <w:sz w:val="20"/>
+      </w:rPr>
+    </w:lvl>
+    <w:lvl w:ilvl="7" w:tentative="1">
+      <w:start w:val="1"/>
+      <w:numFmt w:val="bullet"/>
+      <w:lvlText w:val=""/>
+      <w:lvlJc w:val="left"/>
+      <w:pPr>
+        <w:tabs>
+          <w:tab w:val="num" w:pos="5760"/>
+        </w:tabs>
+        <w:ind w:left="5760" w:hanging="360"/>
+      </w:pPr>
+      <w:rPr>
+        <w:rFonts w:ascii="Wingdings" w:hAnsi="Wingdings" w:hint="default"/>
+        <w:sz w:val="20"/>
+      </w:rPr>
+    </w:lvl>
+    <w:lvl w:ilvl="8" w:tentative="1">
+      <w:start w:val="1"/>
+      <w:numFmt w:val="bullet"/>
+      <w:lvlText w:val=""/>
+      <w:lvlJc w:val="left"/>
+      <w:pPr>
+        <w:tabs>
+          <w:tab w:val="num" w:pos="6480"/>
+        </w:tabs>
+        <w:ind w:left="6480" w:hanging="360"/>
+      </w:pPr>
+      <w:rPr>
+        <w:rFonts w:ascii="Wingdings" w:hAnsi="Wingdings" w:hint="default"/>
+        <w:sz w:val="20"/>
+      </w:rPr>
+    </w:lvl>
+  </w:abstractNum>
+  <w:abstractNum w:abstractNumId="18" w15:restartNumberingAfterBreak="0">
+    <w:nsid w:val="7A457456"/>
+    <w:multiLevelType w:val="multilevel"/>
+    <w:tmpl w:val="CCB0112A"/>
+    <w:lvl w:ilvl="0">
+      <w:start w:val="1"/>
+      <w:numFmt w:val="bullet"/>
+      <w:lvlText w:val=""/>
+      <w:lvlJc w:val="left"/>
+      <w:pPr>
+        <w:tabs>
+          <w:tab w:val="num" w:pos="720"/>
+        </w:tabs>
+        <w:ind w:left="720" w:hanging="360"/>
+      </w:pPr>
+      <w:rPr>
+        <w:rFonts w:ascii="Symbol" w:hAnsi="Symbol" w:hint="default"/>
+        <w:sz w:val="20"/>
+      </w:rPr>
+    </w:lvl>
+    <w:lvl w:ilvl="1" w:tentative="1">
+      <w:start w:val="1"/>
+      <w:numFmt w:val="bullet"/>
+      <w:lvlText w:val="o"/>
+      <w:lvlJc w:val="left"/>
+      <w:pPr>
+        <w:tabs>
+          <w:tab w:val="num" w:pos="1440"/>
+        </w:tabs>
+        <w:ind w:left="1440" w:hanging="360"/>
+      </w:pPr>
+      <w:rPr>
+        <w:rFonts w:ascii="Courier New" w:hAnsi="Courier New" w:hint="default"/>
+        <w:sz w:val="20"/>
+      </w:rPr>
+    </w:lvl>
+    <w:lvl w:ilvl="2" w:tentative="1">
+      <w:start w:val="1"/>
+      <w:numFmt w:val="bullet"/>
+      <w:lvlText w:val=""/>
+      <w:lvlJc w:val="left"/>
+      <w:pPr>
+        <w:tabs>
+          <w:tab w:val="num" w:pos="2160"/>
+        </w:tabs>
+        <w:ind w:left="2160" w:hanging="360"/>
+      </w:pPr>
+      <w:rPr>
+        <w:rFonts w:ascii="Wingdings" w:hAnsi="Wingdings" w:hint="default"/>
+        <w:sz w:val="20"/>
+      </w:rPr>
+    </w:lvl>
+    <w:lvl w:ilvl="3" w:tentative="1">
+      <w:start w:val="1"/>
+      <w:numFmt w:val="bullet"/>
+      <w:lvlText w:val=""/>
+      <w:lvlJc w:val="left"/>
+      <w:pPr>
+        <w:tabs>
+          <w:tab w:val="num" w:pos="2880"/>
+        </w:tabs>
+        <w:ind w:left="2880" w:hanging="360"/>
+      </w:pPr>
+      <w:rPr>
+        <w:rFonts w:ascii="Wingdings" w:hAnsi="Wingdings" w:hint="default"/>
+        <w:sz w:val="20"/>
+      </w:rPr>
+    </w:lvl>
+    <w:lvl w:ilvl="4" w:tentative="1">
+      <w:start w:val="1"/>
+      <w:numFmt w:val="bullet"/>
+      <w:lvlText w:val=""/>
+      <w:lvlJc w:val="left"/>
+      <w:pPr>
+        <w:tabs>
+          <w:tab w:val="num" w:pos="3600"/>
+        </w:tabs>
+        <w:ind w:left="3600" w:hanging="360"/>
+      </w:pPr>
+      <w:rPr>
+        <w:rFonts w:ascii="Wingdings" w:hAnsi="Wingdings" w:hint="default"/>
+        <w:sz w:val="20"/>
+      </w:rPr>
+    </w:lvl>
+    <w:lvl w:ilvl="5" w:tentative="1">
+      <w:start w:val="1"/>
+      <w:numFmt w:val="bullet"/>
+      <w:lvlText w:val=""/>
+      <w:lvlJc w:val="left"/>
+      <w:pPr>
+        <w:tabs>
+          <w:tab w:val="num" w:pos="4320"/>
+        </w:tabs>
+        <w:ind w:left="4320" w:hanging="360"/>
+      </w:pPr>
+      <w:rPr>
+        <w:rFonts w:ascii="Wingdings" w:hAnsi="Wingdings" w:hint="default"/>
+        <w:sz w:val="20"/>
+      </w:rPr>
+    </w:lvl>
+    <w:lvl w:ilvl="6" w:tentative="1">
+      <w:start w:val="1"/>
+      <w:numFmt w:val="bullet"/>
+      <w:lvlText w:val=""/>
+      <w:lvlJc w:val="left"/>
+      <w:pPr>
+        <w:tabs>
+          <w:tab w:val="num" w:pos="5040"/>
+        </w:tabs>
+        <w:ind w:left="5040" w:hanging="360"/>
+      </w:pPr>
+      <w:rPr>
+        <w:rFonts w:ascii="Wingdings" w:hAnsi="Wingdings" w:hint="default"/>
+        <w:sz w:val="20"/>
+      </w:rPr>
+    </w:lvl>
+    <w:lvl w:ilvl="7" w:tentative="1">
+      <w:start w:val="1"/>
+      <w:numFmt w:val="bullet"/>
+      <w:lvlText w:val=""/>
+      <w:lvlJc w:val="left"/>
+      <w:pPr>
+        <w:tabs>
+          <w:tab w:val="num" w:pos="5760"/>
+        </w:tabs>
+        <w:ind w:left="5760" w:hanging="360"/>
+      </w:pPr>
+      <w:rPr>
+        <w:rFonts w:ascii="Wingdings" w:hAnsi="Wingdings" w:hint="default"/>
+        <w:sz w:val="20"/>
+      </w:rPr>
+    </w:lvl>
+    <w:lvl w:ilvl="8" w:tentative="1">
+      <w:start w:val="1"/>
+      <w:numFmt w:val="bullet"/>
+      <w:lvlText w:val=""/>
+      <w:lvlJc w:val="left"/>
+      <w:pPr>
+        <w:tabs>
+          <w:tab w:val="num" w:pos="6480"/>
+        </w:tabs>
+        <w:ind w:left="6480" w:hanging="360"/>
+      </w:pPr>
+      <w:rPr>
+        <w:rFonts w:ascii="Wingdings" w:hAnsi="Wingdings" w:hint="default"/>
+        <w:sz w:val="20"/>
+      </w:rPr>
+    </w:lvl>
+  </w:abstractNum>
   <w:num w:numId="1" w16cid:durableId="968709895">
+    <w:abstractNumId w:val="8"/>
+  </w:num>
+  <w:num w:numId="2" w16cid:durableId="1226643985">
+    <w:abstractNumId w:val="15"/>
+  </w:num>
+  <w:num w:numId="3" w16cid:durableId="276910803">
+    <w:abstractNumId w:val="6"/>
+  </w:num>
+  <w:num w:numId="4" w16cid:durableId="1243949237">
     <w:abstractNumId w:val="7"/>
   </w:num>
-  <w:num w:numId="2" w16cid:durableId="1226643985">
+  <w:num w:numId="5" w16cid:durableId="790629237">
+    <w:abstractNumId w:val="10"/>
+  </w:num>
+  <w:num w:numId="6" w16cid:durableId="1972393765">
+    <w:abstractNumId w:val="11"/>
+  </w:num>
+  <w:num w:numId="7" w16cid:durableId="777218426">
+    <w:abstractNumId w:val="2"/>
+  </w:num>
+  <w:num w:numId="8" w16cid:durableId="28067647">
+    <w:abstractNumId w:val="5"/>
+  </w:num>
+  <w:num w:numId="9" w16cid:durableId="638608033">
+    <w:abstractNumId w:val="1"/>
+  </w:num>
+  <w:num w:numId="10" w16cid:durableId="94717793">
+    <w:abstractNumId w:val="17"/>
+  </w:num>
+  <w:num w:numId="11" w16cid:durableId="1152139526">
     <w:abstractNumId w:val="13"/>
   </w:num>
-  <w:num w:numId="3" w16cid:durableId="276910803">
-    <w:abstractNumId w:val="5"/>
+  <w:num w:numId="12" w16cid:durableId="1725714062">
+    <w:abstractNumId w:val="18"/>
   </w:num>
-  <w:num w:numId="4" w16cid:durableId="1243949237">
-    <w:abstractNumId w:val="6"/>
+  <w:num w:numId="13" w16cid:durableId="274867082">
+    <w:abstractNumId w:val="16"/>
   </w:num>
-  <w:num w:numId="5" w16cid:durableId="790629237">
+  <w:num w:numId="14" w16cid:durableId="279536376">
+    <w:abstractNumId w:val="14"/>
+  </w:num>
+  <w:num w:numId="15" w16cid:durableId="869949025">
+    <w:abstractNumId w:val="3"/>
+  </w:num>
+  <w:num w:numId="16" w16cid:durableId="345905604">
+    <w:abstractNumId w:val="4"/>
+  </w:num>
+  <w:num w:numId="17" w16cid:durableId="1176651643">
     <w:abstractNumId w:val="9"/>
   </w:num>
-  <w:num w:numId="6" w16cid:durableId="1972393765">
-    <w:abstractNumId w:val="10"/>
-  </w:num>
-  <w:num w:numId="7" w16cid:durableId="777218426">
-    <w:abstractNumId w:val="1"/>
-  </w:num>
-  <w:num w:numId="8" w16cid:durableId="28067647">
-    <w:abstractNumId w:val="4"/>
-  </w:num>
-  <w:num w:numId="9" w16cid:durableId="638608033">
+  <w:num w:numId="18" w16cid:durableId="800608206">
     <w:abstractNumId w:val="0"/>
   </w:num>
-  <w:num w:numId="10" w16cid:durableId="94717793">
-    <w:abstractNumId w:val="15"/>
-  </w:num>
-  <w:num w:numId="11" w16cid:durableId="1152139526">
-    <w:abstractNumId w:val="11"/>
-  </w:num>
-  <w:num w:numId="12" w16cid:durableId="1725714062">
-    <w:abstractNumId w:val="16"/>
-  </w:num>
-  <w:num w:numId="13" w16cid:durableId="274867082">
-    <w:abstractNumId w:val="14"/>
-  </w:num>
-  <w:num w:numId="14" w16cid:durableId="279536376">
+  <w:num w:numId="19" w16cid:durableId="1493179070">
     <w:abstractNumId w:val="12"/>
-  </w:num>
-  <w:num w:numId="15" w16cid:durableId="869949025">
-    <w:abstractNumId w:val="2"/>
-  </w:num>
-  <w:num w:numId="16" w16cid:durableId="345905604">
-    <w:abstractNumId w:val="3"/>
-  </w:num>
-  <w:num w:numId="17" w16cid:durableId="1176651643">
-    <w:abstractNumId w:val="8"/>
   </w:num>
 </w:numbering>
 </file>

</xml_diff>